<commit_message>
Significant change in the C64 emulation: 1.- The interrupt system now is much more accurate than before, tajing into account even the special instructions like CLI, SEI, ertc.. 2.- The VICII includes now a distintiction between fi1 y fi1 as uinternal cycles. Much more demos now worked...Still pending a last iteration I guess, but most worked properly!
</commit_message>
<xml_diff>
--- a/docs/C264Data/C264_DEBUG_File_Format.docx
+++ b/docs/C264Data/C264_DEBUG_File_Format.docx
@@ -561,7 +561,7 @@
       <w:pPr>
         <w:pStyle w:val="Ttulo1"/>
       </w:pPr>
-      <w:bookmarkStart w:id="0" w:name="_Toc238122670"/>
+      <w:bookmarkStart w:id="0" w:name="_Toc238330457"/>
       <w:r>
         <w:lastRenderedPageBreak/>
         <w:t>Contents</w:t>
@@ -596,7 +596,7 @@
       <w:r>
         <w:fldChar w:fldCharType="separate"/>
       </w:r>
-      <w:hyperlink w:anchor="_Toc238122670" w:history="1">
+      <w:hyperlink w:anchor="_Toc238330457" w:history="1">
         <w:r>
           <w:rPr>
             <w:rStyle w:val="Hipervnculo"/>
@@ -623,7 +623,7 @@
             <w:noProof/>
             <w:webHidden/>
           </w:rPr>
-          <w:instrText xml:space="preserve"> PAGEREF _Toc238122670 \h </w:instrText>
+          <w:instrText xml:space="preserve"> PAGEREF _Toc238330457 \h </w:instrText>
         </w:r>
         <w:r>
           <w:rPr>
@@ -674,7 +674,7 @@
           <w14:ligatures w14:val="standardContextual"/>
         </w:rPr>
       </w:pPr>
-      <w:hyperlink w:anchor="_Toc238122671" w:history="1">
+      <w:hyperlink w:anchor="_Toc238330458" w:history="1">
         <w:r>
           <w:rPr>
             <w:rStyle w:val="Hipervnculo"/>
@@ -701,7 +701,7 @@
             <w:noProof/>
             <w:webHidden/>
           </w:rPr>
-          <w:instrText xml:space="preserve"> PAGEREF _Toc238122671 \h </w:instrText>
+          <w:instrText xml:space="preserve"> PAGEREF _Toc238330458 \h </w:instrText>
         </w:r>
         <w:r>
           <w:rPr>
@@ -752,7 +752,7 @@
           <w14:ligatures w14:val="standardContextual"/>
         </w:rPr>
       </w:pPr>
-      <w:hyperlink w:anchor="_Toc238122672" w:history="1">
+      <w:hyperlink w:anchor="_Toc238330459" w:history="1">
         <w:r>
           <w:rPr>
             <w:rStyle w:val="Hipervnculo"/>
@@ -779,7 +779,7 @@
             <w:noProof/>
             <w:webHidden/>
           </w:rPr>
-          <w:instrText xml:space="preserve"> PAGEREF _Toc238122672 \h </w:instrText>
+          <w:instrText xml:space="preserve"> PAGEREF _Toc238330459 \h </w:instrText>
         </w:r>
         <w:r>
           <w:rPr>
@@ -829,7 +829,7 @@
           <w14:ligatures w14:val="standardContextual"/>
         </w:rPr>
       </w:pPr>
-      <w:hyperlink w:anchor="_Toc238122673" w:history="1">
+      <w:hyperlink w:anchor="_Toc238330460" w:history="1">
         <w:r>
           <w:rPr>
             <w:rStyle w:val="Hipervnculo"/>
@@ -856,7 +856,7 @@
             <w:noProof/>
             <w:webHidden/>
           </w:rPr>
-          <w:instrText xml:space="preserve"> PAGEREF _Toc238122673 \h </w:instrText>
+          <w:instrText xml:space="preserve"> PAGEREF _Toc238330460 \h </w:instrText>
         </w:r>
         <w:r>
           <w:rPr>
@@ -907,7 +907,7 @@
           <w14:ligatures w14:val="standardContextual"/>
         </w:rPr>
       </w:pPr>
-      <w:hyperlink w:anchor="_Toc238122674" w:history="1">
+      <w:hyperlink w:anchor="_Toc238330461" w:history="1">
         <w:r>
           <w:rPr>
             <w:rStyle w:val="Hipervnculo"/>
@@ -934,7 +934,7 @@
             <w:noProof/>
             <w:webHidden/>
           </w:rPr>
-          <w:instrText xml:space="preserve"> PAGEREF _Toc238122674 \h </w:instrText>
+          <w:instrText xml:space="preserve"> PAGEREF _Toc238330461 \h </w:instrText>
         </w:r>
         <w:r>
           <w:rPr>
@@ -984,7 +984,7 @@
           <w14:ligatures w14:val="standardContextual"/>
         </w:rPr>
       </w:pPr>
-      <w:hyperlink w:anchor="_Toc238122675" w:history="1">
+      <w:hyperlink w:anchor="_Toc238330462" w:history="1">
         <w:r>
           <w:rPr>
             <w:rStyle w:val="Hipervnculo"/>
@@ -1011,7 +1011,7 @@
             <w:noProof/>
             <w:webHidden/>
           </w:rPr>
-          <w:instrText xml:space="preserve"> PAGEREF _Toc238122675 \h </w:instrText>
+          <w:instrText xml:space="preserve"> PAGEREF _Toc238330462 \h </w:instrText>
         </w:r>
         <w:r>
           <w:rPr>
@@ -1061,7 +1061,7 @@
           <w14:ligatures w14:val="standardContextual"/>
         </w:rPr>
       </w:pPr>
-      <w:hyperlink w:anchor="_Toc238122676" w:history="1">
+      <w:hyperlink w:anchor="_Toc238330463" w:history="1">
         <w:r>
           <w:rPr>
             <w:rStyle w:val="Hipervnculo"/>
@@ -1088,7 +1088,7 @@
             <w:noProof/>
             <w:webHidden/>
           </w:rPr>
-          <w:instrText xml:space="preserve"> PAGEREF _Toc238122676 \h </w:instrText>
+          <w:instrText xml:space="preserve"> PAGEREF _Toc238330463 \h </w:instrText>
         </w:r>
         <w:r>
           <w:rPr>
@@ -1139,7 +1139,7 @@
           <w14:ligatures w14:val="standardContextual"/>
         </w:rPr>
       </w:pPr>
-      <w:hyperlink w:anchor="_Toc238122677" w:history="1">
+      <w:hyperlink w:anchor="_Toc238330464" w:history="1">
         <w:r>
           <w:rPr>
             <w:rStyle w:val="Hipervnculo"/>
@@ -1166,7 +1166,7 @@
             <w:noProof/>
             <w:webHidden/>
           </w:rPr>
-          <w:instrText xml:space="preserve"> PAGEREF _Toc238122677 \h </w:instrText>
+          <w:instrText xml:space="preserve"> PAGEREF _Toc238330464 \h </w:instrText>
         </w:r>
         <w:r>
           <w:rPr>
@@ -1216,7 +1216,7 @@
           <w14:ligatures w14:val="standardContextual"/>
         </w:rPr>
       </w:pPr>
-      <w:hyperlink w:anchor="_Toc238122678" w:history="1">
+      <w:hyperlink w:anchor="_Toc238330465" w:history="1">
         <w:r>
           <w:rPr>
             <w:rStyle w:val="Hipervnculo"/>
@@ -1243,7 +1243,7 @@
             <w:noProof/>
             <w:webHidden/>
           </w:rPr>
-          <w:instrText xml:space="preserve"> PAGEREF _Toc238122678 \h </w:instrText>
+          <w:instrText xml:space="preserve"> PAGEREF _Toc238330465 \h </w:instrText>
         </w:r>
         <w:r>
           <w:rPr>
@@ -1293,7 +1293,7 @@
           <w14:ligatures w14:val="standardContextual"/>
         </w:rPr>
       </w:pPr>
-      <w:hyperlink w:anchor="_Toc238122679" w:history="1">
+      <w:hyperlink w:anchor="_Toc238330466" w:history="1">
         <w:r>
           <w:rPr>
             <w:rStyle w:val="Hipervnculo"/>
@@ -1320,7 +1320,7 @@
             <w:noProof/>
             <w:webHidden/>
           </w:rPr>
-          <w:instrText xml:space="preserve"> PAGEREF _Toc238122679 \h </w:instrText>
+          <w:instrText xml:space="preserve"> PAGEREF _Toc238330466 \h </w:instrText>
         </w:r>
         <w:r>
           <w:rPr>
@@ -1371,7 +1371,7 @@
           <w14:ligatures w14:val="standardContextual"/>
         </w:rPr>
       </w:pPr>
-      <w:hyperlink w:anchor="_Toc238122680" w:history="1">
+      <w:hyperlink w:anchor="_Toc238330467" w:history="1">
         <w:r>
           <w:rPr>
             <w:rStyle w:val="Hipervnculo"/>
@@ -1398,7 +1398,7 @@
             <w:noProof/>
             <w:webHidden/>
           </w:rPr>
-          <w:instrText xml:space="preserve"> PAGEREF _Toc238122680 \h </w:instrText>
+          <w:instrText xml:space="preserve"> PAGEREF _Toc238330467 \h </w:instrText>
         </w:r>
         <w:r>
           <w:rPr>
@@ -1448,7 +1448,7 @@
           <w14:ligatures w14:val="standardContextual"/>
         </w:rPr>
       </w:pPr>
-      <w:hyperlink w:anchor="_Toc238122681" w:history="1">
+      <w:hyperlink w:anchor="_Toc238330468" w:history="1">
         <w:r>
           <w:rPr>
             <w:rStyle w:val="Hipervnculo"/>
@@ -1475,7 +1475,7 @@
             <w:noProof/>
             <w:webHidden/>
           </w:rPr>
-          <w:instrText xml:space="preserve"> PAGEREF _Toc238122681 \h </w:instrText>
+          <w:instrText xml:space="preserve"> PAGEREF _Toc238330468 \h </w:instrText>
         </w:r>
         <w:r>
           <w:rPr>
@@ -1525,7 +1525,7 @@
           <w14:ligatures w14:val="standardContextual"/>
         </w:rPr>
       </w:pPr>
-      <w:hyperlink w:anchor="_Toc238122682" w:history="1">
+      <w:hyperlink w:anchor="_Toc238330469" w:history="1">
         <w:r>
           <w:rPr>
             <w:rStyle w:val="Hipervnculo"/>
@@ -1552,7 +1552,7 @@
             <w:noProof/>
             <w:webHidden/>
           </w:rPr>
-          <w:instrText xml:space="preserve"> PAGEREF _Toc238122682 \h </w:instrText>
+          <w:instrText xml:space="preserve"> PAGEREF _Toc238330469 \h </w:instrText>
         </w:r>
         <w:r>
           <w:rPr>
@@ -1602,7 +1602,7 @@
           <w14:ligatures w14:val="standardContextual"/>
         </w:rPr>
       </w:pPr>
-      <w:hyperlink w:anchor="_Toc238122683" w:history="1">
+      <w:hyperlink w:anchor="_Toc238330470" w:history="1">
         <w:r>
           <w:rPr>
             <w:rStyle w:val="Hipervnculo"/>
@@ -1629,7 +1629,7 @@
             <w:noProof/>
             <w:webHidden/>
           </w:rPr>
-          <w:instrText xml:space="preserve"> PAGEREF _Toc238122683 \h </w:instrText>
+          <w:instrText xml:space="preserve"> PAGEREF _Toc238330470 \h </w:instrText>
         </w:r>
         <w:r>
           <w:rPr>
@@ -1679,7 +1679,7 @@
           <w14:ligatures w14:val="standardContextual"/>
         </w:rPr>
       </w:pPr>
-      <w:hyperlink w:anchor="_Toc238122684" w:history="1">
+      <w:hyperlink w:anchor="_Toc238330471" w:history="1">
         <w:r>
           <w:rPr>
             <w:rStyle w:val="Hipervnculo"/>
@@ -1706,7 +1706,7 @@
             <w:noProof/>
             <w:webHidden/>
           </w:rPr>
-          <w:instrText xml:space="preserve"> PAGEREF _Toc238122684 \h </w:instrText>
+          <w:instrText xml:space="preserve"> PAGEREF _Toc238330471 \h </w:instrText>
         </w:r>
         <w:r>
           <w:rPr>
@@ -1756,7 +1756,7 @@
           <w14:ligatures w14:val="standardContextual"/>
         </w:rPr>
       </w:pPr>
-      <w:hyperlink w:anchor="_Toc238122685" w:history="1">
+      <w:hyperlink w:anchor="_Toc238330472" w:history="1">
         <w:r>
           <w:rPr>
             <w:rStyle w:val="Hipervnculo"/>
@@ -1783,7 +1783,7 @@
             <w:noProof/>
             <w:webHidden/>
           </w:rPr>
-          <w:instrText xml:space="preserve"> PAGEREF _Toc238122685 \h </w:instrText>
+          <w:instrText xml:space="preserve"> PAGEREF _Toc238330472 \h </w:instrText>
         </w:r>
         <w:r>
           <w:rPr>
@@ -1833,7 +1833,7 @@
           <w14:ligatures w14:val="standardContextual"/>
         </w:rPr>
       </w:pPr>
-      <w:hyperlink w:anchor="_Toc238122686" w:history="1">
+      <w:hyperlink w:anchor="_Toc238330473" w:history="1">
         <w:r>
           <w:rPr>
             <w:rStyle w:val="Hipervnculo"/>
@@ -1860,7 +1860,7 @@
             <w:noProof/>
             <w:webHidden/>
           </w:rPr>
-          <w:instrText xml:space="preserve"> PAGEREF _Toc238122686 \h </w:instrText>
+          <w:instrText xml:space="preserve"> PAGEREF _Toc238330473 \h </w:instrText>
         </w:r>
         <w:r>
           <w:rPr>
@@ -1911,7 +1911,7 @@
           <w14:ligatures w14:val="standardContextual"/>
         </w:rPr>
       </w:pPr>
-      <w:hyperlink w:anchor="_Toc238122687" w:history="1">
+      <w:hyperlink w:anchor="_Toc238330474" w:history="1">
         <w:r>
           <w:rPr>
             <w:rStyle w:val="Hipervnculo"/>
@@ -1938,7 +1938,7 @@
             <w:noProof/>
             <w:webHidden/>
           </w:rPr>
-          <w:instrText xml:space="preserve"> PAGEREF _Toc238122687 \h </w:instrText>
+          <w:instrText xml:space="preserve"> PAGEREF _Toc238330474 \h </w:instrText>
         </w:r>
         <w:r>
           <w:rPr>
@@ -1988,7 +1988,7 @@
           <w14:ligatures w14:val="standardContextual"/>
         </w:rPr>
       </w:pPr>
-      <w:hyperlink w:anchor="_Toc238122688" w:history="1">
+      <w:hyperlink w:anchor="_Toc238330475" w:history="1">
         <w:r>
           <w:rPr>
             <w:rStyle w:val="Hipervnculo"/>
@@ -2015,7 +2015,7 @@
             <w:noProof/>
             <w:webHidden/>
           </w:rPr>
-          <w:instrText xml:space="preserve"> PAGEREF _Toc238122688 \h </w:instrText>
+          <w:instrText xml:space="preserve"> PAGEREF _Toc238330475 \h </w:instrText>
         </w:r>
         <w:r>
           <w:rPr>
@@ -2065,7 +2065,7 @@
           <w14:ligatures w14:val="standardContextual"/>
         </w:rPr>
       </w:pPr>
-      <w:hyperlink w:anchor="_Toc238122689" w:history="1">
+      <w:hyperlink w:anchor="_Toc238330476" w:history="1">
         <w:r>
           <w:rPr>
             <w:rStyle w:val="Hipervnculo"/>
@@ -2092,7 +2092,7 @@
             <w:noProof/>
             <w:webHidden/>
           </w:rPr>
-          <w:instrText xml:space="preserve"> PAGEREF _Toc238122689 \h </w:instrText>
+          <w:instrText xml:space="preserve"> PAGEREF _Toc238330476 \h </w:instrText>
         </w:r>
         <w:r>
           <w:rPr>
@@ -2140,7 +2140,7 @@
           <w14:ligatures w14:val="standardContextual"/>
         </w:rPr>
       </w:pPr>
-      <w:hyperlink w:anchor="_Toc238122690" w:history="1">
+      <w:hyperlink w:anchor="_Toc238330477" w:history="1">
         <w:r>
           <w:rPr>
             <w:rStyle w:val="Hipervnculo"/>
@@ -2167,7 +2167,7 @@
             <w:noProof/>
             <w:webHidden/>
           </w:rPr>
-          <w:instrText xml:space="preserve"> PAGEREF _Toc238122690 \h </w:instrText>
+          <w:instrText xml:space="preserve"> PAGEREF _Toc238330477 \h </w:instrText>
         </w:r>
         <w:r>
           <w:rPr>
@@ -2215,7 +2215,7 @@
           <w14:ligatures w14:val="standardContextual"/>
         </w:rPr>
       </w:pPr>
-      <w:hyperlink w:anchor="_Toc238122691" w:history="1">
+      <w:hyperlink w:anchor="_Toc238330478" w:history="1">
         <w:r>
           <w:rPr>
             <w:rStyle w:val="Hipervnculo"/>
@@ -2242,7 +2242,7 @@
             <w:noProof/>
             <w:webHidden/>
           </w:rPr>
-          <w:instrText xml:space="preserve"> PAGEREF _Toc238122691 \h </w:instrText>
+          <w:instrText xml:space="preserve"> PAGEREF _Toc238330478 \h </w:instrText>
         </w:r>
         <w:r>
           <w:rPr>
@@ -2290,7 +2290,7 @@
           <w14:ligatures w14:val="standardContextual"/>
         </w:rPr>
       </w:pPr>
-      <w:hyperlink w:anchor="_Toc238122692" w:history="1">
+      <w:hyperlink w:anchor="_Toc238330479" w:history="1">
         <w:r>
           <w:rPr>
             <w:rStyle w:val="Hipervnculo"/>
@@ -2317,7 +2317,7 @@
             <w:noProof/>
             <w:webHidden/>
           </w:rPr>
-          <w:instrText xml:space="preserve"> PAGEREF _Toc238122692 \h </w:instrText>
+          <w:instrText xml:space="preserve"> PAGEREF _Toc238330479 \h </w:instrText>
         </w:r>
         <w:r>
           <w:rPr>
@@ -2365,7 +2365,7 @@
           <w14:ligatures w14:val="standardContextual"/>
         </w:rPr>
       </w:pPr>
-      <w:hyperlink w:anchor="_Toc238122693" w:history="1">
+      <w:hyperlink w:anchor="_Toc238330480" w:history="1">
         <w:r>
           <w:rPr>
             <w:rStyle w:val="Hipervnculo"/>
@@ -2392,7 +2392,7 @@
             <w:noProof/>
             <w:webHidden/>
           </w:rPr>
-          <w:instrText xml:space="preserve"> PAGEREF _Toc238122693 \h </w:instrText>
+          <w:instrText xml:space="preserve"> PAGEREF _Toc238330480 \h </w:instrText>
         </w:r>
         <w:r>
           <w:rPr>
@@ -2440,7 +2440,7 @@
           <w14:ligatures w14:val="standardContextual"/>
         </w:rPr>
       </w:pPr>
-      <w:hyperlink w:anchor="_Toc238122694" w:history="1">
+      <w:hyperlink w:anchor="_Toc238330481" w:history="1">
         <w:r>
           <w:rPr>
             <w:rStyle w:val="Hipervnculo"/>
@@ -2467,7 +2467,7 @@
             <w:noProof/>
             <w:webHidden/>
           </w:rPr>
-          <w:instrText xml:space="preserve"> PAGEREF _Toc238122694 \h </w:instrText>
+          <w:instrText xml:space="preserve"> PAGEREF _Toc238330481 \h </w:instrText>
         </w:r>
         <w:r>
           <w:rPr>
@@ -2518,7 +2518,7 @@
           <w14:ligatures w14:val="standardContextual"/>
         </w:rPr>
       </w:pPr>
-      <w:hyperlink w:anchor="_Toc238122695" w:history="1">
+      <w:hyperlink w:anchor="_Toc238330482" w:history="1">
         <w:r>
           <w:rPr>
             <w:rStyle w:val="Hipervnculo"/>
@@ -2545,7 +2545,7 @@
             <w:noProof/>
             <w:webHidden/>
           </w:rPr>
-          <w:instrText xml:space="preserve"> PAGEREF _Toc238122695 \h </w:instrText>
+          <w:instrText xml:space="preserve"> PAGEREF _Toc238330482 \h </w:instrText>
         </w:r>
         <w:r>
           <w:rPr>
@@ -2595,7 +2595,7 @@
           <w14:ligatures w14:val="standardContextual"/>
         </w:rPr>
       </w:pPr>
-      <w:hyperlink w:anchor="_Toc238122696" w:history="1">
+      <w:hyperlink w:anchor="_Toc238330483" w:history="1">
         <w:r>
           <w:rPr>
             <w:rStyle w:val="Hipervnculo"/>
@@ -2622,7 +2622,7 @@
             <w:noProof/>
             <w:webHidden/>
           </w:rPr>
-          <w:instrText xml:space="preserve"> PAGEREF _Toc238122696 \h </w:instrText>
+          <w:instrText xml:space="preserve"> PAGEREF _Toc238330483 \h </w:instrText>
         </w:r>
         <w:r>
           <w:rPr>
@@ -2672,7 +2672,7 @@
           <w14:ligatures w14:val="standardContextual"/>
         </w:rPr>
       </w:pPr>
-      <w:hyperlink w:anchor="_Toc238122697" w:history="1">
+      <w:hyperlink w:anchor="_Toc238330484" w:history="1">
         <w:r>
           <w:rPr>
             <w:rStyle w:val="Hipervnculo"/>
@@ -2699,7 +2699,7 @@
             <w:noProof/>
             <w:webHidden/>
           </w:rPr>
-          <w:instrText xml:space="preserve"> PAGEREF _Toc238122697 \h </w:instrText>
+          <w:instrText xml:space="preserve"> PAGEREF _Toc238330484 \h </w:instrText>
         </w:r>
         <w:r>
           <w:rPr>
@@ -2750,7 +2750,7 @@
           <w14:ligatures w14:val="standardContextual"/>
         </w:rPr>
       </w:pPr>
-      <w:hyperlink w:anchor="_Toc238122698" w:history="1">
+      <w:hyperlink w:anchor="_Toc238330485" w:history="1">
         <w:r>
           <w:rPr>
             <w:rStyle w:val="Hipervnculo"/>
@@ -2777,7 +2777,7 @@
             <w:noProof/>
             <w:webHidden/>
           </w:rPr>
-          <w:instrText xml:space="preserve"> PAGEREF _Toc238122698 \h </w:instrText>
+          <w:instrText xml:space="preserve"> PAGEREF _Toc238330485 \h </w:instrText>
         </w:r>
         <w:r>
           <w:rPr>
@@ -2827,7 +2827,7 @@
           <w14:ligatures w14:val="standardContextual"/>
         </w:rPr>
       </w:pPr>
-      <w:hyperlink w:anchor="_Toc238122699" w:history="1">
+      <w:hyperlink w:anchor="_Toc238330486" w:history="1">
         <w:r>
           <w:rPr>
             <w:rStyle w:val="Hipervnculo"/>
@@ -2854,7 +2854,7 @@
             <w:noProof/>
             <w:webHidden/>
           </w:rPr>
-          <w:instrText xml:space="preserve"> PAGEREF _Toc238122699 \h </w:instrText>
+          <w:instrText xml:space="preserve"> PAGEREF _Toc238330486 \h </w:instrText>
         </w:r>
         <w:r>
           <w:rPr>
@@ -2904,7 +2904,7 @@
           <w14:ligatures w14:val="standardContextual"/>
         </w:rPr>
       </w:pPr>
-      <w:hyperlink w:anchor="_Toc238122700" w:history="1">
+      <w:hyperlink w:anchor="_Toc238330487" w:history="1">
         <w:r>
           <w:rPr>
             <w:rStyle w:val="Hipervnculo"/>
@@ -2931,7 +2931,7 @@
             <w:noProof/>
             <w:webHidden/>
           </w:rPr>
-          <w:instrText xml:space="preserve"> PAGEREF _Toc238122700 \h </w:instrText>
+          <w:instrText xml:space="preserve"> PAGEREF _Toc238330487 \h </w:instrText>
         </w:r>
         <w:r>
           <w:rPr>
@@ -2982,7 +2982,7 @@
           <w14:ligatures w14:val="standardContextual"/>
         </w:rPr>
       </w:pPr>
-      <w:hyperlink w:anchor="_Toc238122701" w:history="1">
+      <w:hyperlink w:anchor="_Toc238330488" w:history="1">
         <w:r>
           <w:rPr>
             <w:rStyle w:val="Hipervnculo"/>
@@ -3009,7 +3009,7 @@
             <w:noProof/>
             <w:webHidden/>
           </w:rPr>
-          <w:instrText xml:space="preserve"> PAGEREF _Toc238122701 \h </w:instrText>
+          <w:instrText xml:space="preserve"> PAGEREF _Toc238330488 \h </w:instrText>
         </w:r>
         <w:r>
           <w:rPr>
@@ -3059,7 +3059,7 @@
           <w14:ligatures w14:val="standardContextual"/>
         </w:rPr>
       </w:pPr>
-      <w:hyperlink w:anchor="_Toc238122702" w:history="1">
+      <w:hyperlink w:anchor="_Toc238330489" w:history="1">
         <w:r>
           <w:rPr>
             <w:rStyle w:val="Hipervnculo"/>
@@ -3086,7 +3086,7 @@
             <w:noProof/>
             <w:webHidden/>
           </w:rPr>
-          <w:instrText xml:space="preserve"> PAGEREF _Toc238122702 \h </w:instrText>
+          <w:instrText xml:space="preserve"> PAGEREF _Toc238330489 \h </w:instrText>
         </w:r>
         <w:r>
           <w:rPr>
@@ -3136,7 +3136,7 @@
           <w14:ligatures w14:val="standardContextual"/>
         </w:rPr>
       </w:pPr>
-      <w:hyperlink w:anchor="_Toc238122703" w:history="1">
+      <w:hyperlink w:anchor="_Toc238330490" w:history="1">
         <w:r>
           <w:rPr>
             <w:rStyle w:val="Hipervnculo"/>
@@ -3163,7 +3163,7 @@
             <w:noProof/>
             <w:webHidden/>
           </w:rPr>
-          <w:instrText xml:space="preserve"> PAGEREF _Toc238122703 \h </w:instrText>
+          <w:instrText xml:space="preserve"> PAGEREF _Toc238330490 \h </w:instrText>
         </w:r>
         <w:r>
           <w:rPr>
@@ -3213,7 +3213,7 @@
           <w14:ligatures w14:val="standardContextual"/>
         </w:rPr>
       </w:pPr>
-      <w:hyperlink w:anchor="_Toc238122704" w:history="1">
+      <w:hyperlink w:anchor="_Toc238330491" w:history="1">
         <w:r>
           <w:rPr>
             <w:rStyle w:val="Hipervnculo"/>
@@ -3240,7 +3240,7 @@
             <w:noProof/>
             <w:webHidden/>
           </w:rPr>
-          <w:instrText xml:space="preserve"> PAGEREF _Toc238122704 \h </w:instrText>
+          <w:instrText xml:space="preserve"> PAGEREF _Toc238330491 \h </w:instrText>
         </w:r>
         <w:r>
           <w:rPr>
@@ -3290,7 +3290,7 @@
           <w14:ligatures w14:val="standardContextual"/>
         </w:rPr>
       </w:pPr>
-      <w:hyperlink w:anchor="_Toc238122705" w:history="1">
+      <w:hyperlink w:anchor="_Toc238330492" w:history="1">
         <w:r>
           <w:rPr>
             <w:rStyle w:val="Hipervnculo"/>
@@ -3317,7 +3317,7 @@
             <w:noProof/>
             <w:webHidden/>
           </w:rPr>
-          <w:instrText xml:space="preserve"> PAGEREF _Toc238122705 \h </w:instrText>
+          <w:instrText xml:space="preserve"> PAGEREF _Toc238330492 \h </w:instrText>
         </w:r>
         <w:r>
           <w:rPr>
@@ -3367,7 +3367,7 @@
           <w14:ligatures w14:val="standardContextual"/>
         </w:rPr>
       </w:pPr>
-      <w:hyperlink w:anchor="_Toc238122706" w:history="1">
+      <w:hyperlink w:anchor="_Toc238330493" w:history="1">
         <w:r>
           <w:rPr>
             <w:rStyle w:val="Hipervnculo"/>
@@ -3394,7 +3394,7 @@
             <w:noProof/>
             <w:webHidden/>
           </w:rPr>
-          <w:instrText xml:space="preserve"> PAGEREF _Toc238122706 \h </w:instrText>
+          <w:instrText xml:space="preserve"> PAGEREF _Toc238330493 \h </w:instrText>
         </w:r>
         <w:r>
           <w:rPr>
@@ -3439,7 +3439,7 @@
       <w:pPr>
         <w:pStyle w:val="Ttulo"/>
       </w:pPr>
-      <w:bookmarkStart w:id="1" w:name="_Toc238122671"/>
+      <w:bookmarkStart w:id="1" w:name="_Toc238330458"/>
       <w:r>
         <w:lastRenderedPageBreak/>
         <w:t>Foreword</w:t>
@@ -3455,7 +3455,7 @@
       <w:pPr>
         <w:pStyle w:val="Ttulo"/>
       </w:pPr>
-      <w:bookmarkStart w:id="2" w:name="_Toc238122672"/>
+      <w:bookmarkStart w:id="2" w:name="_Toc238330459"/>
       <w:r>
         <w:lastRenderedPageBreak/>
         <w:t>1. Purpose, scope, and models</w:t>
@@ -3470,9 +3470,9 @@
     <w:p>
       <w:pPr>
         <w:pStyle w:val="Ttulo1"/>
-        <w:spacing w:before="200"/>
-      </w:pPr>
-      <w:bookmarkStart w:id="3" w:name="_Toc238122673"/>
+        <w:spacing w:before="280"/>
+      </w:pPr>
+      <w:bookmarkStart w:id="3" w:name="_Toc238330460"/>
       <w:r>
         <w:t>1.1 Scope of this guide</w:t>
       </w:r>
@@ -3497,7 +3497,7 @@
       <w:pPr>
         <w:pStyle w:val="Ttulo"/>
       </w:pPr>
-      <w:bookmarkStart w:id="4" w:name="_Toc238122674"/>
+      <w:bookmarkStart w:id="4" w:name="_Toc238330461"/>
       <w:r>
         <w:lastRenderedPageBreak/>
         <w:t>2. Activation and producer selection</w:t>
@@ -3507,9 +3507,9 @@
     <w:p>
       <w:pPr>
         <w:pStyle w:val="Ttulo1"/>
-        <w:spacing w:before="200"/>
-      </w:pPr>
-      <w:bookmarkStart w:id="5" w:name="_Toc238122675"/>
+        <w:spacing w:before="280"/>
+      </w:pPr>
+      <w:bookmarkStart w:id="5" w:name="_Toc238330462"/>
       <w:r>
         <w:t>2.1 Console command</w:t>
       </w:r>
@@ -3965,9 +3965,9 @@
     <w:p>
       <w:pPr>
         <w:pStyle w:val="Ttulo1"/>
-        <w:spacing w:before="200"/>
-      </w:pPr>
-      <w:bookmarkStart w:id="6" w:name="_Toc238122676"/>
+        <w:spacing w:before="280"/>
+      </w:pPr>
+      <w:bookmarkStart w:id="6" w:name="_Toc238330463"/>
       <w:r>
         <w:t>2.2 Conditions and special paths</w:t>
       </w:r>
@@ -4025,7 +4025,7 @@
       <w:pPr>
         <w:pStyle w:val="Ttulo"/>
       </w:pPr>
-      <w:bookmarkStart w:id="7" w:name="_Toc238122677"/>
+      <w:bookmarkStart w:id="7" w:name="_Toc238330464"/>
       <w:r>
         <w:lastRenderedPageBreak/>
         <w:t>3. Common file structure</w:t>
@@ -4035,9 +4035,9 @@
     <w:p>
       <w:pPr>
         <w:pStyle w:val="Ttulo1"/>
-        <w:spacing w:before="200"/>
-      </w:pPr>
-      <w:bookmarkStart w:id="8" w:name="_Toc238122678"/>
+        <w:spacing w:before="280"/>
+      </w:pPr>
+      <w:bookmarkStart w:id="8" w:name="_Toc238330465"/>
       <w:r>
         <w:t>3.1 Physical hierarchy</w:t>
       </w:r>
@@ -4356,9 +4356,9 @@
     <w:p>
       <w:pPr>
         <w:pStyle w:val="Ttulo1"/>
-        <w:spacing w:before="200"/>
-      </w:pPr>
-      <w:bookmarkStart w:id="9" w:name="_Toc238122679"/>
+        <w:spacing w:before="280"/>
+      </w:pPr>
+      <w:bookmarkStart w:id="9" w:name="_Toc238330466"/>
       <w:r>
         <w:t>3.2 Timing rules</w:t>
       </w:r>
@@ -4440,7 +4440,7 @@
       <w:pPr>
         <w:pStyle w:val="Ttulo"/>
       </w:pPr>
-      <w:bookmarkStart w:id="10" w:name="_Toc238122680"/>
+      <w:bookmarkStart w:id="10" w:name="_Toc238330467"/>
       <w:r>
         <w:lastRenderedPageBreak/>
         <w:t>4. Common framework records</w:t>
@@ -4450,9 +4450,9 @@
     <w:p>
       <w:pPr>
         <w:pStyle w:val="Ttulo1"/>
-        <w:spacing w:before="200"/>
-      </w:pPr>
-      <w:bookmarkStart w:id="11" w:name="_Toc238122681"/>
+        <w:spacing w:before="280"/>
+      </w:pPr>
+      <w:bookmarkStart w:id="11" w:name="_Toc238330468"/>
       <w:r>
         <w:t>CPU — Info Cycle</w:t>
       </w:r>
@@ -4516,9 +4516,9 @@
     <w:p>
       <w:pPr>
         <w:pStyle w:val="Ttulo1"/>
-        <w:spacing w:before="200"/>
-      </w:pPr>
-      <w:bookmarkStart w:id="12" w:name="_Toc238122682"/>
+        <w:spacing w:before="280"/>
+      </w:pPr>
+      <w:bookmarkStart w:id="12" w:name="_Toc238330469"/>
       <w:r>
         <w:t>CPU — Transaction about to execute</w:t>
       </w:r>
@@ -4582,9 +4582,9 @@
     <w:p>
       <w:pPr>
         <w:pStyle w:val="Ttulo1"/>
-        <w:spacing w:before="200"/>
-      </w:pPr>
-      <w:bookmarkStart w:id="13" w:name="_Toc238122683"/>
+        <w:spacing w:before="280"/>
+      </w:pPr>
+      <w:bookmarkStart w:id="13" w:name="_Toc238330470"/>
       <w:r>
         <w:t>CPU — Executed instruction</w:t>
       </w:r>
@@ -4648,9 +4648,9 @@
     <w:p>
       <w:pPr>
         <w:pStyle w:val="Ttulo1"/>
-        <w:spacing w:before="200"/>
-      </w:pPr>
-      <w:bookmarkStart w:id="14" w:name="_Toc238122684"/>
+        <w:spacing w:before="280"/>
+      </w:pPr>
+      <w:bookmarkStart w:id="14" w:name="_Toc238330471"/>
       <w:r>
         <w:t>CPU — Stop</w:t>
       </w:r>
@@ -4715,9 +4715,9 @@
     <w:p>
       <w:pPr>
         <w:pStyle w:val="Ttulo1"/>
-        <w:spacing w:before="200"/>
-      </w:pPr>
-      <w:bookmarkStart w:id="15" w:name="_Toc238122685"/>
+        <w:spacing w:before="280"/>
+      </w:pPr>
+      <w:bookmarkStart w:id="15" w:name="_Toc238330472"/>
       <w:r>
         <w:t>CPU — Interrupts</w:t>
       </w:r>
@@ -4781,9 +4781,9 @@
     <w:p>
       <w:pPr>
         <w:pStyle w:val="Ttulo1"/>
-        <w:spacing w:before="200"/>
-      </w:pPr>
-      <w:bookmarkStart w:id="16" w:name="_Toc238122686"/>
+        <w:spacing w:before="280"/>
+      </w:pPr>
+      <w:bookmarkStart w:id="16" w:name="_Toc238330473"/>
       <w:r>
         <w:t>Memory — Applied Set</w:t>
       </w:r>
@@ -4848,7 +4848,7 @@
       <w:pPr>
         <w:pStyle w:val="Ttulo"/>
       </w:pPr>
-      <w:bookmarkStart w:id="17" w:name="_Toc238122687"/>
+      <w:bookmarkStart w:id="17" w:name="_Toc238330474"/>
       <w:r>
         <w:lastRenderedPageBreak/>
         <w:t>5. Machine-specific components</w:t>
@@ -4858,9 +4858,9 @@
     <w:p>
       <w:pPr>
         <w:pStyle w:val="Ttulo1"/>
-        <w:spacing w:before="200"/>
-      </w:pPr>
-      <w:bookmarkStart w:id="18" w:name="_Toc238122688"/>
+        <w:spacing w:before="280"/>
+      </w:pPr>
+      <w:bookmarkStart w:id="18" w:name="_Toc238330475"/>
       <w:r>
         <w:t>5.1 Selectable inventory</w:t>
       </w:r>
@@ -5394,9 +5394,9 @@
     <w:p>
       <w:pPr>
         <w:pStyle w:val="Ttulo1"/>
-        <w:spacing w:before="200"/>
-      </w:pPr>
-      <w:bookmarkStart w:id="19" w:name="_Toc238122689"/>
+        <w:spacing w:before="280"/>
+      </w:pPr>
+      <w:bookmarkStart w:id="19" w:name="_Toc238330476"/>
       <w:r>
         <w:t>5.2 Record catalog</w:t>
       </w:r>
@@ -5406,7 +5406,7 @@
       <w:pPr>
         <w:pStyle w:val="Ttulo2"/>
       </w:pPr>
-      <w:bookmarkStart w:id="20" w:name="_Toc238122690"/>
+      <w:bookmarkStart w:id="20" w:name="_Toc238330477"/>
       <w:r>
         <w:t>TED — Info Cycle</w:t>
       </w:r>
@@ -5460,7 +5460,7 @@
       <w:pPr>
         <w:pStyle w:val="Ttulo2"/>
       </w:pPr>
-      <w:bookmarkStart w:id="21" w:name="_Toc238122691"/>
+      <w:bookmarkStart w:id="21" w:name="_Toc238330478"/>
       <w:r>
         <w:t>TED — CPU transaction projection</w:t>
       </w:r>
@@ -5514,7 +5514,7 @@
       <w:pPr>
         <w:pStyle w:val="Ttulo2"/>
       </w:pPr>
-      <w:bookmarkStart w:id="22" w:name="_Toc238122692"/>
+      <w:bookmarkStart w:id="22" w:name="_Toc238330479"/>
       <w:r>
         <w:t>ROMRAMSwitch — direct line</w:t>
       </w:r>
@@ -5568,7 +5568,7 @@
       <w:pPr>
         <w:pStyle w:val="Ttulo2"/>
       </w:pPr>
-      <w:bookmarkStart w:id="23" w:name="_Toc238122693"/>
+      <w:bookmarkStart w:id="23" w:name="_Toc238330480"/>
       <w:r>
         <w:lastRenderedPageBreak/>
         <w:t>C1C2Selector — direct line</w:t>
@@ -5623,7 +5623,7 @@
       <w:pPr>
         <w:pStyle w:val="Ttulo2"/>
       </w:pPr>
-      <w:bookmarkStart w:id="24" w:name="_Toc238122694"/>
+      <w:bookmarkStart w:id="24" w:name="_Toc238330481"/>
       <w:r>
         <w:t>Datasette 1531 / SerialIO</w:t>
       </w:r>
@@ -5677,7 +5677,7 @@
       <w:pPr>
         <w:pStyle w:val="Ttulo"/>
       </w:pPr>
-      <w:bookmarkStart w:id="25" w:name="_Toc238122695"/>
+      <w:bookmarkStart w:id="25" w:name="_Toc238330482"/>
       <w:r>
         <w:lastRenderedPageBreak/>
         <w:t>6. Interpretation method</w:t>
@@ -5687,9 +5687,9 @@
     <w:p>
       <w:pPr>
         <w:pStyle w:val="Ttulo1"/>
-        <w:spacing w:before="200"/>
-      </w:pPr>
-      <w:bookmarkStart w:id="26" w:name="_Toc238122696"/>
+        <w:spacing w:before="280"/>
+      </w:pPr>
+      <w:bookmarkStart w:id="26" w:name="_Toc238330483"/>
       <w:r>
         <w:t>6.1 Recommended procedure</w:t>
       </w:r>
@@ -5770,9 +5770,9 @@
     <w:p>
       <w:pPr>
         <w:pStyle w:val="Ttulo1"/>
-        <w:spacing w:before="200"/>
-      </w:pPr>
-      <w:bookmarkStart w:id="27" w:name="_Toc238122697"/>
+        <w:spacing w:before="280"/>
+      </w:pPr>
+      <w:bookmarkStart w:id="27" w:name="_Toc238330484"/>
       <w:r>
         <w:t>6.2 Annotated example</w:t>
       </w:r>
@@ -5850,7 +5850,7 @@
       <w:pPr>
         <w:pStyle w:val="Ttulo"/>
       </w:pPr>
-      <w:bookmarkStart w:id="28" w:name="_Toc238122698"/>
+      <w:bookmarkStart w:id="28" w:name="_Toc238330485"/>
       <w:r>
         <w:lastRenderedPageBreak/>
         <w:t>7. Limitations and maintenance</w:t>
@@ -5860,9 +5860,9 @@
     <w:p>
       <w:pPr>
         <w:pStyle w:val="Ttulo1"/>
-        <w:spacing w:before="200"/>
-      </w:pPr>
-      <w:bookmarkStart w:id="29" w:name="_Toc238122699"/>
+        <w:spacing w:before="280"/>
+      </w:pPr>
+      <w:bookmarkStart w:id="29" w:name="_Toc238330486"/>
       <w:r>
         <w:t>7.1 Specific limitations</w:t>
       </w:r>
@@ -5907,9 +5907,9 @@
     <w:p>
       <w:pPr>
         <w:pStyle w:val="Ttulo1"/>
-        <w:spacing w:before="200"/>
-      </w:pPr>
-      <w:bookmarkStart w:id="30" w:name="_Toc238122700"/>
+        <w:spacing w:before="280"/>
+      </w:pPr>
+      <w:bookmarkStart w:id="30" w:name="_Toc238330487"/>
       <w:r>
         <w:t>7.2 Maintenance contract</w:t>
       </w:r>
@@ -5967,7 +5967,7 @@
       <w:pPr>
         <w:pStyle w:val="Ttulo"/>
       </w:pPr>
-      <w:bookmarkStart w:id="31" w:name="_Toc238122701"/>
+      <w:bookmarkStart w:id="31" w:name="_Toc238330488"/>
       <w:r>
         <w:lastRenderedPageBreak/>
         <w:t>Appendices</w:t>
@@ -5978,7 +5978,7 @@
       <w:pPr>
         <w:pStyle w:val="Ttulo1"/>
       </w:pPr>
-      <w:bookmarkStart w:id="32" w:name="_Toc238122702"/>
+      <w:bookmarkStart w:id="32" w:name="_Toc238330489"/>
       <w:r>
         <w:t>Appendix A. Provenance and revision</w:t>
       </w:r>
@@ -5998,9 +5998,9 @@
     <w:p>
       <w:pPr>
         <w:pStyle w:val="Ttulo1"/>
-        <w:spacing w:before="200"/>
-      </w:pPr>
-      <w:bookmarkStart w:id="33" w:name="_Toc238122703"/>
+        <w:spacing w:before="280"/>
+      </w:pPr>
+      <w:bookmarkStart w:id="33" w:name="_Toc238330490"/>
       <w:r>
         <w:t>A.1 Watched source files</w:t>
       </w:r>
@@ -6761,9 +6761,9 @@
     <w:p>
       <w:pPr>
         <w:pStyle w:val="Ttulo1"/>
-        <w:spacing w:before="200"/>
-      </w:pPr>
-      <w:bookmarkStart w:id="34" w:name="_Toc238122704"/>
+        <w:spacing w:before="280"/>
+      </w:pPr>
+      <w:bookmarkStart w:id="34" w:name="_Toc238330491"/>
       <w:r>
         <w:t>A.2 Revision history</w:t>
       </w:r>
@@ -6934,7 +6934,7 @@
       <w:pPr>
         <w:pStyle w:val="Ttulo1"/>
       </w:pPr>
-      <w:bookmarkStart w:id="35" w:name="_Toc238122705"/>
+      <w:bookmarkStart w:id="35" w:name="_Toc238330492"/>
       <w:r>
         <w:t>Illustrations</w:t>
       </w:r>
@@ -6974,7 +6974,7 @@
       <w:pPr>
         <w:pStyle w:val="Ttulo1"/>
       </w:pPr>
-      <w:bookmarkStart w:id="36" w:name="_Toc238122706"/>
+      <w:bookmarkStart w:id="36" w:name="_Toc238330493"/>
       <w:r>
         <w:lastRenderedPageBreak/>
         <w:t>Equations</w:t>
@@ -7080,7 +7080,7 @@
         <w:noProof/>
       </w:rPr>
       <w:drawing>
-        <wp:inline distT="0" distB="0" distL="0" distR="0" wp14:anchorId="3C9EEF89" wp14:editId="38582A92">
+        <wp:inline distT="0" distB="0" distL="0" distR="0" wp14:anchorId="7A6F76E4" wp14:editId="2130FE2B">
           <wp:extent cx="576000" cy="459360"/>
           <wp:effectExtent l="0" t="0" r="0" b="0"/>
           <wp:docPr id="1" name="ARGOS framework mark" descr="ARGOS framework mark"/>
@@ -7490,10 +7490,10 @@
         <w:noProof/>
       </w:rPr>
       <w:drawing>
-        <wp:inline distT="0" distB="0" distL="0" distR="0" wp14:anchorId="2965E7AD" wp14:editId="45759A02">
+        <wp:inline distT="0" distB="0" distL="0" distR="0" wp14:anchorId="6F937C7A" wp14:editId="081B51C1">
           <wp:extent cx="1512000" cy="1205820"/>
           <wp:effectExtent l="0" t="0" r="0" b="0"/>
-          <wp:docPr id="1705033270" name="ARGOS framework mark" descr="ARGOS framework mark"/>
+          <wp:docPr id="1835654990" name="ARGOS framework mark" descr="ARGOS framework mark"/>
           <wp:cNvGraphicFramePr>
             <a:graphicFrameLocks xmlns:a="http://schemas.openxmlformats.org/drawingml/2006/main" noChangeAspect="1"/>
           </wp:cNvGraphicFramePr>
@@ -10466,19 +10466,19 @@
   <w:num w:numId="26" w16cid:durableId="846600881">
     <w:abstractNumId w:val="20"/>
   </w:num>
-  <w:num w:numId="27" w16cid:durableId="1478255174">
+  <w:num w:numId="27" w16cid:durableId="1852328186">
     <w:abstractNumId w:val="0"/>
   </w:num>
-  <w:num w:numId="28" w16cid:durableId="592124656">
+  <w:num w:numId="28" w16cid:durableId="67702676">
     <w:abstractNumId w:val="0"/>
   </w:num>
-  <w:num w:numId="29" w16cid:durableId="299725625">
+  <w:num w:numId="29" w16cid:durableId="396437903">
     <w:abstractNumId w:val="6"/>
   </w:num>
-  <w:num w:numId="30" w16cid:durableId="911894457">
+  <w:num w:numId="30" w16cid:durableId="623969475">
     <w:abstractNumId w:val="0"/>
   </w:num>
-  <w:num w:numId="31" w16cid:durableId="1517771400">
+  <w:num w:numId="31" w16cid:durableId="1766226832">
     <w:abstractNumId w:val="0"/>
   </w:num>
 </w:numbering>

</xml_diff>

<commit_message>
VICII, better information for debugging and some adjustments in the way c-cycles y g-cycles are coordinate when a late bad line comes.
</commit_message>
<xml_diff>
--- a/docs/C264Data/C264_DEBUG_File_Format.docx
+++ b/docs/C264Data/C264_DEBUG_File_Format.docx
@@ -1,6 +1,6 @@
 
 <file path=word/document.xml><?xml version="1.0" encoding="utf-8"?>
-<w:document xmlns:wpc="http://schemas.microsoft.com/office/word/2010/wordprocessingCanvas" xmlns:cx="http://schemas.microsoft.com/office/drawing/2014/chartex" xmlns:cx1="http://schemas.microsoft.com/office/drawing/2015/9/8/chartex" xmlns:cx2="http://schemas.microsoft.com/office/drawing/2015/10/21/chartex" xmlns:cx3="http://schemas.microsoft.com/office/drawing/2016/5/9/chartex" xmlns:cx4="http://schemas.microsoft.com/office/drawing/2016/5/10/chartex" xmlns:cx5="http://schemas.microsoft.com/office/drawing/2016/5/11/chartex" xmlns:cx6="http://schemas.microsoft.com/office/drawing/2016/5/12/chartex" xmlns:cx7="http://schemas.microsoft.com/office/drawing/2016/5/13/chartex" xmlns:cx8="http://schemas.microsoft.com/office/drawing/2016/5/14/chartex" xmlns:mc="http://schemas.openxmlformats.org/markup-compatibility/2006" xmlns:aink="http://schemas.microsoft.com/office/drawing/2016/ink" xmlns:am3d="http://schemas.microsoft.com/office/drawing/2017/model3d" xmlns:o="urn:schemas-microsoft-com:office:office" xmlns:oel="http://schemas.microsoft.com/office/2019/extlst" xmlns:r="http://schemas.openxmlformats.org/officeDocument/2006/relationships" xmlns:m="http://schemas.openxmlformats.org/officeDocument/2006/math" xmlns:v="urn:schemas-microsoft-com:vml" xmlns:wp14="http://schemas.microsoft.com/office/word/2010/wordprocessingDrawing" xmlns:wp="http://schemas.openxmlformats.org/drawingml/2006/wordprocessingDrawing" xmlns:w10="urn:schemas-microsoft-com:office:word" xmlns:w="http://schemas.openxmlformats.org/wordprocessingml/2006/main" xmlns:w14="http://schemas.microsoft.com/office/word/2010/wordml" xmlns:w15="http://schemas.microsoft.com/office/word/2012/wordml" xmlns:w16cei="http://schemas.microsoft.com/office/word/2026/wordml/cei" xmlns:w16cex="http://schemas.microsoft.com/office/word/2018/wordml/cex" xmlns:w16cid="http://schemas.microsoft.com/office/word/2016/wordml/cid" xmlns:w16="http://schemas.microsoft.com/office/word/2018/wordml" xmlns:w16du="http://schemas.microsoft.com/office/word/2023/wordml/word16du" xmlns:w16sdtdh="http://schemas.microsoft.com/office/word/2020/wordml/sdtdatahash" xmlns:w16sdtfl="http://schemas.microsoft.com/office/word/2024/wordml/sdtformatlock" xmlns:w16se="http://schemas.microsoft.com/office/word/2015/wordml/symex" xmlns:wpg="http://schemas.microsoft.com/office/word/2010/wordprocessingGroup" xmlns:wpi="http://schemas.microsoft.com/office/word/2010/wordprocessingInk" xmlns:wne="http://schemas.microsoft.com/office/word/2006/wordml" xmlns:wps="http://schemas.microsoft.com/office/word/2010/wordprocessingShape" mc:Ignorable="w14 w15 w16se w16cid w16 w16cex w16sdtdh w16sdtfl w16du wp14">
+<w:document xmlns:wpc="http://schemas.microsoft.com/office/word/2010/wordprocessingCanvas" xmlns:cx="http://schemas.microsoft.com/office/drawing/2014/chartex" xmlns:cx1="http://schemas.microsoft.com/office/drawing/2015/9/8/chartex" xmlns:cx2="http://schemas.microsoft.com/office/drawing/2015/10/21/chartex" xmlns:cx3="http://schemas.microsoft.com/office/drawing/2016/5/9/chartex" xmlns:cx4="http://schemas.microsoft.com/office/drawing/2016/5/10/chartex" xmlns:cx5="http://schemas.microsoft.com/office/drawing/2016/5/11/chartex" xmlns:cx6="http://schemas.microsoft.com/office/drawing/2016/5/12/chartex" xmlns:cx7="http://schemas.microsoft.com/office/drawing/2016/5/13/chartex" xmlns:cx8="http://schemas.microsoft.com/office/drawing/2016/5/14/chartex" xmlns:mc="http://schemas.openxmlformats.org/markup-compatibility/2006" xmlns:aink="http://schemas.microsoft.com/office/drawing/2016/ink" xmlns:am3d="http://schemas.microsoft.com/office/drawing/2017/model3d" xmlns:o="urn:schemas-microsoft-com:office:office" xmlns:oel="http://schemas.microsoft.com/office/2019/extlst" xmlns:r="http://schemas.openxmlformats.org/officeDocument/2006/relationships" xmlns:m="http://schemas.openxmlformats.org/officeDocument/2006/math" xmlns:v="urn:schemas-microsoft-com:vml" xmlns:wp14="http://schemas.microsoft.com/office/word/2010/wordprocessingDrawing" xmlns:wp="http://schemas.openxmlformats.org/drawingml/2006/wordprocessingDrawing" xmlns:w10="urn:schemas-microsoft-com:office:word" xmlns:w="http://schemas.openxmlformats.org/wordprocessingml/2006/main" xmlns:w14="http://schemas.microsoft.com/office/word/2010/wordml" xmlns:w15="http://schemas.microsoft.com/office/word/2012/wordml" xmlns:w16cex="http://schemas.microsoft.com/office/word/2018/wordml/cex" xmlns:w16cid="http://schemas.microsoft.com/office/word/2016/wordml/cid" xmlns:w16="http://schemas.microsoft.com/office/word/2018/wordml" xmlns:w16du="http://schemas.microsoft.com/office/word/2023/wordml/word16du" xmlns:w16sdtdh="http://schemas.microsoft.com/office/word/2020/wordml/sdtdatahash" xmlns:w16sdtfl="http://schemas.microsoft.com/office/word/2024/wordml/sdtformatlock" xmlns:w16se="http://schemas.microsoft.com/office/word/2015/wordml/symex" xmlns:wpg="http://schemas.microsoft.com/office/word/2010/wordprocessingGroup" xmlns:wpi="http://schemas.microsoft.com/office/word/2010/wordprocessingInk" xmlns:wne="http://schemas.microsoft.com/office/word/2006/wordml" xmlns:wps="http://schemas.microsoft.com/office/word/2010/wordprocessingShape" mc:Ignorable="w14 w15 w16se w16cid w16 w16cex w16sdtdh w16sdtfl w16du wp14">
   <w:body>
     <w:sdt>
       <w:sdtPr>
@@ -561,7 +561,7 @@
       <w:pPr>
         <w:pStyle w:val="Ttulo1"/>
       </w:pPr>
-      <w:bookmarkStart w:id="0" w:name="_Toc238330457"/>
+      <w:bookmarkStart w:id="0" w:name="_Toc238462295"/>
       <w:r>
         <w:lastRenderedPageBreak/>
         <w:t>Contents</w:t>
@@ -596,7 +596,7 @@
       <w:r>
         <w:fldChar w:fldCharType="separate"/>
       </w:r>
-      <w:hyperlink w:anchor="_Toc238330457" w:history="1">
+      <w:hyperlink w:anchor="_Toc238462295" w:history="1">
         <w:r>
           <w:rPr>
             <w:rStyle w:val="Hipervnculo"/>
@@ -623,7 +623,7 @@
             <w:noProof/>
             <w:webHidden/>
           </w:rPr>
-          <w:instrText xml:space="preserve"> PAGEREF _Toc238330457 \h </w:instrText>
+          <w:instrText xml:space="preserve"> PAGEREF _Toc238462295 \h </w:instrText>
         </w:r>
         <w:r>
           <w:rPr>
@@ -674,7 +674,7 @@
           <w14:ligatures w14:val="standardContextual"/>
         </w:rPr>
       </w:pPr>
-      <w:hyperlink w:anchor="_Toc238330458" w:history="1">
+      <w:hyperlink w:anchor="_Toc238462296" w:history="1">
         <w:r>
           <w:rPr>
             <w:rStyle w:val="Hipervnculo"/>
@@ -701,7 +701,7 @@
             <w:noProof/>
             <w:webHidden/>
           </w:rPr>
-          <w:instrText xml:space="preserve"> PAGEREF _Toc238330458 \h </w:instrText>
+          <w:instrText xml:space="preserve"> PAGEREF _Toc238462296 \h </w:instrText>
         </w:r>
         <w:r>
           <w:rPr>
@@ -752,7 +752,7 @@
           <w14:ligatures w14:val="standardContextual"/>
         </w:rPr>
       </w:pPr>
-      <w:hyperlink w:anchor="_Toc238330459" w:history="1">
+      <w:hyperlink w:anchor="_Toc238462297" w:history="1">
         <w:r>
           <w:rPr>
             <w:rStyle w:val="Hipervnculo"/>
@@ -779,7 +779,7 @@
             <w:noProof/>
             <w:webHidden/>
           </w:rPr>
-          <w:instrText xml:space="preserve"> PAGEREF _Toc238330459 \h </w:instrText>
+          <w:instrText xml:space="preserve"> PAGEREF _Toc238462297 \h </w:instrText>
         </w:r>
         <w:r>
           <w:rPr>
@@ -829,7 +829,7 @@
           <w14:ligatures w14:val="standardContextual"/>
         </w:rPr>
       </w:pPr>
-      <w:hyperlink w:anchor="_Toc238330460" w:history="1">
+      <w:hyperlink w:anchor="_Toc238462298" w:history="1">
         <w:r>
           <w:rPr>
             <w:rStyle w:val="Hipervnculo"/>
@@ -856,7 +856,7 @@
             <w:noProof/>
             <w:webHidden/>
           </w:rPr>
-          <w:instrText xml:space="preserve"> PAGEREF _Toc238330460 \h </w:instrText>
+          <w:instrText xml:space="preserve"> PAGEREF _Toc238462298 \h </w:instrText>
         </w:r>
         <w:r>
           <w:rPr>
@@ -907,7 +907,7 @@
           <w14:ligatures w14:val="standardContextual"/>
         </w:rPr>
       </w:pPr>
-      <w:hyperlink w:anchor="_Toc238330461" w:history="1">
+      <w:hyperlink w:anchor="_Toc238462299" w:history="1">
         <w:r>
           <w:rPr>
             <w:rStyle w:val="Hipervnculo"/>
@@ -934,7 +934,7 @@
             <w:noProof/>
             <w:webHidden/>
           </w:rPr>
-          <w:instrText xml:space="preserve"> PAGEREF _Toc238330461 \h </w:instrText>
+          <w:instrText xml:space="preserve"> PAGEREF _Toc238462299 \h </w:instrText>
         </w:r>
         <w:r>
           <w:rPr>
@@ -984,7 +984,7 @@
           <w14:ligatures w14:val="standardContextual"/>
         </w:rPr>
       </w:pPr>
-      <w:hyperlink w:anchor="_Toc238330462" w:history="1">
+      <w:hyperlink w:anchor="_Toc238462300" w:history="1">
         <w:r>
           <w:rPr>
             <w:rStyle w:val="Hipervnculo"/>
@@ -1011,7 +1011,7 @@
             <w:noProof/>
             <w:webHidden/>
           </w:rPr>
-          <w:instrText xml:space="preserve"> PAGEREF _Toc238330462 \h </w:instrText>
+          <w:instrText xml:space="preserve"> PAGEREF _Toc238462300 \h </w:instrText>
         </w:r>
         <w:r>
           <w:rPr>
@@ -1061,7 +1061,7 @@
           <w14:ligatures w14:val="standardContextual"/>
         </w:rPr>
       </w:pPr>
-      <w:hyperlink w:anchor="_Toc238330463" w:history="1">
+      <w:hyperlink w:anchor="_Toc238462301" w:history="1">
         <w:r>
           <w:rPr>
             <w:rStyle w:val="Hipervnculo"/>
@@ -1088,7 +1088,7 @@
             <w:noProof/>
             <w:webHidden/>
           </w:rPr>
-          <w:instrText xml:space="preserve"> PAGEREF _Toc238330463 \h </w:instrText>
+          <w:instrText xml:space="preserve"> PAGEREF _Toc238462301 \h </w:instrText>
         </w:r>
         <w:r>
           <w:rPr>
@@ -1139,7 +1139,7 @@
           <w14:ligatures w14:val="standardContextual"/>
         </w:rPr>
       </w:pPr>
-      <w:hyperlink w:anchor="_Toc238330464" w:history="1">
+      <w:hyperlink w:anchor="_Toc238462302" w:history="1">
         <w:r>
           <w:rPr>
             <w:rStyle w:val="Hipervnculo"/>
@@ -1166,7 +1166,7 @@
             <w:noProof/>
             <w:webHidden/>
           </w:rPr>
-          <w:instrText xml:space="preserve"> PAGEREF _Toc238330464 \h </w:instrText>
+          <w:instrText xml:space="preserve"> PAGEREF _Toc238462302 \h </w:instrText>
         </w:r>
         <w:r>
           <w:rPr>
@@ -1216,7 +1216,7 @@
           <w14:ligatures w14:val="standardContextual"/>
         </w:rPr>
       </w:pPr>
-      <w:hyperlink w:anchor="_Toc238330465" w:history="1">
+      <w:hyperlink w:anchor="_Toc238462303" w:history="1">
         <w:r>
           <w:rPr>
             <w:rStyle w:val="Hipervnculo"/>
@@ -1243,7 +1243,7 @@
             <w:noProof/>
             <w:webHidden/>
           </w:rPr>
-          <w:instrText xml:space="preserve"> PAGEREF _Toc238330465 \h </w:instrText>
+          <w:instrText xml:space="preserve"> PAGEREF _Toc238462303 \h </w:instrText>
         </w:r>
         <w:r>
           <w:rPr>
@@ -1293,7 +1293,7 @@
           <w14:ligatures w14:val="standardContextual"/>
         </w:rPr>
       </w:pPr>
-      <w:hyperlink w:anchor="_Toc238330466" w:history="1">
+      <w:hyperlink w:anchor="_Toc238462304" w:history="1">
         <w:r>
           <w:rPr>
             <w:rStyle w:val="Hipervnculo"/>
@@ -1320,7 +1320,7 @@
             <w:noProof/>
             <w:webHidden/>
           </w:rPr>
-          <w:instrText xml:space="preserve"> PAGEREF _Toc238330466 \h </w:instrText>
+          <w:instrText xml:space="preserve"> PAGEREF _Toc238462304 \h </w:instrText>
         </w:r>
         <w:r>
           <w:rPr>
@@ -1371,7 +1371,7 @@
           <w14:ligatures w14:val="standardContextual"/>
         </w:rPr>
       </w:pPr>
-      <w:hyperlink w:anchor="_Toc238330467" w:history="1">
+      <w:hyperlink w:anchor="_Toc238462305" w:history="1">
         <w:r>
           <w:rPr>
             <w:rStyle w:val="Hipervnculo"/>
@@ -1398,7 +1398,7 @@
             <w:noProof/>
             <w:webHidden/>
           </w:rPr>
-          <w:instrText xml:space="preserve"> PAGEREF _Toc238330467 \h </w:instrText>
+          <w:instrText xml:space="preserve"> PAGEREF _Toc238462305 \h </w:instrText>
         </w:r>
         <w:r>
           <w:rPr>
@@ -1448,7 +1448,7 @@
           <w14:ligatures w14:val="standardContextual"/>
         </w:rPr>
       </w:pPr>
-      <w:hyperlink w:anchor="_Toc238330468" w:history="1">
+      <w:hyperlink w:anchor="_Toc238462306" w:history="1">
         <w:r>
           <w:rPr>
             <w:rStyle w:val="Hipervnculo"/>
@@ -1475,7 +1475,7 @@
             <w:noProof/>
             <w:webHidden/>
           </w:rPr>
-          <w:instrText xml:space="preserve"> PAGEREF _Toc238330468 \h </w:instrText>
+          <w:instrText xml:space="preserve"> PAGEREF _Toc238462306 \h </w:instrText>
         </w:r>
         <w:r>
           <w:rPr>
@@ -1525,7 +1525,7 @@
           <w14:ligatures w14:val="standardContextual"/>
         </w:rPr>
       </w:pPr>
-      <w:hyperlink w:anchor="_Toc238330469" w:history="1">
+      <w:hyperlink w:anchor="_Toc238462307" w:history="1">
         <w:r>
           <w:rPr>
             <w:rStyle w:val="Hipervnculo"/>
@@ -1552,7 +1552,7 @@
             <w:noProof/>
             <w:webHidden/>
           </w:rPr>
-          <w:instrText xml:space="preserve"> PAGEREF _Toc238330469 \h </w:instrText>
+          <w:instrText xml:space="preserve"> PAGEREF _Toc238462307 \h </w:instrText>
         </w:r>
         <w:r>
           <w:rPr>
@@ -1602,7 +1602,7 @@
           <w14:ligatures w14:val="standardContextual"/>
         </w:rPr>
       </w:pPr>
-      <w:hyperlink w:anchor="_Toc238330470" w:history="1">
+      <w:hyperlink w:anchor="_Toc238462308" w:history="1">
         <w:r>
           <w:rPr>
             <w:rStyle w:val="Hipervnculo"/>
@@ -1629,7 +1629,7 @@
             <w:noProof/>
             <w:webHidden/>
           </w:rPr>
-          <w:instrText xml:space="preserve"> PAGEREF _Toc238330470 \h </w:instrText>
+          <w:instrText xml:space="preserve"> PAGEREF _Toc238462308 \h </w:instrText>
         </w:r>
         <w:r>
           <w:rPr>
@@ -1679,7 +1679,7 @@
           <w14:ligatures w14:val="standardContextual"/>
         </w:rPr>
       </w:pPr>
-      <w:hyperlink w:anchor="_Toc238330471" w:history="1">
+      <w:hyperlink w:anchor="_Toc238462309" w:history="1">
         <w:r>
           <w:rPr>
             <w:rStyle w:val="Hipervnculo"/>
@@ -1706,7 +1706,7 @@
             <w:noProof/>
             <w:webHidden/>
           </w:rPr>
-          <w:instrText xml:space="preserve"> PAGEREF _Toc238330471 \h </w:instrText>
+          <w:instrText xml:space="preserve"> PAGEREF _Toc238462309 \h </w:instrText>
         </w:r>
         <w:r>
           <w:rPr>
@@ -1756,7 +1756,7 @@
           <w14:ligatures w14:val="standardContextual"/>
         </w:rPr>
       </w:pPr>
-      <w:hyperlink w:anchor="_Toc238330472" w:history="1">
+      <w:hyperlink w:anchor="_Toc238462310" w:history="1">
         <w:r>
           <w:rPr>
             <w:rStyle w:val="Hipervnculo"/>
@@ -1783,7 +1783,7 @@
             <w:noProof/>
             <w:webHidden/>
           </w:rPr>
-          <w:instrText xml:space="preserve"> PAGEREF _Toc238330472 \h </w:instrText>
+          <w:instrText xml:space="preserve"> PAGEREF _Toc238462310 \h </w:instrText>
         </w:r>
         <w:r>
           <w:rPr>
@@ -1833,7 +1833,7 @@
           <w14:ligatures w14:val="standardContextual"/>
         </w:rPr>
       </w:pPr>
-      <w:hyperlink w:anchor="_Toc238330473" w:history="1">
+      <w:hyperlink w:anchor="_Toc238462311" w:history="1">
         <w:r>
           <w:rPr>
             <w:rStyle w:val="Hipervnculo"/>
@@ -1860,7 +1860,7 @@
             <w:noProof/>
             <w:webHidden/>
           </w:rPr>
-          <w:instrText xml:space="preserve"> PAGEREF _Toc238330473 \h </w:instrText>
+          <w:instrText xml:space="preserve"> PAGEREF _Toc238462311 \h </w:instrText>
         </w:r>
         <w:r>
           <w:rPr>
@@ -1911,7 +1911,7 @@
           <w14:ligatures w14:val="standardContextual"/>
         </w:rPr>
       </w:pPr>
-      <w:hyperlink w:anchor="_Toc238330474" w:history="1">
+      <w:hyperlink w:anchor="_Toc238462312" w:history="1">
         <w:r>
           <w:rPr>
             <w:rStyle w:val="Hipervnculo"/>
@@ -1938,7 +1938,7 @@
             <w:noProof/>
             <w:webHidden/>
           </w:rPr>
-          <w:instrText xml:space="preserve"> PAGEREF _Toc238330474 \h </w:instrText>
+          <w:instrText xml:space="preserve"> PAGEREF _Toc238462312 \h </w:instrText>
         </w:r>
         <w:r>
           <w:rPr>
@@ -1988,7 +1988,7 @@
           <w14:ligatures w14:val="standardContextual"/>
         </w:rPr>
       </w:pPr>
-      <w:hyperlink w:anchor="_Toc238330475" w:history="1">
+      <w:hyperlink w:anchor="_Toc238462313" w:history="1">
         <w:r>
           <w:rPr>
             <w:rStyle w:val="Hipervnculo"/>
@@ -2015,7 +2015,7 @@
             <w:noProof/>
             <w:webHidden/>
           </w:rPr>
-          <w:instrText xml:space="preserve"> PAGEREF _Toc238330475 \h </w:instrText>
+          <w:instrText xml:space="preserve"> PAGEREF _Toc238462313 \h </w:instrText>
         </w:r>
         <w:r>
           <w:rPr>
@@ -2065,7 +2065,7 @@
           <w14:ligatures w14:val="standardContextual"/>
         </w:rPr>
       </w:pPr>
-      <w:hyperlink w:anchor="_Toc238330476" w:history="1">
+      <w:hyperlink w:anchor="_Toc238462314" w:history="1">
         <w:r>
           <w:rPr>
             <w:rStyle w:val="Hipervnculo"/>
@@ -2092,7 +2092,7 @@
             <w:noProof/>
             <w:webHidden/>
           </w:rPr>
-          <w:instrText xml:space="preserve"> PAGEREF _Toc238330476 \h </w:instrText>
+          <w:instrText xml:space="preserve"> PAGEREF _Toc238462314 \h </w:instrText>
         </w:r>
         <w:r>
           <w:rPr>
@@ -2140,7 +2140,7 @@
           <w14:ligatures w14:val="standardContextual"/>
         </w:rPr>
       </w:pPr>
-      <w:hyperlink w:anchor="_Toc238330477" w:history="1">
+      <w:hyperlink w:anchor="_Toc238462315" w:history="1">
         <w:r>
           <w:rPr>
             <w:rStyle w:val="Hipervnculo"/>
@@ -2167,7 +2167,7 @@
             <w:noProof/>
             <w:webHidden/>
           </w:rPr>
-          <w:instrText xml:space="preserve"> PAGEREF _Toc238330477 \h </w:instrText>
+          <w:instrText xml:space="preserve"> PAGEREF _Toc238462315 \h </w:instrText>
         </w:r>
         <w:r>
           <w:rPr>
@@ -2215,7 +2215,7 @@
           <w14:ligatures w14:val="standardContextual"/>
         </w:rPr>
       </w:pPr>
-      <w:hyperlink w:anchor="_Toc238330478" w:history="1">
+      <w:hyperlink w:anchor="_Toc238462316" w:history="1">
         <w:r>
           <w:rPr>
             <w:rStyle w:val="Hipervnculo"/>
@@ -2242,7 +2242,7 @@
             <w:noProof/>
             <w:webHidden/>
           </w:rPr>
-          <w:instrText xml:space="preserve"> PAGEREF _Toc238330478 \h </w:instrText>
+          <w:instrText xml:space="preserve"> PAGEREF _Toc238462316 \h </w:instrText>
         </w:r>
         <w:r>
           <w:rPr>
@@ -2290,7 +2290,7 @@
           <w14:ligatures w14:val="standardContextual"/>
         </w:rPr>
       </w:pPr>
-      <w:hyperlink w:anchor="_Toc238330479" w:history="1">
+      <w:hyperlink w:anchor="_Toc238462317" w:history="1">
         <w:r>
           <w:rPr>
             <w:rStyle w:val="Hipervnculo"/>
@@ -2317,7 +2317,7 @@
             <w:noProof/>
             <w:webHidden/>
           </w:rPr>
-          <w:instrText xml:space="preserve"> PAGEREF _Toc238330479 \h </w:instrText>
+          <w:instrText xml:space="preserve"> PAGEREF _Toc238462317 \h </w:instrText>
         </w:r>
         <w:r>
           <w:rPr>
@@ -2365,7 +2365,7 @@
           <w14:ligatures w14:val="standardContextual"/>
         </w:rPr>
       </w:pPr>
-      <w:hyperlink w:anchor="_Toc238330480" w:history="1">
+      <w:hyperlink w:anchor="_Toc238462318" w:history="1">
         <w:r>
           <w:rPr>
             <w:rStyle w:val="Hipervnculo"/>
@@ -2392,7 +2392,7 @@
             <w:noProof/>
             <w:webHidden/>
           </w:rPr>
-          <w:instrText xml:space="preserve"> PAGEREF _Toc238330480 \h </w:instrText>
+          <w:instrText xml:space="preserve"> PAGEREF _Toc238462318 \h </w:instrText>
         </w:r>
         <w:r>
           <w:rPr>
@@ -2440,7 +2440,7 @@
           <w14:ligatures w14:val="standardContextual"/>
         </w:rPr>
       </w:pPr>
-      <w:hyperlink w:anchor="_Toc238330481" w:history="1">
+      <w:hyperlink w:anchor="_Toc238462319" w:history="1">
         <w:r>
           <w:rPr>
             <w:rStyle w:val="Hipervnculo"/>
@@ -2467,7 +2467,7 @@
             <w:noProof/>
             <w:webHidden/>
           </w:rPr>
-          <w:instrText xml:space="preserve"> PAGEREF _Toc238330481 \h </w:instrText>
+          <w:instrText xml:space="preserve"> PAGEREF _Toc238462319 \h </w:instrText>
         </w:r>
         <w:r>
           <w:rPr>
@@ -2518,7 +2518,7 @@
           <w14:ligatures w14:val="standardContextual"/>
         </w:rPr>
       </w:pPr>
-      <w:hyperlink w:anchor="_Toc238330482" w:history="1">
+      <w:hyperlink w:anchor="_Toc238462320" w:history="1">
         <w:r>
           <w:rPr>
             <w:rStyle w:val="Hipervnculo"/>
@@ -2545,7 +2545,7 @@
             <w:noProof/>
             <w:webHidden/>
           </w:rPr>
-          <w:instrText xml:space="preserve"> PAGEREF _Toc238330482 \h </w:instrText>
+          <w:instrText xml:space="preserve"> PAGEREF _Toc238462320 \h </w:instrText>
         </w:r>
         <w:r>
           <w:rPr>
@@ -2595,7 +2595,7 @@
           <w14:ligatures w14:val="standardContextual"/>
         </w:rPr>
       </w:pPr>
-      <w:hyperlink w:anchor="_Toc238330483" w:history="1">
+      <w:hyperlink w:anchor="_Toc238462321" w:history="1">
         <w:r>
           <w:rPr>
             <w:rStyle w:val="Hipervnculo"/>
@@ -2622,7 +2622,7 @@
             <w:noProof/>
             <w:webHidden/>
           </w:rPr>
-          <w:instrText xml:space="preserve"> PAGEREF _Toc238330483 \h </w:instrText>
+          <w:instrText xml:space="preserve"> PAGEREF _Toc238462321 \h </w:instrText>
         </w:r>
         <w:r>
           <w:rPr>
@@ -2672,7 +2672,7 @@
           <w14:ligatures w14:val="standardContextual"/>
         </w:rPr>
       </w:pPr>
-      <w:hyperlink w:anchor="_Toc238330484" w:history="1">
+      <w:hyperlink w:anchor="_Toc238462322" w:history="1">
         <w:r>
           <w:rPr>
             <w:rStyle w:val="Hipervnculo"/>
@@ -2699,7 +2699,7 @@
             <w:noProof/>
             <w:webHidden/>
           </w:rPr>
-          <w:instrText xml:space="preserve"> PAGEREF _Toc238330484 \h </w:instrText>
+          <w:instrText xml:space="preserve"> PAGEREF _Toc238462322 \h </w:instrText>
         </w:r>
         <w:r>
           <w:rPr>
@@ -2750,7 +2750,7 @@
           <w14:ligatures w14:val="standardContextual"/>
         </w:rPr>
       </w:pPr>
-      <w:hyperlink w:anchor="_Toc238330485" w:history="1">
+      <w:hyperlink w:anchor="_Toc238462323" w:history="1">
         <w:r>
           <w:rPr>
             <w:rStyle w:val="Hipervnculo"/>
@@ -2777,7 +2777,7 @@
             <w:noProof/>
             <w:webHidden/>
           </w:rPr>
-          <w:instrText xml:space="preserve"> PAGEREF _Toc238330485 \h </w:instrText>
+          <w:instrText xml:space="preserve"> PAGEREF _Toc238462323 \h </w:instrText>
         </w:r>
         <w:r>
           <w:rPr>
@@ -2827,7 +2827,7 @@
           <w14:ligatures w14:val="standardContextual"/>
         </w:rPr>
       </w:pPr>
-      <w:hyperlink w:anchor="_Toc238330486" w:history="1">
+      <w:hyperlink w:anchor="_Toc238462324" w:history="1">
         <w:r>
           <w:rPr>
             <w:rStyle w:val="Hipervnculo"/>
@@ -2854,7 +2854,7 @@
             <w:noProof/>
             <w:webHidden/>
           </w:rPr>
-          <w:instrText xml:space="preserve"> PAGEREF _Toc238330486 \h </w:instrText>
+          <w:instrText xml:space="preserve"> PAGEREF _Toc238462324 \h </w:instrText>
         </w:r>
         <w:r>
           <w:rPr>
@@ -2904,7 +2904,7 @@
           <w14:ligatures w14:val="standardContextual"/>
         </w:rPr>
       </w:pPr>
-      <w:hyperlink w:anchor="_Toc238330487" w:history="1">
+      <w:hyperlink w:anchor="_Toc238462325" w:history="1">
         <w:r>
           <w:rPr>
             <w:rStyle w:val="Hipervnculo"/>
@@ -2931,7 +2931,7 @@
             <w:noProof/>
             <w:webHidden/>
           </w:rPr>
-          <w:instrText xml:space="preserve"> PAGEREF _Toc238330487 \h </w:instrText>
+          <w:instrText xml:space="preserve"> PAGEREF _Toc238462325 \h </w:instrText>
         </w:r>
         <w:r>
           <w:rPr>
@@ -2982,7 +2982,7 @@
           <w14:ligatures w14:val="standardContextual"/>
         </w:rPr>
       </w:pPr>
-      <w:hyperlink w:anchor="_Toc238330488" w:history="1">
+      <w:hyperlink w:anchor="_Toc238462326" w:history="1">
         <w:r>
           <w:rPr>
             <w:rStyle w:val="Hipervnculo"/>
@@ -3009,7 +3009,7 @@
             <w:noProof/>
             <w:webHidden/>
           </w:rPr>
-          <w:instrText xml:space="preserve"> PAGEREF _Toc238330488 \h </w:instrText>
+          <w:instrText xml:space="preserve"> PAGEREF _Toc238462326 \h </w:instrText>
         </w:r>
         <w:r>
           <w:rPr>
@@ -3059,7 +3059,7 @@
           <w14:ligatures w14:val="standardContextual"/>
         </w:rPr>
       </w:pPr>
-      <w:hyperlink w:anchor="_Toc238330489" w:history="1">
+      <w:hyperlink w:anchor="_Toc238462327" w:history="1">
         <w:r>
           <w:rPr>
             <w:rStyle w:val="Hipervnculo"/>
@@ -3086,7 +3086,7 @@
             <w:noProof/>
             <w:webHidden/>
           </w:rPr>
-          <w:instrText xml:space="preserve"> PAGEREF _Toc238330489 \h </w:instrText>
+          <w:instrText xml:space="preserve"> PAGEREF _Toc238462327 \h </w:instrText>
         </w:r>
         <w:r>
           <w:rPr>
@@ -3136,7 +3136,7 @@
           <w14:ligatures w14:val="standardContextual"/>
         </w:rPr>
       </w:pPr>
-      <w:hyperlink w:anchor="_Toc238330490" w:history="1">
+      <w:hyperlink w:anchor="_Toc238462328" w:history="1">
         <w:r>
           <w:rPr>
             <w:rStyle w:val="Hipervnculo"/>
@@ -3163,7 +3163,7 @@
             <w:noProof/>
             <w:webHidden/>
           </w:rPr>
-          <w:instrText xml:space="preserve"> PAGEREF _Toc238330490 \h </w:instrText>
+          <w:instrText xml:space="preserve"> PAGEREF _Toc238462328 \h </w:instrText>
         </w:r>
         <w:r>
           <w:rPr>
@@ -3213,7 +3213,7 @@
           <w14:ligatures w14:val="standardContextual"/>
         </w:rPr>
       </w:pPr>
-      <w:hyperlink w:anchor="_Toc238330491" w:history="1">
+      <w:hyperlink w:anchor="_Toc238462329" w:history="1">
         <w:r>
           <w:rPr>
             <w:rStyle w:val="Hipervnculo"/>
@@ -3240,7 +3240,7 @@
             <w:noProof/>
             <w:webHidden/>
           </w:rPr>
-          <w:instrText xml:space="preserve"> PAGEREF _Toc238330491 \h </w:instrText>
+          <w:instrText xml:space="preserve"> PAGEREF _Toc238462329 \h </w:instrText>
         </w:r>
         <w:r>
           <w:rPr>
@@ -3290,7 +3290,7 @@
           <w14:ligatures w14:val="standardContextual"/>
         </w:rPr>
       </w:pPr>
-      <w:hyperlink w:anchor="_Toc238330492" w:history="1">
+      <w:hyperlink w:anchor="_Toc238462330" w:history="1">
         <w:r>
           <w:rPr>
             <w:rStyle w:val="Hipervnculo"/>
@@ -3317,7 +3317,7 @@
             <w:noProof/>
             <w:webHidden/>
           </w:rPr>
-          <w:instrText xml:space="preserve"> PAGEREF _Toc238330492 \h </w:instrText>
+          <w:instrText xml:space="preserve"> PAGEREF _Toc238462330 \h </w:instrText>
         </w:r>
         <w:r>
           <w:rPr>
@@ -3367,7 +3367,7 @@
           <w14:ligatures w14:val="standardContextual"/>
         </w:rPr>
       </w:pPr>
-      <w:hyperlink w:anchor="_Toc238330493" w:history="1">
+      <w:hyperlink w:anchor="_Toc238462331" w:history="1">
         <w:r>
           <w:rPr>
             <w:rStyle w:val="Hipervnculo"/>
@@ -3394,7 +3394,7 @@
             <w:noProof/>
             <w:webHidden/>
           </w:rPr>
-          <w:instrText xml:space="preserve"> PAGEREF _Toc238330493 \h </w:instrText>
+          <w:instrText xml:space="preserve"> PAGEREF _Toc238462331 \h </w:instrText>
         </w:r>
         <w:r>
           <w:rPr>
@@ -3439,7 +3439,7 @@
       <w:pPr>
         <w:pStyle w:val="Ttulo"/>
       </w:pPr>
-      <w:bookmarkStart w:id="1" w:name="_Toc238330458"/>
+      <w:bookmarkStart w:id="1" w:name="_Toc238462296"/>
       <w:r>
         <w:lastRenderedPageBreak/>
         <w:t>Foreword</w:t>
@@ -3455,7 +3455,7 @@
       <w:pPr>
         <w:pStyle w:val="Ttulo"/>
       </w:pPr>
-      <w:bookmarkStart w:id="2" w:name="_Toc238330459"/>
+      <w:bookmarkStart w:id="2" w:name="_Toc238462297"/>
       <w:r>
         <w:lastRenderedPageBreak/>
         <w:t>1. Purpose, scope, and models</w:t>
@@ -3472,7 +3472,7 @@
         <w:pStyle w:val="Ttulo1"/>
         <w:spacing w:before="280"/>
       </w:pPr>
-      <w:bookmarkStart w:id="3" w:name="_Toc238330460"/>
+      <w:bookmarkStart w:id="3" w:name="_Toc238462298"/>
       <w:r>
         <w:t>1.1 Scope of this guide</w:t>
       </w:r>
@@ -3497,7 +3497,7 @@
       <w:pPr>
         <w:pStyle w:val="Ttulo"/>
       </w:pPr>
-      <w:bookmarkStart w:id="4" w:name="_Toc238330461"/>
+      <w:bookmarkStart w:id="4" w:name="_Toc238462299"/>
       <w:r>
         <w:lastRenderedPageBreak/>
         <w:t>2. Activation and producer selection</w:t>
@@ -3509,7 +3509,7 @@
         <w:pStyle w:val="Ttulo1"/>
         <w:spacing w:before="280"/>
       </w:pPr>
-      <w:bookmarkStart w:id="5" w:name="_Toc238330462"/>
+      <w:bookmarkStart w:id="5" w:name="_Toc238462300"/>
       <w:r>
         <w:t>2.1 Console command</w:t>
       </w:r>
@@ -3967,7 +3967,7 @@
         <w:pStyle w:val="Ttulo1"/>
         <w:spacing w:before="280"/>
       </w:pPr>
-      <w:bookmarkStart w:id="6" w:name="_Toc238330463"/>
+      <w:bookmarkStart w:id="6" w:name="_Toc238462301"/>
       <w:r>
         <w:t>2.2 Conditions and special paths</w:t>
       </w:r>
@@ -4025,7 +4025,7 @@
       <w:pPr>
         <w:pStyle w:val="Ttulo"/>
       </w:pPr>
-      <w:bookmarkStart w:id="7" w:name="_Toc238330464"/>
+      <w:bookmarkStart w:id="7" w:name="_Toc238462302"/>
       <w:r>
         <w:lastRenderedPageBreak/>
         <w:t>3. Common file structure</w:t>
@@ -4037,7 +4037,7 @@
         <w:pStyle w:val="Ttulo1"/>
         <w:spacing w:before="280"/>
       </w:pPr>
-      <w:bookmarkStart w:id="8" w:name="_Toc238330465"/>
+      <w:bookmarkStart w:id="8" w:name="_Toc238462303"/>
       <w:r>
         <w:t>3.1 Physical hierarchy</w:t>
       </w:r>
@@ -4358,7 +4358,7 @@
         <w:pStyle w:val="Ttulo1"/>
         <w:spacing w:before="280"/>
       </w:pPr>
-      <w:bookmarkStart w:id="9" w:name="_Toc238330466"/>
+      <w:bookmarkStart w:id="9" w:name="_Toc238462304"/>
       <w:r>
         <w:t>3.2 Timing rules</w:t>
       </w:r>
@@ -4440,7 +4440,7 @@
       <w:pPr>
         <w:pStyle w:val="Ttulo"/>
       </w:pPr>
-      <w:bookmarkStart w:id="10" w:name="_Toc238330467"/>
+      <w:bookmarkStart w:id="10" w:name="_Toc238462305"/>
       <w:r>
         <w:lastRenderedPageBreak/>
         <w:t>4. Common framework records</w:t>
@@ -4452,7 +4452,7 @@
         <w:pStyle w:val="Ttulo1"/>
         <w:spacing w:before="280"/>
       </w:pPr>
-      <w:bookmarkStart w:id="11" w:name="_Toc238330468"/>
+      <w:bookmarkStart w:id="11" w:name="_Toc238462306"/>
       <w:r>
         <w:t>CPU — Info Cycle</w:t>
       </w:r>
@@ -4518,7 +4518,7 @@
         <w:pStyle w:val="Ttulo1"/>
         <w:spacing w:before="280"/>
       </w:pPr>
-      <w:bookmarkStart w:id="12" w:name="_Toc238330469"/>
+      <w:bookmarkStart w:id="12" w:name="_Toc238462307"/>
       <w:r>
         <w:t>CPU — Transaction about to execute</w:t>
       </w:r>
@@ -4584,7 +4584,7 @@
         <w:pStyle w:val="Ttulo1"/>
         <w:spacing w:before="280"/>
       </w:pPr>
-      <w:bookmarkStart w:id="13" w:name="_Toc238330470"/>
+      <w:bookmarkStart w:id="13" w:name="_Toc238462308"/>
       <w:r>
         <w:t>CPU — Executed instruction</w:t>
       </w:r>
@@ -4650,7 +4650,7 @@
         <w:pStyle w:val="Ttulo1"/>
         <w:spacing w:before="280"/>
       </w:pPr>
-      <w:bookmarkStart w:id="14" w:name="_Toc238330471"/>
+      <w:bookmarkStart w:id="14" w:name="_Toc238462309"/>
       <w:r>
         <w:t>CPU — Stop</w:t>
       </w:r>
@@ -4717,7 +4717,7 @@
         <w:pStyle w:val="Ttulo1"/>
         <w:spacing w:before="280"/>
       </w:pPr>
-      <w:bookmarkStart w:id="15" w:name="_Toc238330472"/>
+      <w:bookmarkStart w:id="15" w:name="_Toc238462310"/>
       <w:r>
         <w:t>CPU — Interrupts</w:t>
       </w:r>
@@ -4783,7 +4783,7 @@
         <w:pStyle w:val="Ttulo1"/>
         <w:spacing w:before="280"/>
       </w:pPr>
-      <w:bookmarkStart w:id="16" w:name="_Toc238330473"/>
+      <w:bookmarkStart w:id="16" w:name="_Toc238462311"/>
       <w:r>
         <w:t>Memory — Applied Set</w:t>
       </w:r>
@@ -4848,7 +4848,7 @@
       <w:pPr>
         <w:pStyle w:val="Ttulo"/>
       </w:pPr>
-      <w:bookmarkStart w:id="17" w:name="_Toc238330474"/>
+      <w:bookmarkStart w:id="17" w:name="_Toc238462312"/>
       <w:r>
         <w:lastRenderedPageBreak/>
         <w:t>5. Machine-specific components</w:t>
@@ -4860,7 +4860,7 @@
         <w:pStyle w:val="Ttulo1"/>
         <w:spacing w:before="280"/>
       </w:pPr>
-      <w:bookmarkStart w:id="18" w:name="_Toc238330475"/>
+      <w:bookmarkStart w:id="18" w:name="_Toc238462313"/>
       <w:r>
         <w:t>5.1 Selectable inventory</w:t>
       </w:r>
@@ -5396,7 +5396,7 @@
         <w:pStyle w:val="Ttulo1"/>
         <w:spacing w:before="280"/>
       </w:pPr>
-      <w:bookmarkStart w:id="19" w:name="_Toc238330476"/>
+      <w:bookmarkStart w:id="19" w:name="_Toc238462314"/>
       <w:r>
         <w:t>5.2 Record catalog</w:t>
       </w:r>
@@ -5406,7 +5406,7 @@
       <w:pPr>
         <w:pStyle w:val="Ttulo2"/>
       </w:pPr>
-      <w:bookmarkStart w:id="20" w:name="_Toc238330477"/>
+      <w:bookmarkStart w:id="20" w:name="_Toc238462315"/>
       <w:r>
         <w:t>TED — Info Cycle</w:t>
       </w:r>
@@ -5460,7 +5460,7 @@
       <w:pPr>
         <w:pStyle w:val="Ttulo2"/>
       </w:pPr>
-      <w:bookmarkStart w:id="21" w:name="_Toc238330478"/>
+      <w:bookmarkStart w:id="21" w:name="_Toc238462316"/>
       <w:r>
         <w:t>TED — CPU transaction projection</w:t>
       </w:r>
@@ -5514,7 +5514,7 @@
       <w:pPr>
         <w:pStyle w:val="Ttulo2"/>
       </w:pPr>
-      <w:bookmarkStart w:id="22" w:name="_Toc238330479"/>
+      <w:bookmarkStart w:id="22" w:name="_Toc238462317"/>
       <w:r>
         <w:t>ROMRAMSwitch — direct line</w:t>
       </w:r>
@@ -5568,7 +5568,7 @@
       <w:pPr>
         <w:pStyle w:val="Ttulo2"/>
       </w:pPr>
-      <w:bookmarkStart w:id="23" w:name="_Toc238330480"/>
+      <w:bookmarkStart w:id="23" w:name="_Toc238462318"/>
       <w:r>
         <w:lastRenderedPageBreak/>
         <w:t>C1C2Selector — direct line</w:t>
@@ -5623,7 +5623,7 @@
       <w:pPr>
         <w:pStyle w:val="Ttulo2"/>
       </w:pPr>
-      <w:bookmarkStart w:id="24" w:name="_Toc238330481"/>
+      <w:bookmarkStart w:id="24" w:name="_Toc238462319"/>
       <w:r>
         <w:t>Datasette 1531 / SerialIO</w:t>
       </w:r>
@@ -5677,7 +5677,7 @@
       <w:pPr>
         <w:pStyle w:val="Ttulo"/>
       </w:pPr>
-      <w:bookmarkStart w:id="25" w:name="_Toc238330482"/>
+      <w:bookmarkStart w:id="25" w:name="_Toc238462320"/>
       <w:r>
         <w:lastRenderedPageBreak/>
         <w:t>6. Interpretation method</w:t>
@@ -5689,7 +5689,7 @@
         <w:pStyle w:val="Ttulo1"/>
         <w:spacing w:before="280"/>
       </w:pPr>
-      <w:bookmarkStart w:id="26" w:name="_Toc238330483"/>
+      <w:bookmarkStart w:id="26" w:name="_Toc238462321"/>
       <w:r>
         <w:t>6.1 Recommended procedure</w:t>
       </w:r>
@@ -5772,7 +5772,7 @@
         <w:pStyle w:val="Ttulo1"/>
         <w:spacing w:before="280"/>
       </w:pPr>
-      <w:bookmarkStart w:id="27" w:name="_Toc238330484"/>
+      <w:bookmarkStart w:id="27" w:name="_Toc238462322"/>
       <w:r>
         <w:t>6.2 Annotated example</w:t>
       </w:r>
@@ -5850,7 +5850,7 @@
       <w:pPr>
         <w:pStyle w:val="Ttulo"/>
       </w:pPr>
-      <w:bookmarkStart w:id="28" w:name="_Toc238330485"/>
+      <w:bookmarkStart w:id="28" w:name="_Toc238462323"/>
       <w:r>
         <w:lastRenderedPageBreak/>
         <w:t>7. Limitations and maintenance</w:t>
@@ -5862,7 +5862,7 @@
         <w:pStyle w:val="Ttulo1"/>
         <w:spacing w:before="280"/>
       </w:pPr>
-      <w:bookmarkStart w:id="29" w:name="_Toc238330486"/>
+      <w:bookmarkStart w:id="29" w:name="_Toc238462324"/>
       <w:r>
         <w:t>7.1 Specific limitations</w:t>
       </w:r>
@@ -5909,7 +5909,7 @@
         <w:pStyle w:val="Ttulo1"/>
         <w:spacing w:before="280"/>
       </w:pPr>
-      <w:bookmarkStart w:id="30" w:name="_Toc238330487"/>
+      <w:bookmarkStart w:id="30" w:name="_Toc238462325"/>
       <w:r>
         <w:t>7.2 Maintenance contract</w:t>
       </w:r>
@@ -5967,7 +5967,7 @@
       <w:pPr>
         <w:pStyle w:val="Ttulo"/>
       </w:pPr>
-      <w:bookmarkStart w:id="31" w:name="_Toc238330488"/>
+      <w:bookmarkStart w:id="31" w:name="_Toc238462326"/>
       <w:r>
         <w:lastRenderedPageBreak/>
         <w:t>Appendices</w:t>
@@ -5978,7 +5978,7 @@
       <w:pPr>
         <w:pStyle w:val="Ttulo1"/>
       </w:pPr>
-      <w:bookmarkStart w:id="32" w:name="_Toc238330489"/>
+      <w:bookmarkStart w:id="32" w:name="_Toc238462327"/>
       <w:r>
         <w:t>Appendix A. Provenance and revision</w:t>
       </w:r>
@@ -6000,7 +6000,7 @@
         <w:pStyle w:val="Ttulo1"/>
         <w:spacing w:before="280"/>
       </w:pPr>
-      <w:bookmarkStart w:id="33" w:name="_Toc238330490"/>
+      <w:bookmarkStart w:id="33" w:name="_Toc238462328"/>
       <w:r>
         <w:t>A.1 Watched source files</w:t>
       </w:r>
@@ -6763,7 +6763,7 @@
         <w:pStyle w:val="Ttulo1"/>
         <w:spacing w:before="280"/>
       </w:pPr>
-      <w:bookmarkStart w:id="34" w:name="_Toc238330491"/>
+      <w:bookmarkStart w:id="34" w:name="_Toc238462329"/>
       <w:r>
         <w:t>A.2 Revision history</w:t>
       </w:r>
@@ -6934,7 +6934,7 @@
       <w:pPr>
         <w:pStyle w:val="Ttulo1"/>
       </w:pPr>
-      <w:bookmarkStart w:id="35" w:name="_Toc238330492"/>
+      <w:bookmarkStart w:id="35" w:name="_Toc238462330"/>
       <w:r>
         <w:t>Illustrations</w:t>
       </w:r>
@@ -6974,7 +6974,7 @@
       <w:pPr>
         <w:pStyle w:val="Ttulo1"/>
       </w:pPr>
-      <w:bookmarkStart w:id="36" w:name="_Toc238330493"/>
+      <w:bookmarkStart w:id="36" w:name="_Toc238462331"/>
       <w:r>
         <w:lastRenderedPageBreak/>
         <w:t>Equations</w:t>
@@ -7025,7 +7025,7 @@
 </file>
 
 <file path=word/endnotes.xml><?xml version="1.0" encoding="utf-8"?>
-<w:endnotes xmlns:wpc="http://schemas.microsoft.com/office/word/2010/wordprocessingCanvas" xmlns:cx="http://schemas.microsoft.com/office/drawing/2014/chartex" xmlns:cx1="http://schemas.microsoft.com/office/drawing/2015/9/8/chartex" xmlns:cx2="http://schemas.microsoft.com/office/drawing/2015/10/21/chartex" xmlns:cx3="http://schemas.microsoft.com/office/drawing/2016/5/9/chartex" xmlns:cx4="http://schemas.microsoft.com/office/drawing/2016/5/10/chartex" xmlns:cx5="http://schemas.microsoft.com/office/drawing/2016/5/11/chartex" xmlns:cx6="http://schemas.microsoft.com/office/drawing/2016/5/12/chartex" xmlns:cx7="http://schemas.microsoft.com/office/drawing/2016/5/13/chartex" xmlns:cx8="http://schemas.microsoft.com/office/drawing/2016/5/14/chartex" xmlns:mc="http://schemas.openxmlformats.org/markup-compatibility/2006" xmlns:aink="http://schemas.microsoft.com/office/drawing/2016/ink" xmlns:am3d="http://schemas.microsoft.com/office/drawing/2017/model3d" xmlns:o="urn:schemas-microsoft-com:office:office" xmlns:oel="http://schemas.microsoft.com/office/2019/extlst" xmlns:r="http://schemas.openxmlformats.org/officeDocument/2006/relationships" xmlns:m="http://schemas.openxmlformats.org/officeDocument/2006/math" xmlns:v="urn:schemas-microsoft-com:vml" xmlns:wp14="http://schemas.microsoft.com/office/word/2010/wordprocessingDrawing" xmlns:wp="http://schemas.openxmlformats.org/drawingml/2006/wordprocessingDrawing" xmlns:w10="urn:schemas-microsoft-com:office:word" xmlns:w="http://schemas.openxmlformats.org/wordprocessingml/2006/main" xmlns:w14="http://schemas.microsoft.com/office/word/2010/wordml" xmlns:w15="http://schemas.microsoft.com/office/word/2012/wordml" xmlns:w16cei="http://schemas.microsoft.com/office/word/2026/wordml/cei" xmlns:w16cex="http://schemas.microsoft.com/office/word/2018/wordml/cex" xmlns:w16cid="http://schemas.microsoft.com/office/word/2016/wordml/cid" xmlns:w16="http://schemas.microsoft.com/office/word/2018/wordml" xmlns:w16du="http://schemas.microsoft.com/office/word/2023/wordml/word16du" xmlns:w16sdtdh="http://schemas.microsoft.com/office/word/2020/wordml/sdtdatahash" xmlns:w16sdtfl="http://schemas.microsoft.com/office/word/2024/wordml/sdtformatlock" xmlns:w16se="http://schemas.microsoft.com/office/word/2015/wordml/symex" xmlns:wpg="http://schemas.microsoft.com/office/word/2010/wordprocessingGroup" xmlns:wpi="http://schemas.microsoft.com/office/word/2010/wordprocessingInk" xmlns:wne="http://schemas.microsoft.com/office/word/2006/wordml" xmlns:wps="http://schemas.microsoft.com/office/word/2010/wordprocessingShape" mc:Ignorable="w14 w15 w16se w16cid w16 w16cex w16sdtdh w16sdtfl w16du wp14">
+<w:endnotes xmlns:wpc="http://schemas.microsoft.com/office/word/2010/wordprocessingCanvas" xmlns:cx="http://schemas.microsoft.com/office/drawing/2014/chartex" xmlns:cx1="http://schemas.microsoft.com/office/drawing/2015/9/8/chartex" xmlns:cx2="http://schemas.microsoft.com/office/drawing/2015/10/21/chartex" xmlns:cx3="http://schemas.microsoft.com/office/drawing/2016/5/9/chartex" xmlns:cx4="http://schemas.microsoft.com/office/drawing/2016/5/10/chartex" xmlns:cx5="http://schemas.microsoft.com/office/drawing/2016/5/11/chartex" xmlns:cx6="http://schemas.microsoft.com/office/drawing/2016/5/12/chartex" xmlns:cx7="http://schemas.microsoft.com/office/drawing/2016/5/13/chartex" xmlns:cx8="http://schemas.microsoft.com/office/drawing/2016/5/14/chartex" xmlns:mc="http://schemas.openxmlformats.org/markup-compatibility/2006" xmlns:aink="http://schemas.microsoft.com/office/drawing/2016/ink" xmlns:am3d="http://schemas.microsoft.com/office/drawing/2017/model3d" xmlns:o="urn:schemas-microsoft-com:office:office" xmlns:oel="http://schemas.microsoft.com/office/2019/extlst" xmlns:r="http://schemas.openxmlformats.org/officeDocument/2006/relationships" xmlns:m="http://schemas.openxmlformats.org/officeDocument/2006/math" xmlns:v="urn:schemas-microsoft-com:vml" xmlns:wp14="http://schemas.microsoft.com/office/word/2010/wordprocessingDrawing" xmlns:wp="http://schemas.openxmlformats.org/drawingml/2006/wordprocessingDrawing" xmlns:w10="urn:schemas-microsoft-com:office:word" xmlns:w="http://schemas.openxmlformats.org/wordprocessingml/2006/main" xmlns:w14="http://schemas.microsoft.com/office/word/2010/wordml" xmlns:w15="http://schemas.microsoft.com/office/word/2012/wordml" xmlns:w16cex="http://schemas.microsoft.com/office/word/2018/wordml/cex" xmlns:w16cid="http://schemas.microsoft.com/office/word/2016/wordml/cid" xmlns:w16="http://schemas.microsoft.com/office/word/2018/wordml" xmlns:w16du="http://schemas.microsoft.com/office/word/2023/wordml/word16du" xmlns:w16sdtdh="http://schemas.microsoft.com/office/word/2020/wordml/sdtdatahash" xmlns:w16sdtfl="http://schemas.microsoft.com/office/word/2024/wordml/sdtformatlock" xmlns:w16se="http://schemas.microsoft.com/office/word/2015/wordml/symex" xmlns:wpg="http://schemas.microsoft.com/office/word/2010/wordprocessingGroup" xmlns:wpi="http://schemas.microsoft.com/office/word/2010/wordprocessingInk" xmlns:wne="http://schemas.microsoft.com/office/word/2006/wordml" xmlns:wps="http://schemas.microsoft.com/office/word/2010/wordprocessingShape" mc:Ignorable="w14 w15 w16se w16cid w16 w16cex w16sdtdh w16sdtfl w16du wp14">
   <w:endnote w:type="separator" w:id="-1">
     <w:p>
       <w:pPr>
@@ -7050,7 +7050,7 @@
 </file>
 
 <file path=word/footer1.xml><?xml version="1.0" encoding="utf-8"?>
-<w:ftr xmlns:wpc="http://schemas.microsoft.com/office/word/2010/wordprocessingCanvas" xmlns:cx="http://schemas.microsoft.com/office/drawing/2014/chartex" xmlns:cx1="http://schemas.microsoft.com/office/drawing/2015/9/8/chartex" xmlns:cx2="http://schemas.microsoft.com/office/drawing/2015/10/21/chartex" xmlns:cx3="http://schemas.microsoft.com/office/drawing/2016/5/9/chartex" xmlns:cx4="http://schemas.microsoft.com/office/drawing/2016/5/10/chartex" xmlns:cx5="http://schemas.microsoft.com/office/drawing/2016/5/11/chartex" xmlns:cx6="http://schemas.microsoft.com/office/drawing/2016/5/12/chartex" xmlns:cx7="http://schemas.microsoft.com/office/drawing/2016/5/13/chartex" xmlns:cx8="http://schemas.microsoft.com/office/drawing/2016/5/14/chartex" xmlns:mc="http://schemas.openxmlformats.org/markup-compatibility/2006" xmlns:aink="http://schemas.microsoft.com/office/drawing/2016/ink" xmlns:am3d="http://schemas.microsoft.com/office/drawing/2017/model3d" xmlns:o="urn:schemas-microsoft-com:office:office" xmlns:oel="http://schemas.microsoft.com/office/2019/extlst" xmlns:r="http://schemas.openxmlformats.org/officeDocument/2006/relationships" xmlns:m="http://schemas.openxmlformats.org/officeDocument/2006/math" xmlns:v="urn:schemas-microsoft-com:vml" xmlns:wp14="http://schemas.microsoft.com/office/word/2010/wordprocessingDrawing" xmlns:wp="http://schemas.openxmlformats.org/drawingml/2006/wordprocessingDrawing" xmlns:w10="urn:schemas-microsoft-com:office:word" xmlns:w="http://schemas.openxmlformats.org/wordprocessingml/2006/main" xmlns:w14="http://schemas.microsoft.com/office/word/2010/wordml" xmlns:w15="http://schemas.microsoft.com/office/word/2012/wordml" xmlns:w16cei="http://schemas.microsoft.com/office/word/2026/wordml/cei" xmlns:w16cex="http://schemas.microsoft.com/office/word/2018/wordml/cex" xmlns:w16cid="http://schemas.microsoft.com/office/word/2016/wordml/cid" xmlns:w16="http://schemas.microsoft.com/office/word/2018/wordml" xmlns:w16du="http://schemas.microsoft.com/office/word/2023/wordml/word16du" xmlns:w16sdtdh="http://schemas.microsoft.com/office/word/2020/wordml/sdtdatahash" xmlns:w16sdtfl="http://schemas.microsoft.com/office/word/2024/wordml/sdtformatlock" xmlns:w16se="http://schemas.microsoft.com/office/word/2015/wordml/symex" xmlns:wpg="http://schemas.microsoft.com/office/word/2010/wordprocessingGroup" xmlns:wpi="http://schemas.microsoft.com/office/word/2010/wordprocessingInk" xmlns:wne="http://schemas.microsoft.com/office/word/2006/wordml" xmlns:wps="http://schemas.microsoft.com/office/word/2010/wordprocessingShape" mc:Ignorable="w14 w15 w16se w16cid w16 w16cex w16sdtdh w16sdtfl w16du wp14">
+<w:ftr xmlns:wpc="http://schemas.microsoft.com/office/word/2010/wordprocessingCanvas" xmlns:cx="http://schemas.microsoft.com/office/drawing/2014/chartex" xmlns:cx1="http://schemas.microsoft.com/office/drawing/2015/9/8/chartex" xmlns:cx2="http://schemas.microsoft.com/office/drawing/2015/10/21/chartex" xmlns:cx3="http://schemas.microsoft.com/office/drawing/2016/5/9/chartex" xmlns:cx4="http://schemas.microsoft.com/office/drawing/2016/5/10/chartex" xmlns:cx5="http://schemas.microsoft.com/office/drawing/2016/5/11/chartex" xmlns:cx6="http://schemas.microsoft.com/office/drawing/2016/5/12/chartex" xmlns:cx7="http://schemas.microsoft.com/office/drawing/2016/5/13/chartex" xmlns:cx8="http://schemas.microsoft.com/office/drawing/2016/5/14/chartex" xmlns:mc="http://schemas.openxmlformats.org/markup-compatibility/2006" xmlns:aink="http://schemas.microsoft.com/office/drawing/2016/ink" xmlns:am3d="http://schemas.microsoft.com/office/drawing/2017/model3d" xmlns:o="urn:schemas-microsoft-com:office:office" xmlns:oel="http://schemas.microsoft.com/office/2019/extlst" xmlns:r="http://schemas.openxmlformats.org/officeDocument/2006/relationships" xmlns:m="http://schemas.openxmlformats.org/officeDocument/2006/math" xmlns:v="urn:schemas-microsoft-com:vml" xmlns:wp14="http://schemas.microsoft.com/office/word/2010/wordprocessingDrawing" xmlns:wp="http://schemas.openxmlformats.org/drawingml/2006/wordprocessingDrawing" xmlns:w10="urn:schemas-microsoft-com:office:word" xmlns:w="http://schemas.openxmlformats.org/wordprocessingml/2006/main" xmlns:w14="http://schemas.microsoft.com/office/word/2010/wordml" xmlns:w15="http://schemas.microsoft.com/office/word/2012/wordml" xmlns:w16cex="http://schemas.microsoft.com/office/word/2018/wordml/cex" xmlns:w16cid="http://schemas.microsoft.com/office/word/2016/wordml/cid" xmlns:w16="http://schemas.microsoft.com/office/word/2018/wordml" xmlns:w16du="http://schemas.microsoft.com/office/word/2023/wordml/word16du" xmlns:w16sdtdh="http://schemas.microsoft.com/office/word/2020/wordml/sdtdatahash" xmlns:w16sdtfl="http://schemas.microsoft.com/office/word/2024/wordml/sdtformatlock" xmlns:w16se="http://schemas.microsoft.com/office/word/2015/wordml/symex" xmlns:wpg="http://schemas.microsoft.com/office/word/2010/wordprocessingGroup" xmlns:wpi="http://schemas.microsoft.com/office/word/2010/wordprocessingInk" xmlns:wne="http://schemas.microsoft.com/office/word/2006/wordml" xmlns:wps="http://schemas.microsoft.com/office/word/2010/wordprocessingShape" mc:Ignorable="w14 w15 w16se w16cid w16 w16cex w16sdtdh w16sdtfl w16du wp14">
   <w:p>
     <w:pPr>
       <w:pStyle w:val="Piedepgina"/>
@@ -7060,7 +7060,7 @@
 </file>
 
 <file path=word/footer2.xml><?xml version="1.0" encoding="utf-8"?>
-<w:ftr xmlns:wpc="http://schemas.microsoft.com/office/word/2010/wordprocessingCanvas" xmlns:cx="http://schemas.microsoft.com/office/drawing/2014/chartex" xmlns:cx1="http://schemas.microsoft.com/office/drawing/2015/9/8/chartex" xmlns:cx2="http://schemas.microsoft.com/office/drawing/2015/10/21/chartex" xmlns:cx3="http://schemas.microsoft.com/office/drawing/2016/5/9/chartex" xmlns:cx4="http://schemas.microsoft.com/office/drawing/2016/5/10/chartex" xmlns:cx5="http://schemas.microsoft.com/office/drawing/2016/5/11/chartex" xmlns:cx6="http://schemas.microsoft.com/office/drawing/2016/5/12/chartex" xmlns:cx7="http://schemas.microsoft.com/office/drawing/2016/5/13/chartex" xmlns:cx8="http://schemas.microsoft.com/office/drawing/2016/5/14/chartex" xmlns:mc="http://schemas.openxmlformats.org/markup-compatibility/2006" xmlns:aink="http://schemas.microsoft.com/office/drawing/2016/ink" xmlns:am3d="http://schemas.microsoft.com/office/drawing/2017/model3d" xmlns:o="urn:schemas-microsoft-com:office:office" xmlns:oel="http://schemas.microsoft.com/office/2019/extlst" xmlns:r="http://schemas.openxmlformats.org/officeDocument/2006/relationships" xmlns:m="http://schemas.openxmlformats.org/officeDocument/2006/math" xmlns:v="urn:schemas-microsoft-com:vml" xmlns:wp14="http://schemas.microsoft.com/office/word/2010/wordprocessingDrawing" xmlns:wp="http://schemas.openxmlformats.org/drawingml/2006/wordprocessingDrawing" xmlns:w10="urn:schemas-microsoft-com:office:word" xmlns:w="http://schemas.openxmlformats.org/wordprocessingml/2006/main" xmlns:w14="http://schemas.microsoft.com/office/word/2010/wordml" xmlns:w15="http://schemas.microsoft.com/office/word/2012/wordml" xmlns:w16cei="http://schemas.microsoft.com/office/word/2026/wordml/cei" xmlns:w16cex="http://schemas.microsoft.com/office/word/2018/wordml/cex" xmlns:w16cid="http://schemas.microsoft.com/office/word/2016/wordml/cid" xmlns:w16="http://schemas.microsoft.com/office/word/2018/wordml" xmlns:w16du="http://schemas.microsoft.com/office/word/2023/wordml/word16du" xmlns:w16sdtdh="http://schemas.microsoft.com/office/word/2020/wordml/sdtdatahash" xmlns:w16sdtfl="http://schemas.microsoft.com/office/word/2024/wordml/sdtformatlock" xmlns:w16se="http://schemas.microsoft.com/office/word/2015/wordml/symex" xmlns:wpg="http://schemas.microsoft.com/office/word/2010/wordprocessingGroup" xmlns:wpi="http://schemas.microsoft.com/office/word/2010/wordprocessingInk" xmlns:wne="http://schemas.microsoft.com/office/word/2006/wordml" xmlns:wps="http://schemas.microsoft.com/office/word/2010/wordprocessingShape" mc:Ignorable="w14 w15 w16se w16cid w16 w16cex w16sdtdh w16sdtfl w16du wp14">
+<w:ftr xmlns:wpc="http://schemas.microsoft.com/office/word/2010/wordprocessingCanvas" xmlns:cx="http://schemas.microsoft.com/office/drawing/2014/chartex" xmlns:cx1="http://schemas.microsoft.com/office/drawing/2015/9/8/chartex" xmlns:cx2="http://schemas.microsoft.com/office/drawing/2015/10/21/chartex" xmlns:cx3="http://schemas.microsoft.com/office/drawing/2016/5/9/chartex" xmlns:cx4="http://schemas.microsoft.com/office/drawing/2016/5/10/chartex" xmlns:cx5="http://schemas.microsoft.com/office/drawing/2016/5/11/chartex" xmlns:cx6="http://schemas.microsoft.com/office/drawing/2016/5/12/chartex" xmlns:cx7="http://schemas.microsoft.com/office/drawing/2016/5/13/chartex" xmlns:cx8="http://schemas.microsoft.com/office/drawing/2016/5/14/chartex" xmlns:mc="http://schemas.openxmlformats.org/markup-compatibility/2006" xmlns:aink="http://schemas.microsoft.com/office/drawing/2016/ink" xmlns:am3d="http://schemas.microsoft.com/office/drawing/2017/model3d" xmlns:o="urn:schemas-microsoft-com:office:office" xmlns:oel="http://schemas.microsoft.com/office/2019/extlst" xmlns:r="http://schemas.openxmlformats.org/officeDocument/2006/relationships" xmlns:m="http://schemas.openxmlformats.org/officeDocument/2006/math" xmlns:v="urn:schemas-microsoft-com:vml" xmlns:wp14="http://schemas.microsoft.com/office/word/2010/wordprocessingDrawing" xmlns:wp="http://schemas.openxmlformats.org/drawingml/2006/wordprocessingDrawing" xmlns:w10="urn:schemas-microsoft-com:office:word" xmlns:w="http://schemas.openxmlformats.org/wordprocessingml/2006/main" xmlns:w14="http://schemas.microsoft.com/office/word/2010/wordml" xmlns:w15="http://schemas.microsoft.com/office/word/2012/wordml" xmlns:w16cex="http://schemas.microsoft.com/office/word/2018/wordml/cex" xmlns:w16cid="http://schemas.microsoft.com/office/word/2016/wordml/cid" xmlns:w16="http://schemas.microsoft.com/office/word/2018/wordml" xmlns:w16du="http://schemas.microsoft.com/office/word/2023/wordml/word16du" xmlns:w16sdtdh="http://schemas.microsoft.com/office/word/2020/wordml/sdtdatahash" xmlns:w16sdtfl="http://schemas.microsoft.com/office/word/2024/wordml/sdtformatlock" xmlns:w16se="http://schemas.microsoft.com/office/word/2015/wordml/symex" xmlns:wpg="http://schemas.microsoft.com/office/word/2010/wordprocessingGroup" xmlns:wpi="http://schemas.microsoft.com/office/word/2010/wordprocessingInk" xmlns:wne="http://schemas.microsoft.com/office/word/2006/wordml" xmlns:wps="http://schemas.microsoft.com/office/word/2010/wordprocessingShape" mc:Ignorable="w14 w15 w16se w16cid w16 w16cex w16sdtdh w16sdtfl w16du wp14">
   <w:p>
     <w:pPr>
       <w:tabs>
@@ -7080,7 +7080,7 @@
         <w:noProof/>
       </w:rPr>
       <w:drawing>
-        <wp:inline distT="0" distB="0" distL="0" distR="0" wp14:anchorId="7A6F76E4" wp14:editId="2130FE2B">
+        <wp:inline distT="0" distB="0" distL="0" distR="0" wp14:anchorId="4CE7B6EA" wp14:editId="706112A9">
           <wp:extent cx="576000" cy="459360"/>
           <wp:effectExtent l="0" t="0" r="0" b="0"/>
           <wp:docPr id="1" name="ARGOS framework mark" descr="ARGOS framework mark"/>
@@ -7233,7 +7233,7 @@
 </file>
 
 <file path=word/footer3.xml><?xml version="1.0" encoding="utf-8"?>
-<w:ftr xmlns:wpc="http://schemas.microsoft.com/office/word/2010/wordprocessingCanvas" xmlns:cx="http://schemas.microsoft.com/office/drawing/2014/chartex" xmlns:cx1="http://schemas.microsoft.com/office/drawing/2015/9/8/chartex" xmlns:cx2="http://schemas.microsoft.com/office/drawing/2015/10/21/chartex" xmlns:cx3="http://schemas.microsoft.com/office/drawing/2016/5/9/chartex" xmlns:cx4="http://schemas.microsoft.com/office/drawing/2016/5/10/chartex" xmlns:cx5="http://schemas.microsoft.com/office/drawing/2016/5/11/chartex" xmlns:cx6="http://schemas.microsoft.com/office/drawing/2016/5/12/chartex" xmlns:cx7="http://schemas.microsoft.com/office/drawing/2016/5/13/chartex" xmlns:cx8="http://schemas.microsoft.com/office/drawing/2016/5/14/chartex" xmlns:mc="http://schemas.openxmlformats.org/markup-compatibility/2006" xmlns:aink="http://schemas.microsoft.com/office/drawing/2016/ink" xmlns:am3d="http://schemas.microsoft.com/office/drawing/2017/model3d" xmlns:o="urn:schemas-microsoft-com:office:office" xmlns:oel="http://schemas.microsoft.com/office/2019/extlst" xmlns:r="http://schemas.openxmlformats.org/officeDocument/2006/relationships" xmlns:m="http://schemas.openxmlformats.org/officeDocument/2006/math" xmlns:v="urn:schemas-microsoft-com:vml" xmlns:wp14="http://schemas.microsoft.com/office/word/2010/wordprocessingDrawing" xmlns:wp="http://schemas.openxmlformats.org/drawingml/2006/wordprocessingDrawing" xmlns:w10="urn:schemas-microsoft-com:office:word" xmlns:w="http://schemas.openxmlformats.org/wordprocessingml/2006/main" xmlns:w14="http://schemas.microsoft.com/office/word/2010/wordml" xmlns:w15="http://schemas.microsoft.com/office/word/2012/wordml" xmlns:w16cei="http://schemas.microsoft.com/office/word/2026/wordml/cei" xmlns:w16cex="http://schemas.microsoft.com/office/word/2018/wordml/cex" xmlns:w16cid="http://schemas.microsoft.com/office/word/2016/wordml/cid" xmlns:w16="http://schemas.microsoft.com/office/word/2018/wordml" xmlns:w16du="http://schemas.microsoft.com/office/word/2023/wordml/word16du" xmlns:w16sdtdh="http://schemas.microsoft.com/office/word/2020/wordml/sdtdatahash" xmlns:w16sdtfl="http://schemas.microsoft.com/office/word/2024/wordml/sdtformatlock" xmlns:w16se="http://schemas.microsoft.com/office/word/2015/wordml/symex" xmlns:wpg="http://schemas.microsoft.com/office/word/2010/wordprocessingGroup" xmlns:wpi="http://schemas.microsoft.com/office/word/2010/wordprocessingInk" xmlns:wne="http://schemas.microsoft.com/office/word/2006/wordml" xmlns:wps="http://schemas.microsoft.com/office/word/2010/wordprocessingShape" mc:Ignorable="w14 w15 w16se w16cid w16 w16cex w16sdtdh w16sdtfl w16du wp14">
+<w:ftr xmlns:wpc="http://schemas.microsoft.com/office/word/2010/wordprocessingCanvas" xmlns:cx="http://schemas.microsoft.com/office/drawing/2014/chartex" xmlns:cx1="http://schemas.microsoft.com/office/drawing/2015/9/8/chartex" xmlns:cx2="http://schemas.microsoft.com/office/drawing/2015/10/21/chartex" xmlns:cx3="http://schemas.microsoft.com/office/drawing/2016/5/9/chartex" xmlns:cx4="http://schemas.microsoft.com/office/drawing/2016/5/10/chartex" xmlns:cx5="http://schemas.microsoft.com/office/drawing/2016/5/11/chartex" xmlns:cx6="http://schemas.microsoft.com/office/drawing/2016/5/12/chartex" xmlns:cx7="http://schemas.microsoft.com/office/drawing/2016/5/13/chartex" xmlns:cx8="http://schemas.microsoft.com/office/drawing/2016/5/14/chartex" xmlns:mc="http://schemas.openxmlformats.org/markup-compatibility/2006" xmlns:aink="http://schemas.microsoft.com/office/drawing/2016/ink" xmlns:am3d="http://schemas.microsoft.com/office/drawing/2017/model3d" xmlns:o="urn:schemas-microsoft-com:office:office" xmlns:oel="http://schemas.microsoft.com/office/2019/extlst" xmlns:r="http://schemas.openxmlformats.org/officeDocument/2006/relationships" xmlns:m="http://schemas.openxmlformats.org/officeDocument/2006/math" xmlns:v="urn:schemas-microsoft-com:vml" xmlns:wp14="http://schemas.microsoft.com/office/word/2010/wordprocessingDrawing" xmlns:wp="http://schemas.openxmlformats.org/drawingml/2006/wordprocessingDrawing" xmlns:w10="urn:schemas-microsoft-com:office:word" xmlns:w="http://schemas.openxmlformats.org/wordprocessingml/2006/main" xmlns:w14="http://schemas.microsoft.com/office/word/2010/wordml" xmlns:w15="http://schemas.microsoft.com/office/word/2012/wordml" xmlns:w16cex="http://schemas.microsoft.com/office/word/2018/wordml/cex" xmlns:w16cid="http://schemas.microsoft.com/office/word/2016/wordml/cid" xmlns:w16="http://schemas.microsoft.com/office/word/2018/wordml" xmlns:w16du="http://schemas.microsoft.com/office/word/2023/wordml/word16du" xmlns:w16sdtdh="http://schemas.microsoft.com/office/word/2020/wordml/sdtdatahash" xmlns:w16sdtfl="http://schemas.microsoft.com/office/word/2024/wordml/sdtformatlock" xmlns:w16se="http://schemas.microsoft.com/office/word/2015/wordml/symex" xmlns:wpg="http://schemas.microsoft.com/office/word/2010/wordprocessingGroup" xmlns:wpi="http://schemas.microsoft.com/office/word/2010/wordprocessingInk" xmlns:wne="http://schemas.microsoft.com/office/word/2006/wordml" xmlns:wps="http://schemas.microsoft.com/office/word/2010/wordprocessingShape" mc:Ignorable="w14 w15 w16se w16cid w16 w16cex w16sdtdh w16sdtfl w16du wp14">
   <w:p>
     <w:pPr>
       <w:pStyle w:val="Piedepgina"/>
@@ -7243,7 +7243,7 @@
 </file>
 
 <file path=word/footnotes.xml><?xml version="1.0" encoding="utf-8"?>
-<w:footnotes xmlns:wpc="http://schemas.microsoft.com/office/word/2010/wordprocessingCanvas" xmlns:cx="http://schemas.microsoft.com/office/drawing/2014/chartex" xmlns:cx1="http://schemas.microsoft.com/office/drawing/2015/9/8/chartex" xmlns:cx2="http://schemas.microsoft.com/office/drawing/2015/10/21/chartex" xmlns:cx3="http://schemas.microsoft.com/office/drawing/2016/5/9/chartex" xmlns:cx4="http://schemas.microsoft.com/office/drawing/2016/5/10/chartex" xmlns:cx5="http://schemas.microsoft.com/office/drawing/2016/5/11/chartex" xmlns:cx6="http://schemas.microsoft.com/office/drawing/2016/5/12/chartex" xmlns:cx7="http://schemas.microsoft.com/office/drawing/2016/5/13/chartex" xmlns:cx8="http://schemas.microsoft.com/office/drawing/2016/5/14/chartex" xmlns:mc="http://schemas.openxmlformats.org/markup-compatibility/2006" xmlns:aink="http://schemas.microsoft.com/office/drawing/2016/ink" xmlns:am3d="http://schemas.microsoft.com/office/drawing/2017/model3d" xmlns:o="urn:schemas-microsoft-com:office:office" xmlns:oel="http://schemas.microsoft.com/office/2019/extlst" xmlns:r="http://schemas.openxmlformats.org/officeDocument/2006/relationships" xmlns:m="http://schemas.openxmlformats.org/officeDocument/2006/math" xmlns:v="urn:schemas-microsoft-com:vml" xmlns:wp14="http://schemas.microsoft.com/office/word/2010/wordprocessingDrawing" xmlns:wp="http://schemas.openxmlformats.org/drawingml/2006/wordprocessingDrawing" xmlns:w10="urn:schemas-microsoft-com:office:word" xmlns:w="http://schemas.openxmlformats.org/wordprocessingml/2006/main" xmlns:w14="http://schemas.microsoft.com/office/word/2010/wordml" xmlns:w15="http://schemas.microsoft.com/office/word/2012/wordml" xmlns:w16cei="http://schemas.microsoft.com/office/word/2026/wordml/cei" xmlns:w16cex="http://schemas.microsoft.com/office/word/2018/wordml/cex" xmlns:w16cid="http://schemas.microsoft.com/office/word/2016/wordml/cid" xmlns:w16="http://schemas.microsoft.com/office/word/2018/wordml" xmlns:w16du="http://schemas.microsoft.com/office/word/2023/wordml/word16du" xmlns:w16sdtdh="http://schemas.microsoft.com/office/word/2020/wordml/sdtdatahash" xmlns:w16sdtfl="http://schemas.microsoft.com/office/word/2024/wordml/sdtformatlock" xmlns:w16se="http://schemas.microsoft.com/office/word/2015/wordml/symex" xmlns:wpg="http://schemas.microsoft.com/office/word/2010/wordprocessingGroup" xmlns:wpi="http://schemas.microsoft.com/office/word/2010/wordprocessingInk" xmlns:wne="http://schemas.microsoft.com/office/word/2006/wordml" xmlns:wps="http://schemas.microsoft.com/office/word/2010/wordprocessingShape" mc:Ignorable="w14 w15 w16se w16cid w16 w16cex w16sdtdh w16sdtfl w16du wp14">
+<w:footnotes xmlns:wpc="http://schemas.microsoft.com/office/word/2010/wordprocessingCanvas" xmlns:cx="http://schemas.microsoft.com/office/drawing/2014/chartex" xmlns:cx1="http://schemas.microsoft.com/office/drawing/2015/9/8/chartex" xmlns:cx2="http://schemas.microsoft.com/office/drawing/2015/10/21/chartex" xmlns:cx3="http://schemas.microsoft.com/office/drawing/2016/5/9/chartex" xmlns:cx4="http://schemas.microsoft.com/office/drawing/2016/5/10/chartex" xmlns:cx5="http://schemas.microsoft.com/office/drawing/2016/5/11/chartex" xmlns:cx6="http://schemas.microsoft.com/office/drawing/2016/5/12/chartex" xmlns:cx7="http://schemas.microsoft.com/office/drawing/2016/5/13/chartex" xmlns:cx8="http://schemas.microsoft.com/office/drawing/2016/5/14/chartex" xmlns:mc="http://schemas.openxmlformats.org/markup-compatibility/2006" xmlns:aink="http://schemas.microsoft.com/office/drawing/2016/ink" xmlns:am3d="http://schemas.microsoft.com/office/drawing/2017/model3d" xmlns:o="urn:schemas-microsoft-com:office:office" xmlns:oel="http://schemas.microsoft.com/office/2019/extlst" xmlns:r="http://schemas.openxmlformats.org/officeDocument/2006/relationships" xmlns:m="http://schemas.openxmlformats.org/officeDocument/2006/math" xmlns:v="urn:schemas-microsoft-com:vml" xmlns:wp14="http://schemas.microsoft.com/office/word/2010/wordprocessingDrawing" xmlns:wp="http://schemas.openxmlformats.org/drawingml/2006/wordprocessingDrawing" xmlns:w10="urn:schemas-microsoft-com:office:word" xmlns:w="http://schemas.openxmlformats.org/wordprocessingml/2006/main" xmlns:w14="http://schemas.microsoft.com/office/word/2010/wordml" xmlns:w15="http://schemas.microsoft.com/office/word/2012/wordml" xmlns:w16cex="http://schemas.microsoft.com/office/word/2018/wordml/cex" xmlns:w16cid="http://schemas.microsoft.com/office/word/2016/wordml/cid" xmlns:w16="http://schemas.microsoft.com/office/word/2018/wordml" xmlns:w16du="http://schemas.microsoft.com/office/word/2023/wordml/word16du" xmlns:w16sdtdh="http://schemas.microsoft.com/office/word/2020/wordml/sdtdatahash" xmlns:w16sdtfl="http://schemas.microsoft.com/office/word/2024/wordml/sdtformatlock" xmlns:w16se="http://schemas.microsoft.com/office/word/2015/wordml/symex" xmlns:wpg="http://schemas.microsoft.com/office/word/2010/wordprocessingGroup" xmlns:wpi="http://schemas.microsoft.com/office/word/2010/wordprocessingInk" xmlns:wne="http://schemas.microsoft.com/office/word/2006/wordml" xmlns:wps="http://schemas.microsoft.com/office/word/2010/wordprocessingShape" mc:Ignorable="w14 w15 w16se w16cid w16 w16cex w16sdtdh w16sdtfl w16du wp14">
   <w:footnote w:type="separator" w:id="-1">
     <w:p>
       <w:pPr>
@@ -7268,7 +7268,7 @@
 </file>
 
 <file path=word/header1.xml><?xml version="1.0" encoding="utf-8"?>
-<w:hdr xmlns:wpc="http://schemas.microsoft.com/office/word/2010/wordprocessingCanvas" xmlns:cx="http://schemas.microsoft.com/office/drawing/2014/chartex" xmlns:cx1="http://schemas.microsoft.com/office/drawing/2015/9/8/chartex" xmlns:cx2="http://schemas.microsoft.com/office/drawing/2015/10/21/chartex" xmlns:cx3="http://schemas.microsoft.com/office/drawing/2016/5/9/chartex" xmlns:cx4="http://schemas.microsoft.com/office/drawing/2016/5/10/chartex" xmlns:cx5="http://schemas.microsoft.com/office/drawing/2016/5/11/chartex" xmlns:cx6="http://schemas.microsoft.com/office/drawing/2016/5/12/chartex" xmlns:cx7="http://schemas.microsoft.com/office/drawing/2016/5/13/chartex" xmlns:cx8="http://schemas.microsoft.com/office/drawing/2016/5/14/chartex" xmlns:mc="http://schemas.openxmlformats.org/markup-compatibility/2006" xmlns:aink="http://schemas.microsoft.com/office/drawing/2016/ink" xmlns:am3d="http://schemas.microsoft.com/office/drawing/2017/model3d" xmlns:o="urn:schemas-microsoft-com:office:office" xmlns:oel="http://schemas.microsoft.com/office/2019/extlst" xmlns:r="http://schemas.openxmlformats.org/officeDocument/2006/relationships" xmlns:m="http://schemas.openxmlformats.org/officeDocument/2006/math" xmlns:v="urn:schemas-microsoft-com:vml" xmlns:wp14="http://schemas.microsoft.com/office/word/2010/wordprocessingDrawing" xmlns:wp="http://schemas.openxmlformats.org/drawingml/2006/wordprocessingDrawing" xmlns:w10="urn:schemas-microsoft-com:office:word" xmlns:w="http://schemas.openxmlformats.org/wordprocessingml/2006/main" xmlns:w14="http://schemas.microsoft.com/office/word/2010/wordml" xmlns:w15="http://schemas.microsoft.com/office/word/2012/wordml" xmlns:w16cei="http://schemas.microsoft.com/office/word/2026/wordml/cei" xmlns:w16cex="http://schemas.microsoft.com/office/word/2018/wordml/cex" xmlns:w16cid="http://schemas.microsoft.com/office/word/2016/wordml/cid" xmlns:w16="http://schemas.microsoft.com/office/word/2018/wordml" xmlns:w16du="http://schemas.microsoft.com/office/word/2023/wordml/word16du" xmlns:w16sdtdh="http://schemas.microsoft.com/office/word/2020/wordml/sdtdatahash" xmlns:w16sdtfl="http://schemas.microsoft.com/office/word/2024/wordml/sdtformatlock" xmlns:w16se="http://schemas.microsoft.com/office/word/2015/wordml/symex" xmlns:wpg="http://schemas.microsoft.com/office/word/2010/wordprocessingGroup" xmlns:wpi="http://schemas.microsoft.com/office/word/2010/wordprocessingInk" xmlns:wne="http://schemas.microsoft.com/office/word/2006/wordml" xmlns:wps="http://schemas.microsoft.com/office/word/2010/wordprocessingShape" mc:Ignorable="w14 w15 w16se w16cid w16 w16cex w16sdtdh w16sdtfl w16du wp14">
+<w:hdr xmlns:wpc="http://schemas.microsoft.com/office/word/2010/wordprocessingCanvas" xmlns:cx="http://schemas.microsoft.com/office/drawing/2014/chartex" xmlns:cx1="http://schemas.microsoft.com/office/drawing/2015/9/8/chartex" xmlns:cx2="http://schemas.microsoft.com/office/drawing/2015/10/21/chartex" xmlns:cx3="http://schemas.microsoft.com/office/drawing/2016/5/9/chartex" xmlns:cx4="http://schemas.microsoft.com/office/drawing/2016/5/10/chartex" xmlns:cx5="http://schemas.microsoft.com/office/drawing/2016/5/11/chartex" xmlns:cx6="http://schemas.microsoft.com/office/drawing/2016/5/12/chartex" xmlns:cx7="http://schemas.microsoft.com/office/drawing/2016/5/13/chartex" xmlns:cx8="http://schemas.microsoft.com/office/drawing/2016/5/14/chartex" xmlns:mc="http://schemas.openxmlformats.org/markup-compatibility/2006" xmlns:aink="http://schemas.microsoft.com/office/drawing/2016/ink" xmlns:am3d="http://schemas.microsoft.com/office/drawing/2017/model3d" xmlns:o="urn:schemas-microsoft-com:office:office" xmlns:oel="http://schemas.microsoft.com/office/2019/extlst" xmlns:r="http://schemas.openxmlformats.org/officeDocument/2006/relationships" xmlns:m="http://schemas.openxmlformats.org/officeDocument/2006/math" xmlns:v="urn:schemas-microsoft-com:vml" xmlns:wp14="http://schemas.microsoft.com/office/word/2010/wordprocessingDrawing" xmlns:wp="http://schemas.openxmlformats.org/drawingml/2006/wordprocessingDrawing" xmlns:w10="urn:schemas-microsoft-com:office:word" xmlns:w="http://schemas.openxmlformats.org/wordprocessingml/2006/main" xmlns:w14="http://schemas.microsoft.com/office/word/2010/wordml" xmlns:w15="http://schemas.microsoft.com/office/word/2012/wordml" xmlns:w16cex="http://schemas.microsoft.com/office/word/2018/wordml/cex" xmlns:w16cid="http://schemas.microsoft.com/office/word/2016/wordml/cid" xmlns:w16="http://schemas.microsoft.com/office/word/2018/wordml" xmlns:w16du="http://schemas.microsoft.com/office/word/2023/wordml/word16du" xmlns:w16sdtdh="http://schemas.microsoft.com/office/word/2020/wordml/sdtdatahash" xmlns:w16sdtfl="http://schemas.microsoft.com/office/word/2024/wordml/sdtformatlock" xmlns:w16se="http://schemas.microsoft.com/office/word/2015/wordml/symex" xmlns:wpg="http://schemas.microsoft.com/office/word/2010/wordprocessingGroup" xmlns:wpi="http://schemas.microsoft.com/office/word/2010/wordprocessingInk" xmlns:wne="http://schemas.microsoft.com/office/word/2006/wordml" xmlns:wps="http://schemas.microsoft.com/office/word/2010/wordprocessingShape" mc:Ignorable="w14 w15 w16se w16cid w16 w16cex w16sdtdh w16sdtfl w16du wp14">
   <w:p>
     <w:pPr>
       <w:pStyle w:val="Encabezado"/>
@@ -7342,7 +7342,7 @@
 </file>
 
 <file path=word/header2.xml><?xml version="1.0" encoding="utf-8"?>
-<w:hdr xmlns:wpc="http://schemas.microsoft.com/office/word/2010/wordprocessingCanvas" xmlns:cx="http://schemas.microsoft.com/office/drawing/2014/chartex" xmlns:cx1="http://schemas.microsoft.com/office/drawing/2015/9/8/chartex" xmlns:cx2="http://schemas.microsoft.com/office/drawing/2015/10/21/chartex" xmlns:cx3="http://schemas.microsoft.com/office/drawing/2016/5/9/chartex" xmlns:cx4="http://schemas.microsoft.com/office/drawing/2016/5/10/chartex" xmlns:cx5="http://schemas.microsoft.com/office/drawing/2016/5/11/chartex" xmlns:cx6="http://schemas.microsoft.com/office/drawing/2016/5/12/chartex" xmlns:cx7="http://schemas.microsoft.com/office/drawing/2016/5/13/chartex" xmlns:cx8="http://schemas.microsoft.com/office/drawing/2016/5/14/chartex" xmlns:mc="http://schemas.openxmlformats.org/markup-compatibility/2006" xmlns:aink="http://schemas.microsoft.com/office/drawing/2016/ink" xmlns:am3d="http://schemas.microsoft.com/office/drawing/2017/model3d" xmlns:o="urn:schemas-microsoft-com:office:office" xmlns:oel="http://schemas.microsoft.com/office/2019/extlst" xmlns:r="http://schemas.openxmlformats.org/officeDocument/2006/relationships" xmlns:m="http://schemas.openxmlformats.org/officeDocument/2006/math" xmlns:v="urn:schemas-microsoft-com:vml" xmlns:wp14="http://schemas.microsoft.com/office/word/2010/wordprocessingDrawing" xmlns:wp="http://schemas.openxmlformats.org/drawingml/2006/wordprocessingDrawing" xmlns:w10="urn:schemas-microsoft-com:office:word" xmlns:w="http://schemas.openxmlformats.org/wordprocessingml/2006/main" xmlns:w14="http://schemas.microsoft.com/office/word/2010/wordml" xmlns:w15="http://schemas.microsoft.com/office/word/2012/wordml" xmlns:w16cei="http://schemas.microsoft.com/office/word/2026/wordml/cei" xmlns:w16cex="http://schemas.microsoft.com/office/word/2018/wordml/cex" xmlns:w16cid="http://schemas.microsoft.com/office/word/2016/wordml/cid" xmlns:w16="http://schemas.microsoft.com/office/word/2018/wordml" xmlns:w16du="http://schemas.microsoft.com/office/word/2023/wordml/word16du" xmlns:w16sdtdh="http://schemas.microsoft.com/office/word/2020/wordml/sdtdatahash" xmlns:w16sdtfl="http://schemas.microsoft.com/office/word/2024/wordml/sdtformatlock" xmlns:w16se="http://schemas.microsoft.com/office/word/2015/wordml/symex" xmlns:wpg="http://schemas.microsoft.com/office/word/2010/wordprocessingGroup" xmlns:wpi="http://schemas.microsoft.com/office/word/2010/wordprocessingInk" xmlns:wne="http://schemas.microsoft.com/office/word/2006/wordml" xmlns:wps="http://schemas.microsoft.com/office/word/2010/wordprocessingShape" mc:Ignorable="w14 w15 w16se w16cid w16 w16cex w16sdtdh w16sdtfl w16du wp14">
+<w:hdr xmlns:wpc="http://schemas.microsoft.com/office/word/2010/wordprocessingCanvas" xmlns:cx="http://schemas.microsoft.com/office/drawing/2014/chartex" xmlns:cx1="http://schemas.microsoft.com/office/drawing/2015/9/8/chartex" xmlns:cx2="http://schemas.microsoft.com/office/drawing/2015/10/21/chartex" xmlns:cx3="http://schemas.microsoft.com/office/drawing/2016/5/9/chartex" xmlns:cx4="http://schemas.microsoft.com/office/drawing/2016/5/10/chartex" xmlns:cx5="http://schemas.microsoft.com/office/drawing/2016/5/11/chartex" xmlns:cx6="http://schemas.microsoft.com/office/drawing/2016/5/12/chartex" xmlns:cx7="http://schemas.microsoft.com/office/drawing/2016/5/13/chartex" xmlns:cx8="http://schemas.microsoft.com/office/drawing/2016/5/14/chartex" xmlns:mc="http://schemas.openxmlformats.org/markup-compatibility/2006" xmlns:aink="http://schemas.microsoft.com/office/drawing/2016/ink" xmlns:am3d="http://schemas.microsoft.com/office/drawing/2017/model3d" xmlns:o="urn:schemas-microsoft-com:office:office" xmlns:oel="http://schemas.microsoft.com/office/2019/extlst" xmlns:r="http://schemas.openxmlformats.org/officeDocument/2006/relationships" xmlns:m="http://schemas.openxmlformats.org/officeDocument/2006/math" xmlns:v="urn:schemas-microsoft-com:vml" xmlns:wp14="http://schemas.microsoft.com/office/word/2010/wordprocessingDrawing" xmlns:wp="http://schemas.openxmlformats.org/drawingml/2006/wordprocessingDrawing" xmlns:w10="urn:schemas-microsoft-com:office:word" xmlns:w="http://schemas.openxmlformats.org/wordprocessingml/2006/main" xmlns:w14="http://schemas.microsoft.com/office/word/2010/wordml" xmlns:w15="http://schemas.microsoft.com/office/word/2012/wordml" xmlns:w16cex="http://schemas.microsoft.com/office/word/2018/wordml/cex" xmlns:w16cid="http://schemas.microsoft.com/office/word/2016/wordml/cid" xmlns:w16="http://schemas.microsoft.com/office/word/2018/wordml" xmlns:w16du="http://schemas.microsoft.com/office/word/2023/wordml/word16du" xmlns:w16sdtdh="http://schemas.microsoft.com/office/word/2020/wordml/sdtdatahash" xmlns:w16sdtfl="http://schemas.microsoft.com/office/word/2024/wordml/sdtformatlock" xmlns:w16se="http://schemas.microsoft.com/office/word/2015/wordml/symex" xmlns:wpg="http://schemas.microsoft.com/office/word/2010/wordprocessingGroup" xmlns:wpi="http://schemas.microsoft.com/office/word/2010/wordprocessingInk" xmlns:wne="http://schemas.microsoft.com/office/word/2006/wordml" xmlns:wps="http://schemas.microsoft.com/office/word/2010/wordprocessingShape" mc:Ignorable="w14 w15 w16se w16cid w16 w16cex w16sdtdh w16sdtfl w16du wp14">
   <w:p>
     <w:pPr>
       <w:pStyle w:val="Encabezado"/>
@@ -7416,7 +7416,7 @@
 </file>
 
 <file path=word/header3.xml><?xml version="1.0" encoding="utf-8"?>
-<w:hdr xmlns:wpc="http://schemas.microsoft.com/office/word/2010/wordprocessingCanvas" xmlns:cx="http://schemas.microsoft.com/office/drawing/2014/chartex" xmlns:cx1="http://schemas.microsoft.com/office/drawing/2015/9/8/chartex" xmlns:cx2="http://schemas.microsoft.com/office/drawing/2015/10/21/chartex" xmlns:cx3="http://schemas.microsoft.com/office/drawing/2016/5/9/chartex" xmlns:cx4="http://schemas.microsoft.com/office/drawing/2016/5/10/chartex" xmlns:cx5="http://schemas.microsoft.com/office/drawing/2016/5/11/chartex" xmlns:cx6="http://schemas.microsoft.com/office/drawing/2016/5/12/chartex" xmlns:cx7="http://schemas.microsoft.com/office/drawing/2016/5/13/chartex" xmlns:cx8="http://schemas.microsoft.com/office/drawing/2016/5/14/chartex" xmlns:mc="http://schemas.openxmlformats.org/markup-compatibility/2006" xmlns:aink="http://schemas.microsoft.com/office/drawing/2016/ink" xmlns:am3d="http://schemas.microsoft.com/office/drawing/2017/model3d" xmlns:o="urn:schemas-microsoft-com:office:office" xmlns:oel="http://schemas.microsoft.com/office/2019/extlst" xmlns:r="http://schemas.openxmlformats.org/officeDocument/2006/relationships" xmlns:m="http://schemas.openxmlformats.org/officeDocument/2006/math" xmlns:v="urn:schemas-microsoft-com:vml" xmlns:wp14="http://schemas.microsoft.com/office/word/2010/wordprocessingDrawing" xmlns:wp="http://schemas.openxmlformats.org/drawingml/2006/wordprocessingDrawing" xmlns:w10="urn:schemas-microsoft-com:office:word" xmlns:w="http://schemas.openxmlformats.org/wordprocessingml/2006/main" xmlns:w14="http://schemas.microsoft.com/office/word/2010/wordml" xmlns:w15="http://schemas.microsoft.com/office/word/2012/wordml" xmlns:w16cei="http://schemas.microsoft.com/office/word/2026/wordml/cei" xmlns:w16cex="http://schemas.microsoft.com/office/word/2018/wordml/cex" xmlns:w16cid="http://schemas.microsoft.com/office/word/2016/wordml/cid" xmlns:w16="http://schemas.microsoft.com/office/word/2018/wordml" xmlns:w16du="http://schemas.microsoft.com/office/word/2023/wordml/word16du" xmlns:w16sdtdh="http://schemas.microsoft.com/office/word/2020/wordml/sdtdatahash" xmlns:w16sdtfl="http://schemas.microsoft.com/office/word/2024/wordml/sdtformatlock" xmlns:w16se="http://schemas.microsoft.com/office/word/2015/wordml/symex" xmlns:wpg="http://schemas.microsoft.com/office/word/2010/wordprocessingGroup" xmlns:wpi="http://schemas.microsoft.com/office/word/2010/wordprocessingInk" xmlns:wne="http://schemas.microsoft.com/office/word/2006/wordml" xmlns:wps="http://schemas.microsoft.com/office/word/2010/wordprocessingShape" mc:Ignorable="w14 w15 w16se w16cid w16 w16cex w16sdtdh w16sdtfl w16du wp14">
+<w:hdr xmlns:wpc="http://schemas.microsoft.com/office/word/2010/wordprocessingCanvas" xmlns:cx="http://schemas.microsoft.com/office/drawing/2014/chartex" xmlns:cx1="http://schemas.microsoft.com/office/drawing/2015/9/8/chartex" xmlns:cx2="http://schemas.microsoft.com/office/drawing/2015/10/21/chartex" xmlns:cx3="http://schemas.microsoft.com/office/drawing/2016/5/9/chartex" xmlns:cx4="http://schemas.microsoft.com/office/drawing/2016/5/10/chartex" xmlns:cx5="http://schemas.microsoft.com/office/drawing/2016/5/11/chartex" xmlns:cx6="http://schemas.microsoft.com/office/drawing/2016/5/12/chartex" xmlns:cx7="http://schemas.microsoft.com/office/drawing/2016/5/13/chartex" xmlns:cx8="http://schemas.microsoft.com/office/drawing/2016/5/14/chartex" xmlns:mc="http://schemas.openxmlformats.org/markup-compatibility/2006" xmlns:aink="http://schemas.microsoft.com/office/drawing/2016/ink" xmlns:am3d="http://schemas.microsoft.com/office/drawing/2017/model3d" xmlns:o="urn:schemas-microsoft-com:office:office" xmlns:oel="http://schemas.microsoft.com/office/2019/extlst" xmlns:r="http://schemas.openxmlformats.org/officeDocument/2006/relationships" xmlns:m="http://schemas.openxmlformats.org/officeDocument/2006/math" xmlns:v="urn:schemas-microsoft-com:vml" xmlns:wp14="http://schemas.microsoft.com/office/word/2010/wordprocessingDrawing" xmlns:wp="http://schemas.openxmlformats.org/drawingml/2006/wordprocessingDrawing" xmlns:w10="urn:schemas-microsoft-com:office:word" xmlns:w="http://schemas.openxmlformats.org/wordprocessingml/2006/main" xmlns:w14="http://schemas.microsoft.com/office/word/2010/wordml" xmlns:w15="http://schemas.microsoft.com/office/word/2012/wordml" xmlns:w16cex="http://schemas.microsoft.com/office/word/2018/wordml/cex" xmlns:w16cid="http://schemas.microsoft.com/office/word/2016/wordml/cid" xmlns:w16="http://schemas.microsoft.com/office/word/2018/wordml" xmlns:w16du="http://schemas.microsoft.com/office/word/2023/wordml/word16du" xmlns:w16sdtdh="http://schemas.microsoft.com/office/word/2020/wordml/sdtdatahash" xmlns:w16sdtfl="http://schemas.microsoft.com/office/word/2024/wordml/sdtformatlock" xmlns:w16se="http://schemas.microsoft.com/office/word/2015/wordml/symex" xmlns:wpg="http://schemas.microsoft.com/office/word/2010/wordprocessingGroup" xmlns:wpi="http://schemas.microsoft.com/office/word/2010/wordprocessingInk" xmlns:wne="http://schemas.microsoft.com/office/word/2006/wordml" xmlns:wps="http://schemas.microsoft.com/office/word/2010/wordprocessingShape" mc:Ignorable="w14 w15 w16se w16cid w16 w16cex w16sdtdh w16sdtfl w16du wp14">
   <w:p>
     <w:pPr>
       <w:pStyle w:val="Encabezado"/>
@@ -7490,10 +7490,10 @@
         <w:noProof/>
       </w:rPr>
       <w:drawing>
-        <wp:inline distT="0" distB="0" distL="0" distR="0" wp14:anchorId="6F937C7A" wp14:editId="081B51C1">
+        <wp:inline distT="0" distB="0" distL="0" distR="0" wp14:anchorId="5715CD90" wp14:editId="7A7BE400">
           <wp:extent cx="1512000" cy="1205820"/>
           <wp:effectExtent l="0" t="0" r="0" b="0"/>
-          <wp:docPr id="1835654990" name="ARGOS framework mark" descr="ARGOS framework mark"/>
+          <wp:docPr id="920686954" name="ARGOS framework mark" descr="ARGOS framework mark"/>
           <wp:cNvGraphicFramePr>
             <a:graphicFrameLocks xmlns:a="http://schemas.openxmlformats.org/drawingml/2006/main" noChangeAspect="1"/>
           </wp:cNvGraphicFramePr>
@@ -7530,7 +7530,7 @@
 </file>
 
 <file path=word/numbering.xml><?xml version="1.0" encoding="utf-8"?>
-<w:numbering xmlns:wpc="http://schemas.microsoft.com/office/word/2010/wordprocessingCanvas" xmlns:cx="http://schemas.microsoft.com/office/drawing/2014/chartex" xmlns:cx1="http://schemas.microsoft.com/office/drawing/2015/9/8/chartex" xmlns:cx2="http://schemas.microsoft.com/office/drawing/2015/10/21/chartex" xmlns:cx3="http://schemas.microsoft.com/office/drawing/2016/5/9/chartex" xmlns:cx4="http://schemas.microsoft.com/office/drawing/2016/5/10/chartex" xmlns:cx5="http://schemas.microsoft.com/office/drawing/2016/5/11/chartex" xmlns:cx6="http://schemas.microsoft.com/office/drawing/2016/5/12/chartex" xmlns:cx7="http://schemas.microsoft.com/office/drawing/2016/5/13/chartex" xmlns:cx8="http://schemas.microsoft.com/office/drawing/2016/5/14/chartex" xmlns:mc="http://schemas.openxmlformats.org/markup-compatibility/2006" xmlns:aink="http://schemas.microsoft.com/office/drawing/2016/ink" xmlns:am3d="http://schemas.microsoft.com/office/drawing/2017/model3d" xmlns:o="urn:schemas-microsoft-com:office:office" xmlns:oel="http://schemas.microsoft.com/office/2019/extlst" xmlns:r="http://schemas.openxmlformats.org/officeDocument/2006/relationships" xmlns:m="http://schemas.openxmlformats.org/officeDocument/2006/math" xmlns:v="urn:schemas-microsoft-com:vml" xmlns:wp14="http://schemas.microsoft.com/office/word/2010/wordprocessingDrawing" xmlns:wp="http://schemas.openxmlformats.org/drawingml/2006/wordprocessingDrawing" xmlns:w10="urn:schemas-microsoft-com:office:word" xmlns:w="http://schemas.openxmlformats.org/wordprocessingml/2006/main" xmlns:w14="http://schemas.microsoft.com/office/word/2010/wordml" xmlns:w15="http://schemas.microsoft.com/office/word/2012/wordml" xmlns:w16cei="http://schemas.microsoft.com/office/word/2026/wordml/cei" xmlns:w16cex="http://schemas.microsoft.com/office/word/2018/wordml/cex" xmlns:w16cid="http://schemas.microsoft.com/office/word/2016/wordml/cid" xmlns:w16="http://schemas.microsoft.com/office/word/2018/wordml" xmlns:w16du="http://schemas.microsoft.com/office/word/2023/wordml/word16du" xmlns:w16sdtdh="http://schemas.microsoft.com/office/word/2020/wordml/sdtdatahash" xmlns:w16sdtfl="http://schemas.microsoft.com/office/word/2024/wordml/sdtformatlock" xmlns:w16se="http://schemas.microsoft.com/office/word/2015/wordml/symex" xmlns:wpg="http://schemas.microsoft.com/office/word/2010/wordprocessingGroup" xmlns:wpi="http://schemas.microsoft.com/office/word/2010/wordprocessingInk" xmlns:wne="http://schemas.microsoft.com/office/word/2006/wordml" xmlns:wps="http://schemas.microsoft.com/office/word/2010/wordprocessingShape" mc:Ignorable="w14 w15 w16se w16cid w16 w16cex w16sdtdh w16sdtfl w16du wp14">
+<w:numbering xmlns:wpc="http://schemas.microsoft.com/office/word/2010/wordprocessingCanvas" xmlns:cx="http://schemas.microsoft.com/office/drawing/2014/chartex" xmlns:cx1="http://schemas.microsoft.com/office/drawing/2015/9/8/chartex" xmlns:cx2="http://schemas.microsoft.com/office/drawing/2015/10/21/chartex" xmlns:cx3="http://schemas.microsoft.com/office/drawing/2016/5/9/chartex" xmlns:cx4="http://schemas.microsoft.com/office/drawing/2016/5/10/chartex" xmlns:cx5="http://schemas.microsoft.com/office/drawing/2016/5/11/chartex" xmlns:cx6="http://schemas.microsoft.com/office/drawing/2016/5/12/chartex" xmlns:cx7="http://schemas.microsoft.com/office/drawing/2016/5/13/chartex" xmlns:cx8="http://schemas.microsoft.com/office/drawing/2016/5/14/chartex" xmlns:mc="http://schemas.openxmlformats.org/markup-compatibility/2006" xmlns:aink="http://schemas.microsoft.com/office/drawing/2016/ink" xmlns:am3d="http://schemas.microsoft.com/office/drawing/2017/model3d" xmlns:o="urn:schemas-microsoft-com:office:office" xmlns:oel="http://schemas.microsoft.com/office/2019/extlst" xmlns:r="http://schemas.openxmlformats.org/officeDocument/2006/relationships" xmlns:m="http://schemas.openxmlformats.org/officeDocument/2006/math" xmlns:v="urn:schemas-microsoft-com:vml" xmlns:wp14="http://schemas.microsoft.com/office/word/2010/wordprocessingDrawing" xmlns:wp="http://schemas.openxmlformats.org/drawingml/2006/wordprocessingDrawing" xmlns:w10="urn:schemas-microsoft-com:office:word" xmlns:w="http://schemas.openxmlformats.org/wordprocessingml/2006/main" xmlns:w14="http://schemas.microsoft.com/office/word/2010/wordml" xmlns:w15="http://schemas.microsoft.com/office/word/2012/wordml" xmlns:w16cex="http://schemas.microsoft.com/office/word/2018/wordml/cex" xmlns:w16cid="http://schemas.microsoft.com/office/word/2016/wordml/cid" xmlns:w16="http://schemas.microsoft.com/office/word/2018/wordml" xmlns:w16du="http://schemas.microsoft.com/office/word/2023/wordml/word16du" xmlns:w16sdtdh="http://schemas.microsoft.com/office/word/2020/wordml/sdtdatahash" xmlns:w16sdtfl="http://schemas.microsoft.com/office/word/2024/wordml/sdtformatlock" xmlns:w16se="http://schemas.microsoft.com/office/word/2015/wordml/symex" xmlns:wpg="http://schemas.microsoft.com/office/word/2010/wordprocessingGroup" xmlns:wpi="http://schemas.microsoft.com/office/word/2010/wordprocessingInk" xmlns:wne="http://schemas.microsoft.com/office/word/2006/wordml" xmlns:wps="http://schemas.microsoft.com/office/word/2010/wordprocessingShape" mc:Ignorable="w14 w15 w16se w16cid w16 w16cex w16sdtdh w16sdtfl w16du wp14">
   <w:abstractNum w:abstractNumId="0" w15:restartNumberingAfterBreak="0">
     <w:nsid w:val="0E6D0E96"/>
     <w:multiLevelType w:val="hybridMultilevel"/>
@@ -10466,19 +10466,19 @@
   <w:num w:numId="26" w16cid:durableId="846600881">
     <w:abstractNumId w:val="20"/>
   </w:num>
-  <w:num w:numId="27" w16cid:durableId="1852328186">
+  <w:num w:numId="27" w16cid:durableId="526793273">
     <w:abstractNumId w:val="0"/>
   </w:num>
-  <w:num w:numId="28" w16cid:durableId="67702676">
+  <w:num w:numId="28" w16cid:durableId="1982925068">
     <w:abstractNumId w:val="0"/>
   </w:num>
-  <w:num w:numId="29" w16cid:durableId="396437903">
+  <w:num w:numId="29" w16cid:durableId="2122411562">
     <w:abstractNumId w:val="6"/>
   </w:num>
-  <w:num w:numId="30" w16cid:durableId="623969475">
+  <w:num w:numId="30" w16cid:durableId="686834139">
     <w:abstractNumId w:val="0"/>
   </w:num>
-  <w:num w:numId="31" w16cid:durableId="1766226832">
+  <w:num w:numId="31" w16cid:durableId="1775710970">
     <w:abstractNumId w:val="0"/>
   </w:num>
 </w:numbering>

</xml_diff>

<commit_message>
Big step forward again in VICII. Improved the VICII pipeline. VICII does things always in phi 1, but when CPU can act in phi2 the outcome might affect phi2 drawing effects (among others). So the drawing pipeline has been divided in 2: phi1 y phi2.
</commit_message>
<xml_diff>
--- a/docs/C264Data/C264_DEBUG_File_Format.docx
+++ b/docs/C264Data/C264_DEBUG_File_Format.docx
@@ -561,9 +561,8 @@
       <w:pPr>
         <w:pStyle w:val="Ttulo1"/>
       </w:pPr>
-      <w:bookmarkStart w:id="0" w:name="_Toc238462295"/>
-      <w:r>
-        <w:lastRenderedPageBreak/>
+      <w:bookmarkStart w:id="0" w:name="_Toc238706963"/>
+      <w:r>
         <w:t>Contents</w:t>
       </w:r>
       <w:bookmarkEnd w:id="0"/>
@@ -596,7 +595,7 @@
       <w:r>
         <w:fldChar w:fldCharType="separate"/>
       </w:r>
-      <w:hyperlink w:anchor="_Toc238462295" w:history="1">
+      <w:hyperlink w:anchor="_Toc238706963" w:history="1">
         <w:r>
           <w:rPr>
             <w:rStyle w:val="Hipervnculo"/>
@@ -623,7 +622,7 @@
             <w:noProof/>
             <w:webHidden/>
           </w:rPr>
-          <w:instrText xml:space="preserve"> PAGEREF _Toc238462295 \h </w:instrText>
+          <w:instrText xml:space="preserve"> PAGEREF _Toc238706963 \h </w:instrText>
         </w:r>
         <w:r>
           <w:rPr>
@@ -674,7 +673,7 @@
           <w14:ligatures w14:val="standardContextual"/>
         </w:rPr>
       </w:pPr>
-      <w:hyperlink w:anchor="_Toc238462296" w:history="1">
+      <w:hyperlink w:anchor="_Toc238706964" w:history="1">
         <w:r>
           <w:rPr>
             <w:rStyle w:val="Hipervnculo"/>
@@ -701,7 +700,7 @@
             <w:noProof/>
             <w:webHidden/>
           </w:rPr>
-          <w:instrText xml:space="preserve"> PAGEREF _Toc238462296 \h </w:instrText>
+          <w:instrText xml:space="preserve"> PAGEREF _Toc238706964 \h </w:instrText>
         </w:r>
         <w:r>
           <w:rPr>
@@ -752,7 +751,7 @@
           <w14:ligatures w14:val="standardContextual"/>
         </w:rPr>
       </w:pPr>
-      <w:hyperlink w:anchor="_Toc238462297" w:history="1">
+      <w:hyperlink w:anchor="_Toc238706965" w:history="1">
         <w:r>
           <w:rPr>
             <w:rStyle w:val="Hipervnculo"/>
@@ -779,7 +778,7 @@
             <w:noProof/>
             <w:webHidden/>
           </w:rPr>
-          <w:instrText xml:space="preserve"> PAGEREF _Toc238462297 \h </w:instrText>
+          <w:instrText xml:space="preserve"> PAGEREF _Toc238706965 \h </w:instrText>
         </w:r>
         <w:r>
           <w:rPr>
@@ -829,7 +828,7 @@
           <w14:ligatures w14:val="standardContextual"/>
         </w:rPr>
       </w:pPr>
-      <w:hyperlink w:anchor="_Toc238462298" w:history="1">
+      <w:hyperlink w:anchor="_Toc238706966" w:history="1">
         <w:r>
           <w:rPr>
             <w:rStyle w:val="Hipervnculo"/>
@@ -856,7 +855,7 @@
             <w:noProof/>
             <w:webHidden/>
           </w:rPr>
-          <w:instrText xml:space="preserve"> PAGEREF _Toc238462298 \h </w:instrText>
+          <w:instrText xml:space="preserve"> PAGEREF _Toc238706966 \h </w:instrText>
         </w:r>
         <w:r>
           <w:rPr>
@@ -907,7 +906,7 @@
           <w14:ligatures w14:val="standardContextual"/>
         </w:rPr>
       </w:pPr>
-      <w:hyperlink w:anchor="_Toc238462299" w:history="1">
+      <w:hyperlink w:anchor="_Toc238706967" w:history="1">
         <w:r>
           <w:rPr>
             <w:rStyle w:val="Hipervnculo"/>
@@ -934,7 +933,7 @@
             <w:noProof/>
             <w:webHidden/>
           </w:rPr>
-          <w:instrText xml:space="preserve"> PAGEREF _Toc238462299 \h </w:instrText>
+          <w:instrText xml:space="preserve"> PAGEREF _Toc238706967 \h </w:instrText>
         </w:r>
         <w:r>
           <w:rPr>
@@ -984,7 +983,7 @@
           <w14:ligatures w14:val="standardContextual"/>
         </w:rPr>
       </w:pPr>
-      <w:hyperlink w:anchor="_Toc238462300" w:history="1">
+      <w:hyperlink w:anchor="_Toc238706968" w:history="1">
         <w:r>
           <w:rPr>
             <w:rStyle w:val="Hipervnculo"/>
@@ -1011,7 +1010,7 @@
             <w:noProof/>
             <w:webHidden/>
           </w:rPr>
-          <w:instrText xml:space="preserve"> PAGEREF _Toc238462300 \h </w:instrText>
+          <w:instrText xml:space="preserve"> PAGEREF _Toc238706968 \h </w:instrText>
         </w:r>
         <w:r>
           <w:rPr>
@@ -1061,7 +1060,7 @@
           <w14:ligatures w14:val="standardContextual"/>
         </w:rPr>
       </w:pPr>
-      <w:hyperlink w:anchor="_Toc238462301" w:history="1">
+      <w:hyperlink w:anchor="_Toc238706969" w:history="1">
         <w:r>
           <w:rPr>
             <w:rStyle w:val="Hipervnculo"/>
@@ -1088,7 +1087,7 @@
             <w:noProof/>
             <w:webHidden/>
           </w:rPr>
-          <w:instrText xml:space="preserve"> PAGEREF _Toc238462301 \h </w:instrText>
+          <w:instrText xml:space="preserve"> PAGEREF _Toc238706969 \h </w:instrText>
         </w:r>
         <w:r>
           <w:rPr>
@@ -1139,7 +1138,7 @@
           <w14:ligatures w14:val="standardContextual"/>
         </w:rPr>
       </w:pPr>
-      <w:hyperlink w:anchor="_Toc238462302" w:history="1">
+      <w:hyperlink w:anchor="_Toc238706970" w:history="1">
         <w:r>
           <w:rPr>
             <w:rStyle w:val="Hipervnculo"/>
@@ -1166,7 +1165,7 @@
             <w:noProof/>
             <w:webHidden/>
           </w:rPr>
-          <w:instrText xml:space="preserve"> PAGEREF _Toc238462302 \h </w:instrText>
+          <w:instrText xml:space="preserve"> PAGEREF _Toc238706970 \h </w:instrText>
         </w:r>
         <w:r>
           <w:rPr>
@@ -1216,7 +1215,7 @@
           <w14:ligatures w14:val="standardContextual"/>
         </w:rPr>
       </w:pPr>
-      <w:hyperlink w:anchor="_Toc238462303" w:history="1">
+      <w:hyperlink w:anchor="_Toc238706971" w:history="1">
         <w:r>
           <w:rPr>
             <w:rStyle w:val="Hipervnculo"/>
@@ -1243,7 +1242,7 @@
             <w:noProof/>
             <w:webHidden/>
           </w:rPr>
-          <w:instrText xml:space="preserve"> PAGEREF _Toc238462303 \h </w:instrText>
+          <w:instrText xml:space="preserve"> PAGEREF _Toc238706971 \h </w:instrText>
         </w:r>
         <w:r>
           <w:rPr>
@@ -1293,7 +1292,7 @@
           <w14:ligatures w14:val="standardContextual"/>
         </w:rPr>
       </w:pPr>
-      <w:hyperlink w:anchor="_Toc238462304" w:history="1">
+      <w:hyperlink w:anchor="_Toc238706972" w:history="1">
         <w:r>
           <w:rPr>
             <w:rStyle w:val="Hipervnculo"/>
@@ -1320,7 +1319,7 @@
             <w:noProof/>
             <w:webHidden/>
           </w:rPr>
-          <w:instrText xml:space="preserve"> PAGEREF _Toc238462304 \h </w:instrText>
+          <w:instrText xml:space="preserve"> PAGEREF _Toc238706972 \h </w:instrText>
         </w:r>
         <w:r>
           <w:rPr>
@@ -1371,7 +1370,7 @@
           <w14:ligatures w14:val="standardContextual"/>
         </w:rPr>
       </w:pPr>
-      <w:hyperlink w:anchor="_Toc238462305" w:history="1">
+      <w:hyperlink w:anchor="_Toc238706973" w:history="1">
         <w:r>
           <w:rPr>
             <w:rStyle w:val="Hipervnculo"/>
@@ -1398,7 +1397,7 @@
             <w:noProof/>
             <w:webHidden/>
           </w:rPr>
-          <w:instrText xml:space="preserve"> PAGEREF _Toc238462305 \h </w:instrText>
+          <w:instrText xml:space="preserve"> PAGEREF _Toc238706973 \h </w:instrText>
         </w:r>
         <w:r>
           <w:rPr>
@@ -1448,7 +1447,7 @@
           <w14:ligatures w14:val="standardContextual"/>
         </w:rPr>
       </w:pPr>
-      <w:hyperlink w:anchor="_Toc238462306" w:history="1">
+      <w:hyperlink w:anchor="_Toc238706974" w:history="1">
         <w:r>
           <w:rPr>
             <w:rStyle w:val="Hipervnculo"/>
@@ -1475,7 +1474,7 @@
             <w:noProof/>
             <w:webHidden/>
           </w:rPr>
-          <w:instrText xml:space="preserve"> PAGEREF _Toc238462306 \h </w:instrText>
+          <w:instrText xml:space="preserve"> PAGEREF _Toc238706974 \h </w:instrText>
         </w:r>
         <w:r>
           <w:rPr>
@@ -1525,7 +1524,7 @@
           <w14:ligatures w14:val="standardContextual"/>
         </w:rPr>
       </w:pPr>
-      <w:hyperlink w:anchor="_Toc238462307" w:history="1">
+      <w:hyperlink w:anchor="_Toc238706975" w:history="1">
         <w:r>
           <w:rPr>
             <w:rStyle w:val="Hipervnculo"/>
@@ -1552,7 +1551,7 @@
             <w:noProof/>
             <w:webHidden/>
           </w:rPr>
-          <w:instrText xml:space="preserve"> PAGEREF _Toc238462307 \h </w:instrText>
+          <w:instrText xml:space="preserve"> PAGEREF _Toc238706975 \h </w:instrText>
         </w:r>
         <w:r>
           <w:rPr>
@@ -1602,7 +1601,7 @@
           <w14:ligatures w14:val="standardContextual"/>
         </w:rPr>
       </w:pPr>
-      <w:hyperlink w:anchor="_Toc238462308" w:history="1">
+      <w:hyperlink w:anchor="_Toc238706976" w:history="1">
         <w:r>
           <w:rPr>
             <w:rStyle w:val="Hipervnculo"/>
@@ -1629,7 +1628,7 @@
             <w:noProof/>
             <w:webHidden/>
           </w:rPr>
-          <w:instrText xml:space="preserve"> PAGEREF _Toc238462308 \h </w:instrText>
+          <w:instrText xml:space="preserve"> PAGEREF _Toc238706976 \h </w:instrText>
         </w:r>
         <w:r>
           <w:rPr>
@@ -1679,7 +1678,7 @@
           <w14:ligatures w14:val="standardContextual"/>
         </w:rPr>
       </w:pPr>
-      <w:hyperlink w:anchor="_Toc238462309" w:history="1">
+      <w:hyperlink w:anchor="_Toc238706977" w:history="1">
         <w:r>
           <w:rPr>
             <w:rStyle w:val="Hipervnculo"/>
@@ -1706,7 +1705,7 @@
             <w:noProof/>
             <w:webHidden/>
           </w:rPr>
-          <w:instrText xml:space="preserve"> PAGEREF _Toc238462309 \h </w:instrText>
+          <w:instrText xml:space="preserve"> PAGEREF _Toc238706977 \h </w:instrText>
         </w:r>
         <w:r>
           <w:rPr>
@@ -1756,7 +1755,7 @@
           <w14:ligatures w14:val="standardContextual"/>
         </w:rPr>
       </w:pPr>
-      <w:hyperlink w:anchor="_Toc238462310" w:history="1">
+      <w:hyperlink w:anchor="_Toc238706978" w:history="1">
         <w:r>
           <w:rPr>
             <w:rStyle w:val="Hipervnculo"/>
@@ -1783,7 +1782,7 @@
             <w:noProof/>
             <w:webHidden/>
           </w:rPr>
-          <w:instrText xml:space="preserve"> PAGEREF _Toc238462310 \h </w:instrText>
+          <w:instrText xml:space="preserve"> PAGEREF _Toc238706978 \h </w:instrText>
         </w:r>
         <w:r>
           <w:rPr>
@@ -1833,7 +1832,7 @@
           <w14:ligatures w14:val="standardContextual"/>
         </w:rPr>
       </w:pPr>
-      <w:hyperlink w:anchor="_Toc238462311" w:history="1">
+      <w:hyperlink w:anchor="_Toc238706979" w:history="1">
         <w:r>
           <w:rPr>
             <w:rStyle w:val="Hipervnculo"/>
@@ -1860,7 +1859,7 @@
             <w:noProof/>
             <w:webHidden/>
           </w:rPr>
-          <w:instrText xml:space="preserve"> PAGEREF _Toc238462311 \h </w:instrText>
+          <w:instrText xml:space="preserve"> PAGEREF _Toc238706979 \h </w:instrText>
         </w:r>
         <w:r>
           <w:rPr>
@@ -1911,7 +1910,7 @@
           <w14:ligatures w14:val="standardContextual"/>
         </w:rPr>
       </w:pPr>
-      <w:hyperlink w:anchor="_Toc238462312" w:history="1">
+      <w:hyperlink w:anchor="_Toc238706980" w:history="1">
         <w:r>
           <w:rPr>
             <w:rStyle w:val="Hipervnculo"/>
@@ -1938,7 +1937,7 @@
             <w:noProof/>
             <w:webHidden/>
           </w:rPr>
-          <w:instrText xml:space="preserve"> PAGEREF _Toc238462312 \h </w:instrText>
+          <w:instrText xml:space="preserve"> PAGEREF _Toc238706980 \h </w:instrText>
         </w:r>
         <w:r>
           <w:rPr>
@@ -1988,7 +1987,7 @@
           <w14:ligatures w14:val="standardContextual"/>
         </w:rPr>
       </w:pPr>
-      <w:hyperlink w:anchor="_Toc238462313" w:history="1">
+      <w:hyperlink w:anchor="_Toc238706981" w:history="1">
         <w:r>
           <w:rPr>
             <w:rStyle w:val="Hipervnculo"/>
@@ -2015,7 +2014,7 @@
             <w:noProof/>
             <w:webHidden/>
           </w:rPr>
-          <w:instrText xml:space="preserve"> PAGEREF _Toc238462313 \h </w:instrText>
+          <w:instrText xml:space="preserve"> PAGEREF _Toc238706981 \h </w:instrText>
         </w:r>
         <w:r>
           <w:rPr>
@@ -2065,7 +2064,7 @@
           <w14:ligatures w14:val="standardContextual"/>
         </w:rPr>
       </w:pPr>
-      <w:hyperlink w:anchor="_Toc238462314" w:history="1">
+      <w:hyperlink w:anchor="_Toc238706982" w:history="1">
         <w:r>
           <w:rPr>
             <w:rStyle w:val="Hipervnculo"/>
@@ -2092,7 +2091,7 @@
             <w:noProof/>
             <w:webHidden/>
           </w:rPr>
-          <w:instrText xml:space="preserve"> PAGEREF _Toc238462314 \h </w:instrText>
+          <w:instrText xml:space="preserve"> PAGEREF _Toc238706982 \h </w:instrText>
         </w:r>
         <w:r>
           <w:rPr>
@@ -2140,7 +2139,7 @@
           <w14:ligatures w14:val="standardContextual"/>
         </w:rPr>
       </w:pPr>
-      <w:hyperlink w:anchor="_Toc238462315" w:history="1">
+      <w:hyperlink w:anchor="_Toc238706983" w:history="1">
         <w:r>
           <w:rPr>
             <w:rStyle w:val="Hipervnculo"/>
@@ -2167,7 +2166,7 @@
             <w:noProof/>
             <w:webHidden/>
           </w:rPr>
-          <w:instrText xml:space="preserve"> PAGEREF _Toc238462315 \h </w:instrText>
+          <w:instrText xml:space="preserve"> PAGEREF _Toc238706983 \h </w:instrText>
         </w:r>
         <w:r>
           <w:rPr>
@@ -2215,7 +2214,7 @@
           <w14:ligatures w14:val="standardContextual"/>
         </w:rPr>
       </w:pPr>
-      <w:hyperlink w:anchor="_Toc238462316" w:history="1">
+      <w:hyperlink w:anchor="_Toc238706984" w:history="1">
         <w:r>
           <w:rPr>
             <w:rStyle w:val="Hipervnculo"/>
@@ -2242,7 +2241,7 @@
             <w:noProof/>
             <w:webHidden/>
           </w:rPr>
-          <w:instrText xml:space="preserve"> PAGEREF _Toc238462316 \h </w:instrText>
+          <w:instrText xml:space="preserve"> PAGEREF _Toc238706984 \h </w:instrText>
         </w:r>
         <w:r>
           <w:rPr>
@@ -2290,7 +2289,7 @@
           <w14:ligatures w14:val="standardContextual"/>
         </w:rPr>
       </w:pPr>
-      <w:hyperlink w:anchor="_Toc238462317" w:history="1">
+      <w:hyperlink w:anchor="_Toc238706985" w:history="1">
         <w:r>
           <w:rPr>
             <w:rStyle w:val="Hipervnculo"/>
@@ -2317,7 +2316,7 @@
             <w:noProof/>
             <w:webHidden/>
           </w:rPr>
-          <w:instrText xml:space="preserve"> PAGEREF _Toc238462317 \h </w:instrText>
+          <w:instrText xml:space="preserve"> PAGEREF _Toc238706985 \h </w:instrText>
         </w:r>
         <w:r>
           <w:rPr>
@@ -2365,7 +2364,7 @@
           <w14:ligatures w14:val="standardContextual"/>
         </w:rPr>
       </w:pPr>
-      <w:hyperlink w:anchor="_Toc238462318" w:history="1">
+      <w:hyperlink w:anchor="_Toc238706986" w:history="1">
         <w:r>
           <w:rPr>
             <w:rStyle w:val="Hipervnculo"/>
@@ -2392,7 +2391,7 @@
             <w:noProof/>
             <w:webHidden/>
           </w:rPr>
-          <w:instrText xml:space="preserve"> PAGEREF _Toc238462318 \h </w:instrText>
+          <w:instrText xml:space="preserve"> PAGEREF _Toc238706986 \h </w:instrText>
         </w:r>
         <w:r>
           <w:rPr>
@@ -2440,7 +2439,7 @@
           <w14:ligatures w14:val="standardContextual"/>
         </w:rPr>
       </w:pPr>
-      <w:hyperlink w:anchor="_Toc238462319" w:history="1">
+      <w:hyperlink w:anchor="_Toc238706987" w:history="1">
         <w:r>
           <w:rPr>
             <w:rStyle w:val="Hipervnculo"/>
@@ -2467,7 +2466,7 @@
             <w:noProof/>
             <w:webHidden/>
           </w:rPr>
-          <w:instrText xml:space="preserve"> PAGEREF _Toc238462319 \h </w:instrText>
+          <w:instrText xml:space="preserve"> PAGEREF _Toc238706987 \h </w:instrText>
         </w:r>
         <w:r>
           <w:rPr>
@@ -2518,7 +2517,7 @@
           <w14:ligatures w14:val="standardContextual"/>
         </w:rPr>
       </w:pPr>
-      <w:hyperlink w:anchor="_Toc238462320" w:history="1">
+      <w:hyperlink w:anchor="_Toc238706988" w:history="1">
         <w:r>
           <w:rPr>
             <w:rStyle w:val="Hipervnculo"/>
@@ -2545,7 +2544,7 @@
             <w:noProof/>
             <w:webHidden/>
           </w:rPr>
-          <w:instrText xml:space="preserve"> PAGEREF _Toc238462320 \h </w:instrText>
+          <w:instrText xml:space="preserve"> PAGEREF _Toc238706988 \h </w:instrText>
         </w:r>
         <w:r>
           <w:rPr>
@@ -2595,7 +2594,7 @@
           <w14:ligatures w14:val="standardContextual"/>
         </w:rPr>
       </w:pPr>
-      <w:hyperlink w:anchor="_Toc238462321" w:history="1">
+      <w:hyperlink w:anchor="_Toc238706989" w:history="1">
         <w:r>
           <w:rPr>
             <w:rStyle w:val="Hipervnculo"/>
@@ -2622,7 +2621,7 @@
             <w:noProof/>
             <w:webHidden/>
           </w:rPr>
-          <w:instrText xml:space="preserve"> PAGEREF _Toc238462321 \h </w:instrText>
+          <w:instrText xml:space="preserve"> PAGEREF _Toc238706989 \h </w:instrText>
         </w:r>
         <w:r>
           <w:rPr>
@@ -2672,7 +2671,7 @@
           <w14:ligatures w14:val="standardContextual"/>
         </w:rPr>
       </w:pPr>
-      <w:hyperlink w:anchor="_Toc238462322" w:history="1">
+      <w:hyperlink w:anchor="_Toc238706990" w:history="1">
         <w:r>
           <w:rPr>
             <w:rStyle w:val="Hipervnculo"/>
@@ -2699,7 +2698,7 @@
             <w:noProof/>
             <w:webHidden/>
           </w:rPr>
-          <w:instrText xml:space="preserve"> PAGEREF _Toc238462322 \h </w:instrText>
+          <w:instrText xml:space="preserve"> PAGEREF _Toc238706990 \h </w:instrText>
         </w:r>
         <w:r>
           <w:rPr>
@@ -2750,7 +2749,7 @@
           <w14:ligatures w14:val="standardContextual"/>
         </w:rPr>
       </w:pPr>
-      <w:hyperlink w:anchor="_Toc238462323" w:history="1">
+      <w:hyperlink w:anchor="_Toc238706991" w:history="1">
         <w:r>
           <w:rPr>
             <w:rStyle w:val="Hipervnculo"/>
@@ -2777,7 +2776,7 @@
             <w:noProof/>
             <w:webHidden/>
           </w:rPr>
-          <w:instrText xml:space="preserve"> PAGEREF _Toc238462323 \h </w:instrText>
+          <w:instrText xml:space="preserve"> PAGEREF _Toc238706991 \h </w:instrText>
         </w:r>
         <w:r>
           <w:rPr>
@@ -2827,7 +2826,7 @@
           <w14:ligatures w14:val="standardContextual"/>
         </w:rPr>
       </w:pPr>
-      <w:hyperlink w:anchor="_Toc238462324" w:history="1">
+      <w:hyperlink w:anchor="_Toc238706992" w:history="1">
         <w:r>
           <w:rPr>
             <w:rStyle w:val="Hipervnculo"/>
@@ -2854,7 +2853,7 @@
             <w:noProof/>
             <w:webHidden/>
           </w:rPr>
-          <w:instrText xml:space="preserve"> PAGEREF _Toc238462324 \h </w:instrText>
+          <w:instrText xml:space="preserve"> PAGEREF _Toc238706992 \h </w:instrText>
         </w:r>
         <w:r>
           <w:rPr>
@@ -2904,7 +2903,7 @@
           <w14:ligatures w14:val="standardContextual"/>
         </w:rPr>
       </w:pPr>
-      <w:hyperlink w:anchor="_Toc238462325" w:history="1">
+      <w:hyperlink w:anchor="_Toc238706993" w:history="1">
         <w:r>
           <w:rPr>
             <w:rStyle w:val="Hipervnculo"/>
@@ -2931,7 +2930,7 @@
             <w:noProof/>
             <w:webHidden/>
           </w:rPr>
-          <w:instrText xml:space="preserve"> PAGEREF _Toc238462325 \h </w:instrText>
+          <w:instrText xml:space="preserve"> PAGEREF _Toc238706993 \h </w:instrText>
         </w:r>
         <w:r>
           <w:rPr>
@@ -2982,7 +2981,7 @@
           <w14:ligatures w14:val="standardContextual"/>
         </w:rPr>
       </w:pPr>
-      <w:hyperlink w:anchor="_Toc238462326" w:history="1">
+      <w:hyperlink w:anchor="_Toc238706994" w:history="1">
         <w:r>
           <w:rPr>
             <w:rStyle w:val="Hipervnculo"/>
@@ -3009,7 +3008,7 @@
             <w:noProof/>
             <w:webHidden/>
           </w:rPr>
-          <w:instrText xml:space="preserve"> PAGEREF _Toc238462326 \h </w:instrText>
+          <w:instrText xml:space="preserve"> PAGEREF _Toc238706994 \h </w:instrText>
         </w:r>
         <w:r>
           <w:rPr>
@@ -3059,7 +3058,7 @@
           <w14:ligatures w14:val="standardContextual"/>
         </w:rPr>
       </w:pPr>
-      <w:hyperlink w:anchor="_Toc238462327" w:history="1">
+      <w:hyperlink w:anchor="_Toc238706995" w:history="1">
         <w:r>
           <w:rPr>
             <w:rStyle w:val="Hipervnculo"/>
@@ -3086,7 +3085,7 @@
             <w:noProof/>
             <w:webHidden/>
           </w:rPr>
-          <w:instrText xml:space="preserve"> PAGEREF _Toc238462327 \h </w:instrText>
+          <w:instrText xml:space="preserve"> PAGEREF _Toc238706995 \h </w:instrText>
         </w:r>
         <w:r>
           <w:rPr>
@@ -3136,7 +3135,7 @@
           <w14:ligatures w14:val="standardContextual"/>
         </w:rPr>
       </w:pPr>
-      <w:hyperlink w:anchor="_Toc238462328" w:history="1">
+      <w:hyperlink w:anchor="_Toc238706996" w:history="1">
         <w:r>
           <w:rPr>
             <w:rStyle w:val="Hipervnculo"/>
@@ -3163,7 +3162,7 @@
             <w:noProof/>
             <w:webHidden/>
           </w:rPr>
-          <w:instrText xml:space="preserve"> PAGEREF _Toc238462328 \h </w:instrText>
+          <w:instrText xml:space="preserve"> PAGEREF _Toc238706996 \h </w:instrText>
         </w:r>
         <w:r>
           <w:rPr>
@@ -3213,7 +3212,7 @@
           <w14:ligatures w14:val="standardContextual"/>
         </w:rPr>
       </w:pPr>
-      <w:hyperlink w:anchor="_Toc238462329" w:history="1">
+      <w:hyperlink w:anchor="_Toc238706997" w:history="1">
         <w:r>
           <w:rPr>
             <w:rStyle w:val="Hipervnculo"/>
@@ -3240,7 +3239,7 @@
             <w:noProof/>
             <w:webHidden/>
           </w:rPr>
-          <w:instrText xml:space="preserve"> PAGEREF _Toc238462329 \h </w:instrText>
+          <w:instrText xml:space="preserve"> PAGEREF _Toc238706997 \h </w:instrText>
         </w:r>
         <w:r>
           <w:rPr>
@@ -3290,7 +3289,7 @@
           <w14:ligatures w14:val="standardContextual"/>
         </w:rPr>
       </w:pPr>
-      <w:hyperlink w:anchor="_Toc238462330" w:history="1">
+      <w:hyperlink w:anchor="_Toc238706998" w:history="1">
         <w:r>
           <w:rPr>
             <w:rStyle w:val="Hipervnculo"/>
@@ -3317,7 +3316,7 @@
             <w:noProof/>
             <w:webHidden/>
           </w:rPr>
-          <w:instrText xml:space="preserve"> PAGEREF _Toc238462330 \h </w:instrText>
+          <w:instrText xml:space="preserve"> PAGEREF _Toc238706998 \h </w:instrText>
         </w:r>
         <w:r>
           <w:rPr>
@@ -3367,7 +3366,7 @@
           <w14:ligatures w14:val="standardContextual"/>
         </w:rPr>
       </w:pPr>
-      <w:hyperlink w:anchor="_Toc238462331" w:history="1">
+      <w:hyperlink w:anchor="_Toc238706999" w:history="1">
         <w:r>
           <w:rPr>
             <w:rStyle w:val="Hipervnculo"/>
@@ -3394,7 +3393,7 @@
             <w:noProof/>
             <w:webHidden/>
           </w:rPr>
-          <w:instrText xml:space="preserve"> PAGEREF _Toc238462331 \h </w:instrText>
+          <w:instrText xml:space="preserve"> PAGEREF _Toc238706999 \h </w:instrText>
         </w:r>
         <w:r>
           <w:rPr>
@@ -3439,9 +3438,8 @@
       <w:pPr>
         <w:pStyle w:val="Ttulo"/>
       </w:pPr>
-      <w:bookmarkStart w:id="1" w:name="_Toc238462296"/>
-      <w:r>
-        <w:lastRenderedPageBreak/>
+      <w:bookmarkStart w:id="1" w:name="_Toc238706964"/>
+      <w:r>
         <w:t>Foreword</w:t>
       </w:r>
       <w:bookmarkEnd w:id="1"/>
@@ -3455,9 +3453,8 @@
       <w:pPr>
         <w:pStyle w:val="Ttulo"/>
       </w:pPr>
-      <w:bookmarkStart w:id="2" w:name="_Toc238462297"/>
-      <w:r>
-        <w:lastRenderedPageBreak/>
+      <w:bookmarkStart w:id="2" w:name="_Toc238706965"/>
+      <w:r>
         <w:t>1. Purpose, scope, and models</w:t>
       </w:r>
       <w:bookmarkEnd w:id="2"/>
@@ -3472,7 +3469,7 @@
         <w:pStyle w:val="Ttulo1"/>
         <w:spacing w:before="280"/>
       </w:pPr>
-      <w:bookmarkStart w:id="3" w:name="_Toc238462298"/>
+      <w:bookmarkStart w:id="3" w:name="_Toc238706966"/>
       <w:r>
         <w:t>1.1 Scope of this guide</w:t>
       </w:r>
@@ -3497,9 +3494,8 @@
       <w:pPr>
         <w:pStyle w:val="Ttulo"/>
       </w:pPr>
-      <w:bookmarkStart w:id="4" w:name="_Toc238462299"/>
-      <w:r>
-        <w:lastRenderedPageBreak/>
+      <w:bookmarkStart w:id="4" w:name="_Toc238706967"/>
+      <w:r>
         <w:t>2. Activation and producer selection</w:t>
       </w:r>
       <w:bookmarkEnd w:id="4"/>
@@ -3509,7 +3505,7 @@
         <w:pStyle w:val="Ttulo1"/>
         <w:spacing w:before="280"/>
       </w:pPr>
-      <w:bookmarkStart w:id="5" w:name="_Toc238462300"/>
+      <w:bookmarkStart w:id="5" w:name="_Toc238706968"/>
       <w:r>
         <w:t>2.1 Console command</w:t>
       </w:r>
@@ -3967,7 +3963,7 @@
         <w:pStyle w:val="Ttulo1"/>
         <w:spacing w:before="280"/>
       </w:pPr>
-      <w:bookmarkStart w:id="6" w:name="_Toc238462301"/>
+      <w:bookmarkStart w:id="6" w:name="_Toc238706969"/>
       <w:r>
         <w:t>2.2 Conditions and special paths</w:t>
       </w:r>
@@ -4025,9 +4021,8 @@
       <w:pPr>
         <w:pStyle w:val="Ttulo"/>
       </w:pPr>
-      <w:bookmarkStart w:id="7" w:name="_Toc238462302"/>
-      <w:r>
-        <w:lastRenderedPageBreak/>
+      <w:bookmarkStart w:id="7" w:name="_Toc238706970"/>
+      <w:r>
         <w:t>3. Common file structure</w:t>
       </w:r>
       <w:bookmarkEnd w:id="7"/>
@@ -4037,7 +4032,7 @@
         <w:pStyle w:val="Ttulo1"/>
         <w:spacing w:before="280"/>
       </w:pPr>
-      <w:bookmarkStart w:id="8" w:name="_Toc238462303"/>
+      <w:bookmarkStart w:id="8" w:name="_Toc238706971"/>
       <w:r>
         <w:t>3.1 Physical hierarchy</w:t>
       </w:r>
@@ -4358,7 +4353,7 @@
         <w:pStyle w:val="Ttulo1"/>
         <w:spacing w:before="280"/>
       </w:pPr>
-      <w:bookmarkStart w:id="9" w:name="_Toc238462304"/>
+      <w:bookmarkStart w:id="9" w:name="_Toc238706972"/>
       <w:r>
         <w:t>3.2 Timing rules</w:t>
       </w:r>
@@ -4440,9 +4435,8 @@
       <w:pPr>
         <w:pStyle w:val="Ttulo"/>
       </w:pPr>
-      <w:bookmarkStart w:id="10" w:name="_Toc238462305"/>
-      <w:r>
-        <w:lastRenderedPageBreak/>
+      <w:bookmarkStart w:id="10" w:name="_Toc238706973"/>
+      <w:r>
         <w:t>4. Common framework records</w:t>
       </w:r>
       <w:bookmarkEnd w:id="10"/>
@@ -4452,7 +4446,7 @@
         <w:pStyle w:val="Ttulo1"/>
         <w:spacing w:before="280"/>
       </w:pPr>
-      <w:bookmarkStart w:id="11" w:name="_Toc238462306"/>
+      <w:bookmarkStart w:id="11" w:name="_Toc238706974"/>
       <w:r>
         <w:t>CPU — Info Cycle</w:t>
       </w:r>
@@ -4518,7 +4512,7 @@
         <w:pStyle w:val="Ttulo1"/>
         <w:spacing w:before="280"/>
       </w:pPr>
-      <w:bookmarkStart w:id="12" w:name="_Toc238462307"/>
+      <w:bookmarkStart w:id="12" w:name="_Toc238706975"/>
       <w:r>
         <w:t>CPU — Transaction about to execute</w:t>
       </w:r>
@@ -4584,7 +4578,7 @@
         <w:pStyle w:val="Ttulo1"/>
         <w:spacing w:before="280"/>
       </w:pPr>
-      <w:bookmarkStart w:id="13" w:name="_Toc238462308"/>
+      <w:bookmarkStart w:id="13" w:name="_Toc238706976"/>
       <w:r>
         <w:t>CPU — Executed instruction</w:t>
       </w:r>
@@ -4650,7 +4644,7 @@
         <w:pStyle w:val="Ttulo1"/>
         <w:spacing w:before="280"/>
       </w:pPr>
-      <w:bookmarkStart w:id="14" w:name="_Toc238462309"/>
+      <w:bookmarkStart w:id="14" w:name="_Toc238706977"/>
       <w:r>
         <w:t>CPU — Stop</w:t>
       </w:r>
@@ -4705,7 +4699,6 @@
         <w:rPr>
           <w:b/>
         </w:rPr>
-        <w:lastRenderedPageBreak/>
         <w:t>Status:</w:t>
       </w:r>
       <w:r>
@@ -4717,7 +4710,7 @@
         <w:pStyle w:val="Ttulo1"/>
         <w:spacing w:before="280"/>
       </w:pPr>
-      <w:bookmarkStart w:id="15" w:name="_Toc238462310"/>
+      <w:bookmarkStart w:id="15" w:name="_Toc238706978"/>
       <w:r>
         <w:t>CPU — Interrupts</w:t>
       </w:r>
@@ -4783,7 +4776,7 @@
         <w:pStyle w:val="Ttulo1"/>
         <w:spacing w:before="280"/>
       </w:pPr>
-      <w:bookmarkStart w:id="16" w:name="_Toc238462311"/>
+      <w:bookmarkStart w:id="16" w:name="_Toc238706979"/>
       <w:r>
         <w:t>Memory — Applied Set</w:t>
       </w:r>
@@ -4848,9 +4841,8 @@
       <w:pPr>
         <w:pStyle w:val="Ttulo"/>
       </w:pPr>
-      <w:bookmarkStart w:id="17" w:name="_Toc238462312"/>
-      <w:r>
-        <w:lastRenderedPageBreak/>
+      <w:bookmarkStart w:id="17" w:name="_Toc238706980"/>
+      <w:r>
         <w:t>5. Machine-specific components</w:t>
       </w:r>
       <w:bookmarkEnd w:id="17"/>
@@ -4860,7 +4852,7 @@
         <w:pStyle w:val="Ttulo1"/>
         <w:spacing w:before="280"/>
       </w:pPr>
-      <w:bookmarkStart w:id="18" w:name="_Toc238462313"/>
+      <w:bookmarkStart w:id="18" w:name="_Toc238706981"/>
       <w:r>
         <w:t>5.1 Selectable inventory</w:t>
       </w:r>
@@ -5396,7 +5388,7 @@
         <w:pStyle w:val="Ttulo1"/>
         <w:spacing w:before="280"/>
       </w:pPr>
-      <w:bookmarkStart w:id="19" w:name="_Toc238462314"/>
+      <w:bookmarkStart w:id="19" w:name="_Toc238706982"/>
       <w:r>
         <w:t>5.2 Record catalog</w:t>
       </w:r>
@@ -5406,7 +5398,7 @@
       <w:pPr>
         <w:pStyle w:val="Ttulo2"/>
       </w:pPr>
-      <w:bookmarkStart w:id="20" w:name="_Toc238462315"/>
+      <w:bookmarkStart w:id="20" w:name="_Toc238706983"/>
       <w:r>
         <w:t>TED — Info Cycle</w:t>
       </w:r>
@@ -5460,7 +5452,7 @@
       <w:pPr>
         <w:pStyle w:val="Ttulo2"/>
       </w:pPr>
-      <w:bookmarkStart w:id="21" w:name="_Toc238462316"/>
+      <w:bookmarkStart w:id="21" w:name="_Toc238706984"/>
       <w:r>
         <w:t>TED — CPU transaction projection</w:t>
       </w:r>
@@ -5514,7 +5506,7 @@
       <w:pPr>
         <w:pStyle w:val="Ttulo2"/>
       </w:pPr>
-      <w:bookmarkStart w:id="22" w:name="_Toc238462317"/>
+      <w:bookmarkStart w:id="22" w:name="_Toc238706985"/>
       <w:r>
         <w:t>ROMRAMSwitch — direct line</w:t>
       </w:r>
@@ -5568,9 +5560,8 @@
       <w:pPr>
         <w:pStyle w:val="Ttulo2"/>
       </w:pPr>
-      <w:bookmarkStart w:id="23" w:name="_Toc238462318"/>
-      <w:r>
-        <w:lastRenderedPageBreak/>
+      <w:bookmarkStart w:id="23" w:name="_Toc238706986"/>
+      <w:r>
         <w:t>C1C2Selector — direct line</w:t>
       </w:r>
       <w:bookmarkEnd w:id="23"/>
@@ -5623,7 +5614,7 @@
       <w:pPr>
         <w:pStyle w:val="Ttulo2"/>
       </w:pPr>
-      <w:bookmarkStart w:id="24" w:name="_Toc238462319"/>
+      <w:bookmarkStart w:id="24" w:name="_Toc238706987"/>
       <w:r>
         <w:t>Datasette 1531 / SerialIO</w:t>
       </w:r>
@@ -5677,9 +5668,8 @@
       <w:pPr>
         <w:pStyle w:val="Ttulo"/>
       </w:pPr>
-      <w:bookmarkStart w:id="25" w:name="_Toc238462320"/>
-      <w:r>
-        <w:lastRenderedPageBreak/>
+      <w:bookmarkStart w:id="25" w:name="_Toc238706988"/>
+      <w:r>
         <w:t>6. Interpretation method</w:t>
       </w:r>
       <w:bookmarkEnd w:id="25"/>
@@ -5689,7 +5679,7 @@
         <w:pStyle w:val="Ttulo1"/>
         <w:spacing w:before="280"/>
       </w:pPr>
-      <w:bookmarkStart w:id="26" w:name="_Toc238462321"/>
+      <w:bookmarkStart w:id="26" w:name="_Toc238706989"/>
       <w:r>
         <w:t>6.1 Recommended procedure</w:t>
       </w:r>
@@ -5772,7 +5762,7 @@
         <w:pStyle w:val="Ttulo1"/>
         <w:spacing w:before="280"/>
       </w:pPr>
-      <w:bookmarkStart w:id="27" w:name="_Toc238462322"/>
+      <w:bookmarkStart w:id="27" w:name="_Toc238706990"/>
       <w:r>
         <w:t>6.2 Annotated example</w:t>
       </w:r>
@@ -5850,9 +5840,8 @@
       <w:pPr>
         <w:pStyle w:val="Ttulo"/>
       </w:pPr>
-      <w:bookmarkStart w:id="28" w:name="_Toc238462323"/>
-      <w:r>
-        <w:lastRenderedPageBreak/>
+      <w:bookmarkStart w:id="28" w:name="_Toc238706991"/>
+      <w:r>
         <w:t>7. Limitations and maintenance</w:t>
       </w:r>
       <w:bookmarkEnd w:id="28"/>
@@ -5862,7 +5851,7 @@
         <w:pStyle w:val="Ttulo1"/>
         <w:spacing w:before="280"/>
       </w:pPr>
-      <w:bookmarkStart w:id="29" w:name="_Toc238462324"/>
+      <w:bookmarkStart w:id="29" w:name="_Toc238706992"/>
       <w:r>
         <w:t>7.1 Specific limitations</w:t>
       </w:r>
@@ -5909,7 +5898,7 @@
         <w:pStyle w:val="Ttulo1"/>
         <w:spacing w:before="280"/>
       </w:pPr>
-      <w:bookmarkStart w:id="30" w:name="_Toc238462325"/>
+      <w:bookmarkStart w:id="30" w:name="_Toc238706993"/>
       <w:r>
         <w:t>7.2 Maintenance contract</w:t>
       </w:r>
@@ -5967,9 +5956,8 @@
       <w:pPr>
         <w:pStyle w:val="Ttulo"/>
       </w:pPr>
-      <w:bookmarkStart w:id="31" w:name="_Toc238462326"/>
-      <w:r>
-        <w:lastRenderedPageBreak/>
+      <w:bookmarkStart w:id="31" w:name="_Toc238706994"/>
+      <w:r>
         <w:t>Appendices</w:t>
       </w:r>
       <w:bookmarkEnd w:id="31"/>
@@ -5978,7 +5966,7 @@
       <w:pPr>
         <w:pStyle w:val="Ttulo1"/>
       </w:pPr>
-      <w:bookmarkStart w:id="32" w:name="_Toc238462327"/>
+      <w:bookmarkStart w:id="32" w:name="_Toc238706995"/>
       <w:r>
         <w:t>Appendix A. Provenance and revision</w:t>
       </w:r>
@@ -5991,7 +5979,6 @@
     </w:p>
     <w:p>
       <w:r>
-        <w:lastRenderedPageBreak/>
         <w:t>Structured sources: .codex/documentation/debug-files/sources/debug-common.yaml and .codex/documentation/debug-files/sources/c264.yaml.</w:t>
       </w:r>
     </w:p>
@@ -6000,7 +5987,7 @@
         <w:pStyle w:val="Ttulo1"/>
         <w:spacing w:before="280"/>
       </w:pPr>
-      <w:bookmarkStart w:id="33" w:name="_Toc238462328"/>
+      <w:bookmarkStart w:id="33" w:name="_Toc238706996"/>
       <w:r>
         <w:t>A.1 Watched source files</w:t>
       </w:r>
@@ -6763,7 +6750,7 @@
         <w:pStyle w:val="Ttulo1"/>
         <w:spacing w:before="280"/>
       </w:pPr>
-      <w:bookmarkStart w:id="34" w:name="_Toc238462329"/>
+      <w:bookmarkStart w:id="34" w:name="_Toc238706997"/>
       <w:r>
         <w:t>A.2 Revision history</w:t>
       </w:r>
@@ -6934,7 +6921,7 @@
       <w:pPr>
         <w:pStyle w:val="Ttulo1"/>
       </w:pPr>
-      <w:bookmarkStart w:id="35" w:name="_Toc238462330"/>
+      <w:bookmarkStart w:id="35" w:name="_Toc238706998"/>
       <w:r>
         <w:t>Illustrations</w:t>
       </w:r>
@@ -6974,9 +6961,8 @@
       <w:pPr>
         <w:pStyle w:val="Ttulo1"/>
       </w:pPr>
-      <w:bookmarkStart w:id="36" w:name="_Toc238462331"/>
-      <w:r>
-        <w:lastRenderedPageBreak/>
+      <w:bookmarkStart w:id="36" w:name="_Toc238706999"/>
+      <w:r>
         <w:t>Equations</w:t>
       </w:r>
       <w:bookmarkEnd w:id="36"/>
@@ -7080,7 +7066,7 @@
         <w:noProof/>
       </w:rPr>
       <w:drawing>
-        <wp:inline distT="0" distB="0" distL="0" distR="0" wp14:anchorId="4CE7B6EA" wp14:editId="706112A9">
+        <wp:inline distT="0" distB="0" distL="0" distR="0" wp14:anchorId="2221CC8A" wp14:editId="05B08B66">
           <wp:extent cx="576000" cy="459360"/>
           <wp:effectExtent l="0" t="0" r="0" b="0"/>
           <wp:docPr id="1" name="ARGOS framework mark" descr="ARGOS framework mark"/>
@@ -7490,10 +7476,10 @@
         <w:noProof/>
       </w:rPr>
       <w:drawing>
-        <wp:inline distT="0" distB="0" distL="0" distR="0" wp14:anchorId="5715CD90" wp14:editId="7A7BE400">
+        <wp:inline distT="0" distB="0" distL="0" distR="0" wp14:anchorId="60E0838C" wp14:editId="2023743E">
           <wp:extent cx="1512000" cy="1205820"/>
           <wp:effectExtent l="0" t="0" r="0" b="0"/>
-          <wp:docPr id="920686954" name="ARGOS framework mark" descr="ARGOS framework mark"/>
+          <wp:docPr id="1221567128" name="ARGOS framework mark" descr="ARGOS framework mark"/>
           <wp:cNvGraphicFramePr>
             <a:graphicFrameLocks xmlns:a="http://schemas.openxmlformats.org/drawingml/2006/main" noChangeAspect="1"/>
           </wp:cNvGraphicFramePr>
@@ -10466,19 +10452,19 @@
   <w:num w:numId="26" w16cid:durableId="846600881">
     <w:abstractNumId w:val="20"/>
   </w:num>
-  <w:num w:numId="27" w16cid:durableId="526793273">
+  <w:num w:numId="27" w16cid:durableId="1018896565">
     <w:abstractNumId w:val="0"/>
   </w:num>
-  <w:num w:numId="28" w16cid:durableId="1982925068">
+  <w:num w:numId="28" w16cid:durableId="638457847">
     <w:abstractNumId w:val="0"/>
   </w:num>
-  <w:num w:numId="29" w16cid:durableId="2122411562">
+  <w:num w:numId="29" w16cid:durableId="537162731">
     <w:abstractNumId w:val="6"/>
   </w:num>
-  <w:num w:numId="30" w16cid:durableId="686834139">
+  <w:num w:numId="30" w16cid:durableId="1415318933">
     <w:abstractNumId w:val="0"/>
   </w:num>
-  <w:num w:numId="31" w16cid:durableId="1775710970">
+  <w:num w:numId="31" w16cid:durableId="1943292899">
     <w:abstractNumId w:val="0"/>
   </w:num>
 </w:numbering>

</xml_diff>